<commit_message>
DSS6: apply verified review corrections
Title advice follows Amazon's 75-character limit plus Item Highlights; the
Twin '4 Pc' finding is removed (Twin set is 4 pieces). Conversion gate now
holds a term only when significantly below it (trial terms kept at today's
bid). LTSF storage-avoided formula fixed; LTSF routing guarded on 30 and 90
days and capped by aged stock. Maintain terms keep their own bid, no-op
strategy rows dropped, keyword changes and a loadable bulk upload moved into
the action plan, steps 1-7 aligned across files, Queen reorder nets the
unshipped plan.

Co-Authored-By: Claude Opus 5.5 <noreply@anthropic.com>
Claude-Session: https://claude.ai/code/session_01LY7A1KPDoE1cQtWdmceR2R
</commit_message>
<xml_diff>
--- a/docs/DSS6_Audit_Review_20260929.docx
+++ b/docs/DSS6_Audit_Review_20260929.docx
@@ -48,7 +48,7 @@
         <w:spacing w:after="80"/>
       </w:pPr>
       <w:r>
-        <w:t xml:space="preserve">Sales fell by more than half from 26 August. The family sold 1,653 units in August and 607 in 1–28 September (53 → 22 a day). Our ad impressions fell from 43,610 to 15,623 a day, and ad spend from $330 to $90 a day. Three things happened at the same time: the titles were cut from about 190 characters to 73 on 26 Aug (Silky, Bed Sheets, Bedding Set, Wrinkle-Free, 15-inch Deep Pocket and the colour were dropped), 21 Twin children are now titled '4 Pc', and several ranking campaigns advertise children that are out of stock. Bids and budgets did not change from 30 Aug (the history the tool reaches).</w:t>
+        <w:t xml:space="preserve">Sales fell by more than half from late August: 1,653 units in August, 607 in 1–28 September (53 → 22 a day). Ad orders fell from 1,025 to 286 — about 72% of the unit drop — while paid conversion barely moved (10.1% → 9.2%). So this is lost traffic, not worse conversion.</w:t>
       </w:r>
     </w:p>
     <w:p>
@@ -61,7 +61,7 @@
         <w:spacing w:after="80"/>
       </w:pPr>
       <w:r>
-        <w:t xml:space="preserve">So the first fix is the listing, not the ads. Put the search words back in the titles (satin bed sheets, silky, 6 piece, deep pocket, colour) and correct the Twin titles to 6 Pc. Until then, clicks convert worse: on 7 of the head terms our listing converts at under half of our usual rate against the market, so they are held at today's clicks, not pushed.</w:t>
+        <w:t xml:space="preserve">Several things changed at once and the data cannot separate them: Amazon's new 75-character title limit was applied on 25–26 Aug (Silky, Bed Sheets, Bedding Set, Wrinkle-Free, 15-inch Deep Pocket and the colour were dropped); no deal has run since the August Lightning on 16 Aug (there was a deal every month from April to August); swatch images changed on 11 Sep, secondary images changed on 17 Sep; and 5 ranking campaigns advertise children with 30 units or fewer left. The bid history reaches back only to 30 Aug, four days after the fall, so a bid or modifier change before then cannot be ruled out.</w:t>
       </w:r>
     </w:p>
     <w:p>
@@ -74,7 +74,7 @@
         <w:spacing w:after="80"/>
       </w:pPr>
       <w:r>
-        <w:t xml:space="preserve">The audit's cuts toward break-even are not followed on ranking terms. Of its 58 price, modifier and budget cuts, 19 are on ranking terms: 16 are rejected and 3 changed. Of the 39 on other terms, 10 become one −15% step with a rank guard, 0 are accepted as they are, and 29 are not made.</w:t>
+        <w:t xml:space="preserve">Title: since 27 Jul Amazon caps titles at 75 characters and adds a 125-character Item Highlights field that is indexed for search. The old 190-character title cannot come back. The fix is to spend the 75 characters on search words — for example "DECOLURE Satin Bed Sheets Queen Size, 6 Piece Silky Deep Pocket Set, Black" (74 characters) — and put the dropped words in Item Highlights (bedding set, wrinkle-free, 15" deep pocket, hair and skin; 4 pillowcases on Full, Queen and King). The Twin set has 4 pieces (2 pillowcases), so its '4 Pc' titles are correct.</w:t>
       </w:r>
     </w:p>
     <w:p>
@@ -87,7 +87,7 @@
         <w:spacing w:after="80"/>
       </w:pPr>
       <w:r>
-        <w:t xml:space="preserve">Ranking runs on the Black children: Queen: Queen Black, King: King Black, Full: Full Black, Twin: Twin Black. King Black is restocked (736 sellable, 72 in FC transfer), so the King ranking campaigns move to it from Red King (11 left) and Stripe Blue King (0). The audit's child moves (86) are judged one by one: 0 accepted, 10 changed, 76 rejected.</w:t>
+        <w:t xml:space="preserve">The audit's cuts toward break-even are not followed on ranking terms. Of its 58 price, modifier and budget cuts, 19 are on ranking terms: 16 are rejected and 3 changed. Of the 39 on other terms, 12 become one −15% step with a rank guard, 1 are accepted as they are, and 26 are not made.</w:t>
       </w:r>
     </w:p>
     <w:p>
@@ -100,7 +100,7 @@
         <w:spacing w:after="80"/>
       </w:pPr>
       <w:r>
-        <w:t xml:space="preserve">The ranking plan: 18 terms are pushed and 19 held (maintain). Every term already has an exact campaign, so no new campaign is built. This product's own data shows purchase share rising with rank only up to the top 20 (7 terms at rank 11–20 take a median 4.1% of purchases; there is no evidence yet above rank 10), so the push target is the top 20, not the top 5 the audit set.</w:t>
+        <w:t xml:space="preserve">Ranking runs on the Black children: Queen: Queen Black, King: King Black, Full: Full Black, Twin: Twin Black. Today 11 Queen ranking campaigns advertise Stone Grey Queen; they move to Queen Black. King Black is restocked (736 sellable, 72 in FC transfer), so the King ranking campaigns move to it from Red King (11 left) and Stripe Blue King (0). The audit's child moves (86) are judged one by one: 0 accepted, 10 changed, 76 rejected.</w:t>
       </w:r>
     </w:p>
     <w:p>
@@ -113,7 +113,7 @@
         <w:spacing w:after="80"/>
       </w:pPr>
       <w:r>
-        <w:t xml:space="preserve">Top of search, for every exact campaign: 35 ranking and 182 other exact campaigns go top-of-search only (900% modifier, base bid = top-of-search price ÷ 10, rest of search and product pages 0%). No ranking term is bid below what it bids today (a CPC is what the winning bid paid, so bidding at the CPC would lose auctions we win now). Pushed terms go up to the campaign's own 90-day top-of-search CPC where today's bid is lower — today's bids buy almost no top-of-search share.</w:t>
+        <w:t xml:space="preserve">The ranking plan: 15 terms are pushed, 10 are kept at today's bid as trial terms and 12 are held (maintain). Every term already has an exact campaign, so no new campaign is built. Push target: the top 20 (7 terms at rank 11–20 take a median 4.1% of purchases; there is no evidence yet above rank 10). Caveat: every rank, share and conversion-vs-market figure comes from the one ASIN the Rank Radar tracks (208 Q3 purchases on the tracked terms, against 4,166 family units in the same quarter).</w:t>
       </w:r>
     </w:p>
     <w:p>
@@ -126,7 +126,7 @@
         <w:spacing w:after="80"/>
       </w:pPr>
       <w:r>
-        <w:t xml:space="preserve">Back-up ranking child: every ranking campaign gets the back-up's product ad loaded PAUSED and switches when the preferred child falls under 14 days of stock: Queen: Sea Teal Queen then Rosewood Queen; King: Champagne King; Full: Full White; Twin: Sea Teal Twin then Twin Purple.</w:t>
+        <w:t xml:space="preserve">Top of search: the 35 ranking campaigns go top-of-search only (900% modifier, base bid = top-of-search price ÷ 10, rest of search and product pages 0%). No ranking term is bid below what it bids today (a CPC is what the winning bid paid, so bidding at the CPC would lose auctions we win now). Held and trial terms keep today's price. Other exact campaigns wait until after Prime Big Deal Days (7 Oct), and only the 14 with at least 20 top-of-search clicks in 90 days change.</w:t>
       </w:r>
     </w:p>
     <w:p>
@@ -139,7 +139,7 @@
         <w:spacing w:after="80"/>
       </w:pPr>
       <w:r>
-        <w:t xml:space="preserve">LTSF: the S6 sheet charges $867.76 on 741 aged units (column V). The top SKU is Ivory King ($150.38). Non-ranking traffic moves to an LTSF SKU only where that SKU converts (at least half the ranking child's rate); Stripe Full Gold, Full White, Stripe Queen Blue clear through the LTSF campaigns, their own searches and promos instead.</w:t>
+        <w:t xml:space="preserve">Back-up ranking child: every ranking campaign gets the back-up's product ad loaded PAUSED and switches when the preferred child falls under 14 days of stock: Queen: Red Queen; King: Champagne King; Full: Full White. No Twin term has a ranking campaign after the plan, so the Twin back-up applies only if one is added.</w:t>
       </w:r>
     </w:p>
     <w:p>
@@ -152,7 +152,7 @@
         <w:spacing w:after="80"/>
       </w:pPr>
       <w:r>
-        <w:t xml:space="preserve">Stock: Queen Black (563 counted, 300 more in a plan never shipped) runs out around 2026-12-01 at the plan's pace and needs about 876 units to reach 31 Jan. King Black covers past 31 Jan. Full Black runs out around 2027-01-10.</w:t>
+        <w:t xml:space="preserve">LTSF: the S6 sheet charges $867.76 on 741 aged units (column V). The top SKU is Ivory King ($150.38). Non-ranking traffic moves to an LTSF SKU only where that SKU converts at least half as well as the ranking child on both 30 and 90 days, and only as much traffic as its aged stock can absorb: King: Ivory King. Stripe Full Gold, Full White, Stripe Queen Blue, Stripe Queen Red clear through the LTSF campaigns, their own searches and promos instead.</w:t>
       </w:r>
     </w:p>
     <w:p>
@@ -165,7 +165,33 @@
         <w:spacing w:after="80"/>
       </w:pPr>
       <w:r>
-        <w:t xml:space="preserve">Money, stated plainly: this product's net result was −$1,204 in the last 30 days, and break-even ACoS on its best sellers is only 9% (Queen Black) to 26% (King Black). The plan raises ad spend from $3,117 to about $4,707 a month (still well below August's $10,603); direct net goes to about −$2,461. The return is the organic rank the push buys into Q4 (last year December ran ×3.048 of September). The push size is an owner decision; the Push-cost tab lists every term.</w:t>
+        <w:t xml:space="preserve">Stock: Queen Black (563 counted, 300 more in a plan never shipped) runs out around 2026-11-21 at the plan's pace (October deal days included). It needs about 1,195 units to reach 31 Jan: ship the 300-unit plan and reorder about 895. King Black covers past 31 Jan. Full Black runs out around 2026-12-30.</w:t>
+      </w:r>
+    </w:p>
+    <w:p>
+      <w:pPr>
+        <w:pStyle w:val="ListParagraph"/>
+        <w:numPr>
+          <w:ilvl w:val="0"/>
+          <w:numId w:val="2"/>
+        </w:numPr>
+        <w:spacing w:after="80"/>
+      </w:pPr>
+      <w:r>
+        <w:t xml:space="preserve">Money, stated plainly: this product lost money in 12 of the last 13 months; last Q4 lost $30,942 on $144,543 of sales. The last 30 days: −$1,204. Break-even ACoS is only 9% (Queen Black) to 26% (King Black). The plan raises ad spend from $3,117 to about $4,820 a month (still well below August's $10,603); direct net goes to about −$2,225. The push alone costs $1,539 a month in direct profit; at $2.90 profit before ads per unit it pays back only if rank adds about 530 organic units a month (+94% on today's 566). The cost is a floor: 9 of the 15 pushed terms get a top-of-search price rise of 5% or less while their click targets rise several-fold.</w:t>
+      </w:r>
+    </w:p>
+    <w:p>
+      <w:pPr>
+        <w:pStyle w:val="ListParagraph"/>
+        <w:numPr>
+          <w:ilvl w:val="0"/>
+          <w:numId w:val="2"/>
+        </w:numPr>
+        <w:spacing w:after="80"/>
+      </w:pPr>
+      <w:r>
+        <w:t xml:space="preserve">This week (Lightning Deal 30 Sep, Prime Big Deal Days 7 Oct): steps 1–3 only — listing, stock, and the ranking campaigns. Steps 4–6 after the deals, step 7 after 7 Oct. The push size is an owner decision; the Push-cost tab lists every term.</w:t>
       </w:r>
     </w:p>
     <w:p>
@@ -1387,7 +1413,7 @@
         <w:spacing w:after="120"/>
       </w:pPr>
       <w:r>
-        <w:t xml:space="preserve">Twelve months: 2026-03: 1,573 units, ads $7,001, net −$78; 2026-04: 1,494 units, ads $7,162, net −$2,670; 2026-05: 1,111 units, ads $7,389, net −$2,924; 2026-06: 1,858 units, ads $11,278, net −$10,646; 2026-07: 1,906 units, ads $9,713, net −$5,910; 2026-08: 1,653 units, ads $10,603, net −$5,420; 2026-09: 607 units, ads $2,803, net −$1,136. Last year's Q4 ran ×1.179 (Oct), ×1.903 (Nov) and ×3.048 (Dec) of September's units. The product has lost money in most months; the months with the most ad spend lost the most.</w:t>
+        <w:t xml:space="preserve">The last 13 months: 2025-09: 754 units, ads $4,951, net −$2,987; 2025-10: 889 units, ads $5,398, net −$5,931; 2025-11: 1,435 units, ads $7,983, net −$13,064; 2025-12: 2,298 units, ads $11,677, net −$11,947; 2026-01: 1,364 units, ads $6,878, net −$10,526; 2026-02: 1,316 units, ads $6,405, net $269; 2026-03: 1,573 units, ads $7,001, net −$78; 2026-04: 1,494 units, ads $7,162, net −$2,670; 2026-05: 1,111 units, ads $7,389, net −$2,924; 2026-06: 1,858 units, ads $11,278, net −$10,646; 2026-07: 1,906 units, ads $9,713, net −$5,910; 2026-08: 1,653 units, ads $10,603, net −$5,420; 2026-09: 607 units, ads $2,803, net −$1,136. Last year's Q4 ran ×1.179 (Oct), ×1.903 (Nov) and ×3.048 (Dec) of September's units, and lost $30,942 on $144,543 of sales. The product lost money in 12 of the 13 months; the months with the most ad spend lost the most. More volume in Q4 has not, on its own, meant profit.</w:t>
       </w:r>
     </w:p>
     <w:p>
@@ -2152,7 +2178,7 @@
         <w:spacing w:after="80"/>
       </w:pPr>
       <w:r>
-        <w:t xml:space="preserve">Title, 26 Aug (Data Dive, B0C7FX1GFS): before "DECOLURE Satin Bed Sheets - 6 Piece Luxury Silky Queen Size Bedding Set - Softer Than Silk, Wrinkle-Free with 15” Deep Pocket Fitted Sheet, Perfect for Hair &amp; Skin, Gifts for Women (Black)" — after "DECOLURE Satin Sheets Queen Size | Softer Than Silk | Luxury 6 Pc Bed Set". The same rewrite ran across the family. The words dropped are ones shoppers search for (satin bed sheets, silky, bedding set, deep pocket, colour).</w:t>
+        <w:t xml:space="preserve">Ads: ad orders 1,025 in August → 286 in September (Command Center), about 72% of the unit drop. Paid conversion 10.1% → 9.2% and CPC $1.05 → $0.91 barely moved; clicks fell from 10,185 to 3,099. Fewer shoppers reached the listing; those who did bought at almost the same rate.</w:t>
       </w:r>
     </w:p>
     <w:p>
@@ -2165,7 +2191,33 @@
         <w:spacing w:after="80"/>
       </w:pPr>
       <w:r>
-        <w:t xml:space="preserve">21 Twin children are titled "… Luxury 4 Pc Bed Set" since the rewrite, on a 6-piece product.</w:t>
+        <w:t xml:space="preserve">Title: Command Center logs "New Title &amp; Item Highlights" on 25 Aug; Data Dive detected it on 26 Aug (B0C7FX1GFS). Before: "DECOLURE Satin Bed Sheets - 6 Piece Luxury Silky Queen Size Bedding Set - Softer Than Silk, Wrinkle-Free with 15” Deep Pocket Fitted Sheet, Perfect for Hair &amp; Skin, Gifts for Women (Black)" — after: "DECOLURE Satin Sheets Queen Size | Softer Than Silk | Luxury 6 Pc Bed Set" (73 characters). This is Amazon's 75-character title limit (in force since 27 Jul), with a 125-character Item Highlights field that is indexed for search. The words that dropped out of the title can go back in through Item Highlights.</w:t>
+      </w:r>
+    </w:p>
+    <w:p>
+      <w:pPr>
+        <w:pStyle w:val="ListParagraph"/>
+        <w:numPr>
+          <w:ilvl w:val="0"/>
+          <w:numId w:val="2"/>
+        </w:numPr>
+        <w:spacing w:after="80"/>
+      </w:pPr>
+      <w:r>
+        <w:t xml:space="preserve">Deals: April Best Deal 14 Apr–27 Apr, May Lightning 1 May, May Best Deal 20 May–2 Jun, June Lightning 7 Jun, June Best Deal 25 Jun–8 Jul, July Lightning 18 Jul, July Best Deal 31 Jul–13 Aug, August Lightning 16 Aug. Nothing ran from 17 Aug to 29 Sep, the first month without a deal since April. Coming up: 2026-09-30 Lightning Deal; 2026-10-07 Lightning Deal · Prime Big Deal Days; 2026-10-12 Lightning Deal; 2026-10-24 Lightning Deal.</w:t>
+      </w:r>
+    </w:p>
+    <w:p>
+      <w:pPr>
+        <w:pStyle w:val="ListParagraph"/>
+        <w:numPr>
+          <w:ilvl w:val="0"/>
+          <w:numId w:val="2"/>
+        </w:numPr>
+        <w:spacing w:after="80"/>
+      </w:pPr>
+      <w:r>
+        <w:t xml:space="preserve">Images: Swatch Images on 11 Sep; Secondary Images on 17 Sep (Command Center events). Their effect cannot be separated from the rest.</w:t>
       </w:r>
     </w:p>
     <w:p>
@@ -2191,7 +2243,7 @@
         <w:spacing w:after="80"/>
       </w:pPr>
       <w:r>
-        <w:t xml:space="preserve">Bids and budgets: the Sellerboard history (30 Aug–29 Sep) shows no bid or budget change on the campaigns checked (D-S6-SP-king silk sheets-(Silk)-HSV-Exact-Rank: $50 every day; D-S6-SP-AUTO-CATCH ALL: $80 every day; queen silk sheet set (exact): $1.91 every day, no change; satin sheets queen size (exact): $1.09 every day, no change). On 30 Aug their trailing CPC was well above today's bid, so bids or top-of-search modifiers were higher before 30 Aug. Check the Seller Central change history for 20–30 Aug.</w:t>
+        <w:t xml:space="preserve">Bids and budgets: the Sellerboard history starts on 30 Aug, four days after the fall, and shows no bid or budget change since on the campaigns checked (D-S6-SP-king silk sheets-(Silk)-HSV-Exact-Rank: $50 every day; D-S6-SP-AUTO-CATCH ALL: $80 every day; queen silk sheet set (exact): $1.91 every day, no change; satin sheets queen size (exact): $1.09 every day, no change). On 30 Aug their trailing CPC was well above today's bid, so bids or top-of-search modifiers were higher before then. Check the Seller Central change history for 20–30 Aug.</w:t>
       </w:r>
     </w:p>
     <w:p>
@@ -2217,20 +2269,7 @@
         <w:spacing w:after="80"/>
       </w:pPr>
       <w:r>
-        <w:t xml:space="preserve">Deals: the July Best Deal ended 13 Aug and the August Lightning deal ran 16 Aug. Coming up: 2026-09-30 Lightning Deal; 2026-10-07 Lightning Deal · Prime Big Deal Days; 2026-10-12 Lightning Deal; 2026-10-24 Lightning Deal.</w:t>
-      </w:r>
-    </w:p>
-    <w:p>
-      <w:pPr>
-        <w:pStyle w:val="ListParagraph"/>
-        <w:numPr>
-          <w:ilvl w:val="0"/>
-          <w:numId w:val="2"/>
-        </w:numPr>
-        <w:spacing w:after="80"/>
-      </w:pPr>
-      <w:r>
-        <w:t xml:space="preserve">Reading: the fall starts on the day of the title rewrite and deepens as ads stop serving. The rewrite and the stock gaps explain it better than anything in the bids. Restore the title keywords before judging the ads on September.</w:t>
+        <w:t xml:space="preserve">Reading: the title limit, the end of the monthly deals, the image changes and the stock gaps all land in the same weeks, and the data cannot rank them. What the data does show is that the loss is traffic, not conversion. So the fixes run side by side: better use of the 75 characters and Item Highlights, the deals already booked, ads on children that are in stock, and the ranking push.</w:t>
       </w:r>
     </w:p>
     <w:p>
@@ -3223,7 +3262,7 @@
         <w:spacing w:after="120"/>
       </w:pPr>
       <w:r>
-        <w:t xml:space="preserve">Scope note: the US Rank Radar that feeds SQP tracks one ASIN (see Conflicts), so "our share" is that ASIN's share, not the whole family's.</w:t>
+        <w:t xml:space="preserve">Scope: the US Rank Radar that feeds SQP tracks one ASIN, B0CRF7S2TH, which is not in the S6 catalog (see Conflicts). On the tracked terms it made about 208 purchases in Q3, against 4,166 family units sold in the same quarter. So every 'our share', rank and conversion-vs-market figure is that ASIN's, not the family's. Re-point the radar to Queen Black (B0C7FX1GFS) before the next review; until then read the ranking plan as direction, not as measured share.</w:t>
       </w:r>
     </w:p>
     <w:p>
@@ -5811,7 +5850,7 @@
         <w:spacing w:after="120"/>
       </w:pPr>
       <w:r>
-        <w:t xml:space="preserve">BEDELITE leads the head terms with organic, sponsored, Sponsored Brands, SB video and Amazon's Choice at once. Most rivals sell 4-piece sets; the 6-piece sellers found are MR&amp;HM, P Pothuiny, CozyLux, GOLAL, Love's cabin, Lanest Housing, Bedsure and Madison Park (titles checked by search). The "4 pillowcases" point is our clearest difference from the 4-piece leaders — and the Twin titles now hide it.</w:t>
+        <w:t xml:space="preserve">BEDELITE leads the head terms with organic, sponsored, Sponsored Brands, SB video and Amazon's Choice at once. Most rivals sell 4-piece sets; the 6-piece sellers found are MR&amp;HM, P Pothuiny, CozyLux, GOLAL, Love's cabin, Lanest Housing, Bedsure and Madison Park (titles checked by search). The "4 pillowcases" point (Full, Queen and King) is our clearest difference from the 4-piece leaders; the Twin set is 4 pieces with 2 pillowcases.</w:t>
       </w:r>
     </w:p>
     <w:p>
@@ -5867,7 +5906,7 @@
         <w:spacing w:after="80"/>
       </w:pPr>
       <w:r>
-        <w:t xml:space="preserve">Yes, we can make one. Concept: "the set with 4 pillowcases". 15–30 s: count the 6 pieces on screen (1 flat, 1 fitted, 4 pillowcases); a bed dressed with four pillows (a shot a 4-piece set cannot show); sheen and drape; the 15" deep pocket going over a mattress corner; a hair-and-skin cue; wrinkle-free; end card with our colours and four sizes.</w:t>
+        <w:t xml:space="preserve">Yes, we can make one. Concept: "the set with 4 pillowcases". 15–30 s: count the 6 pieces on screen (1 flat, 1 fitted, 4 pillowcases — Full, Queen and King; Twin is 4 pieces); a bed dressed with four pillows (a shot a 4-piece set cannot show); sheen and drape; the 15" deep pocket going over a mattress corner; a hair-and-skin cue; wrinkle-free; end card with our colours and four sizes.</w:t>
       </w:r>
     </w:p>
     <w:p>
@@ -5910,7 +5949,7 @@
         <w:spacing w:after="120"/>
       </w:pPr>
       <w:r>
-        <w:t xml:space="preserve">11,342 search terms had ad spend in 90 days or are tracked in SQP. 30-day spend by type: Core satin/silk $2,327; ASIN (product page) $1,535; Adjacent: generic bedding $348; Other product $249; Mixed (other product words) $52; Brand (own) $43. Each term gets one action in the Keywords tab: No change 11253; Negative exact 27; Harvest candidate 20; Ranking – maintain 19; Ranking – push 18; Exact on LTSF child 5.</w:t>
+        <w:t xml:space="preserve">11,342 search terms had ad spend in 90 days or are tracked in SQP. 30-day spend by type: Core satin/silk $2,327; ASIN (product page) $1,535; Adjacent: generic bedding $348; Other product $249; Mixed (other product words) $52; Brand (own) $43. Each term gets one action in the Keywords tab: No change 11253; Negative exact 27; Ranking – maintain 22; Harvest candidate 20; Ranking – push 15; Exact on LTSF child 5.</w:t>
       </w:r>
     </w:p>
     <w:p>
@@ -5918,7 +5957,7 @@
         <w:spacing w:after="120"/>
       </w:pPr>
       <w:r>
-        <w:t xml:space="preserve">The negative-exact list covers only terms that cannot be justified: another product, Spanish or French, a competitor's brand, or at least 20 clicks with no order (the chance of that at our 8.4% paid conversion is under 5%). Colour searches that match an LTSF SKU are bought exact on that SKU.</w:t>
+        <w:t xml:space="preserve">The negative-exact list covers only terms that cannot be justified: another product, Spanish or French, a competitor's brand, or enough clicks with no order that the chance of that at our 8.4% paid conversion is under 5% — about 35 clicks, never fewer than 20. Colour searches that match an LTSF SKU are bought exact on that SKU.</w:t>
       </w:r>
     </w:p>
     <w:p>
@@ -5943,7 +5982,7 @@
         <w:spacing w:after="120"/>
       </w:pPr>
       <w:r>
-        <w:t xml:space="preserve">Conversion gate: a push works through sales. Where our listing converts at less than half of our usual rate against the market (our Q3 index is 0.982 × market; the gate is 0.491), bought clicks do not turn into the sales that move rank. Those terms are held at today's clicks until the listing is fixed: satin sheets (0.49), silk sheets queen (0.43), satin sheets queen size (0.38), black silk sheets (0.14), silk sheets full (0.34), satin sheets full (0.28), black silk sheets queen (0.34).</w:t>
+        <w:t xml:space="preserve">Conversion gate: a push works through sales. Our conversion on each term is compared with the market's (SQP purchases ÷ clicks, both from the tracked ASIN; paid conversion only where SQP shows no clicks for us). The family runs at 0.982 × the market in Q3; the gate is half of that (0.491). A term is held only when it is significantly under the gate (one-sided binomial test, p &lt; 0.05) — no term is. 10 terms are under the gate but on too few purchases to call it (often one or two); they are kept at today's bid as trial terms and re-tested after 14 days and after the listing changes: silk sheets queen (0.45), satin sheets queen size (0.39), black silk sheets (0.14), silk sheets full (0.34), satin sheets full (0.33), satin bed sheets (0.0), silk queen bed sheets set (0.0), black silk sheets queen (0.34), silk bed sheets full (0.0), satin queen sheets set (0.0).</w:t>
       </w:r>
     </w:p>
     <w:tbl>
@@ -6529,7 +6568,7 @@
                 <w:sz w:val="16"/>
                 <w:szCs w:val="16"/>
               </w:rPr>
-              <w:t xml:space="preserve">silk bed sheets</w:t>
+              <w:t xml:space="preserve">satin sheets</w:t>
             </w:r>
           </w:p>
         </w:tc>
@@ -6557,7 +6596,7 @@
                 <w:sz w:val="16"/>
                 <w:szCs w:val="16"/>
               </w:rPr>
-              <w:t xml:space="preserve">9.87</w:t>
+              <w:t xml:space="preserve">30.14</w:t>
             </w:r>
           </w:p>
         </w:tc>
@@ -6585,7 +6624,7 @@
                 <w:sz w:val="16"/>
                 <w:szCs w:val="16"/>
               </w:rPr>
-              <w:t xml:space="preserve">0.32%</w:t>
+              <w:t xml:space="preserve">0.24%</w:t>
             </w:r>
           </w:p>
         </w:tc>
@@ -6613,7 +6652,7 @@
                 <w:sz w:val="16"/>
                 <w:szCs w:val="16"/>
               </w:rPr>
-              <w:t xml:space="preserve">37</w:t>
+              <w:t xml:space="preserve">63</w:t>
             </w:r>
           </w:p>
         </w:tc>
@@ -6669,7 +6708,7 @@
                 <w:sz w:val="16"/>
                 <w:szCs w:val="16"/>
               </w:rPr>
-              <w:t xml:space="preserve">0.73</w:t>
+              <w:t xml:space="preserve">0.51</w:t>
             </w:r>
           </w:p>
         </w:tc>
@@ -6697,7 +6736,7 @@
                 <w:sz w:val="16"/>
                 <w:szCs w:val="16"/>
               </w:rPr>
-              <w:t xml:space="preserve">0.1 → 2.7</w:t>
+              <w:t xml:space="preserve">3.57 → 13.5</w:t>
             </w:r>
           </w:p>
         </w:tc>
@@ -6725,7 +6764,7 @@
                 <w:sz w:val="16"/>
                 <w:szCs w:val="16"/>
               </w:rPr>
-              <w:t xml:space="preserve">$1.36</w:t>
+              <w:t xml:space="preserve">$0.61</w:t>
             </w:r>
           </w:p>
         </w:tc>
@@ -6786,7 +6825,7 @@
                 <w:sz w:val="16"/>
                 <w:szCs w:val="16"/>
               </w:rPr>
-              <w:t xml:space="preserve">silk sheets king</w:t>
+              <w:t xml:space="preserve">silk bed sheets</w:t>
             </w:r>
           </w:p>
         </w:tc>
@@ -6814,7 +6853,7 @@
                 <w:sz w:val="16"/>
                 <w:szCs w:val="16"/>
               </w:rPr>
-              <w:t xml:space="preserve">7.02</w:t>
+              <w:t xml:space="preserve">9.87</w:t>
             </w:r>
           </w:p>
         </w:tc>
@@ -6842,7 +6881,7 @@
                 <w:sz w:val="16"/>
                 <w:szCs w:val="16"/>
               </w:rPr>
-              <w:t xml:space="preserve">1.41%</w:t>
+              <w:t xml:space="preserve">0.32%</w:t>
             </w:r>
           </w:p>
         </w:tc>
@@ -6870,7 +6909,7 @@
                 <w:sz w:val="16"/>
                 <w:szCs w:val="16"/>
               </w:rPr>
-              <w:t xml:space="preserve">31</w:t>
+              <w:t xml:space="preserve">37</w:t>
             </w:r>
           </w:p>
         </w:tc>
@@ -6926,7 +6965,7 @@
                 <w:sz w:val="16"/>
                 <w:szCs w:val="16"/>
               </w:rPr>
-              <w:t xml:space="preserve">1.52</w:t>
+              <w:t xml:space="preserve">0.77</w:t>
             </w:r>
           </w:p>
         </w:tc>
@@ -6954,7 +6993,7 @@
                 <w:sz w:val="16"/>
                 <w:szCs w:val="16"/>
               </w:rPr>
-              <w:t xml:space="preserve">1.03 → 2.0</w:t>
+              <w:t xml:space="preserve">0.1 → 2.7</w:t>
             </w:r>
           </w:p>
         </w:tc>
@@ -6982,7 +7021,7 @@
                 <w:sz w:val="16"/>
                 <w:szCs w:val="16"/>
               </w:rPr>
-              <w:t xml:space="preserve">$1.54</w:t>
+              <w:t xml:space="preserve">$1.36</w:t>
             </w:r>
           </w:p>
         </w:tc>
@@ -7010,7 +7049,7 @@
                 <w:sz w:val="16"/>
                 <w:szCs w:val="16"/>
               </w:rPr>
-              <w:t xml:space="preserve">King Black</w:t>
+              <w:t xml:space="preserve">Queen Black</w:t>
             </w:r>
           </w:p>
         </w:tc>
@@ -7043,7 +7082,7 @@
                 <w:sz w:val="16"/>
                 <w:szCs w:val="16"/>
               </w:rPr>
-              <w:t xml:space="preserve">black satin sheets</w:t>
+              <w:t xml:space="preserve">silk sheets king</w:t>
             </w:r>
           </w:p>
         </w:tc>
@@ -7071,7 +7110,7 @@
                 <w:sz w:val="16"/>
                 <w:szCs w:val="16"/>
               </w:rPr>
-              <w:t xml:space="preserve">6.73</w:t>
+              <w:t xml:space="preserve">7.02</w:t>
             </w:r>
           </w:p>
         </w:tc>
@@ -7099,7 +7138,7 @@
                 <w:sz w:val="16"/>
                 <w:szCs w:val="16"/>
               </w:rPr>
-              <w:t xml:space="preserve">0.16%</w:t>
+              <w:t xml:space="preserve">1.41%</w:t>
             </w:r>
           </w:p>
         </w:tc>
@@ -7127,7 +7166,7 @@
                 <w:sz w:val="16"/>
                 <w:szCs w:val="16"/>
               </w:rPr>
-              <w:t xml:space="preserve">51</w:t>
+              <w:t xml:space="preserve">31</w:t>
             </w:r>
           </w:p>
         </w:tc>
@@ -7183,7 +7222,7 @@
                 <w:sz w:val="16"/>
                 <w:szCs w:val="16"/>
               </w:rPr>
-              <w:t xml:space="preserve">0.6</w:t>
+              <w:t xml:space="preserve">1.52</w:t>
             </w:r>
           </w:p>
         </w:tc>
@@ -7211,7 +7250,7 @@
                 <w:sz w:val="16"/>
                 <w:szCs w:val="16"/>
               </w:rPr>
-              <w:t xml:space="preserve">0.1 → 1.7</w:t>
+              <w:t xml:space="preserve">1.03 → 2.0</w:t>
             </w:r>
           </w:p>
         </w:tc>
@@ -7239,7 +7278,7 @@
                 <w:sz w:val="16"/>
                 <w:szCs w:val="16"/>
               </w:rPr>
-              <w:t xml:space="preserve">$1.48</w:t>
+              <w:t xml:space="preserve">$1.54</w:t>
             </w:r>
           </w:p>
         </w:tc>
@@ -7267,7 +7306,7 @@
                 <w:sz w:val="16"/>
                 <w:szCs w:val="16"/>
               </w:rPr>
-              <w:t xml:space="preserve">Queen Black</w:t>
+              <w:t xml:space="preserve">King Black</w:t>
             </w:r>
           </w:p>
         </w:tc>
@@ -7300,7 +7339,7 @@
                 <w:sz w:val="16"/>
                 <w:szCs w:val="16"/>
               </w:rPr>
-              <w:t xml:space="preserve">silk bed sheets queen</w:t>
+              <w:t xml:space="preserve">black satin sheets</w:t>
             </w:r>
           </w:p>
         </w:tc>
@@ -7328,7 +7367,7 @@
                 <w:sz w:val="16"/>
                 <w:szCs w:val="16"/>
               </w:rPr>
-              <w:t xml:space="preserve">5.22</w:t>
+              <w:t xml:space="preserve">6.73</w:t>
             </w:r>
           </w:p>
         </w:tc>
@@ -7356,7 +7395,7 @@
                 <w:sz w:val="16"/>
                 <w:szCs w:val="16"/>
               </w:rPr>
-              <w:t xml:space="preserve">0.21%</w:t>
+              <w:t xml:space="preserve">0.16%</w:t>
             </w:r>
           </w:p>
         </w:tc>
@@ -7384,7 +7423,7 @@
                 <w:sz w:val="16"/>
                 <w:szCs w:val="16"/>
               </w:rPr>
-              <w:t xml:space="preserve">78</w:t>
+              <w:t xml:space="preserve">51</w:t>
             </w:r>
           </w:p>
         </w:tc>
@@ -7440,7 +7479,7 @@
                 <w:sz w:val="16"/>
                 <w:szCs w:val="16"/>
               </w:rPr>
-              <w:t xml:space="preserve">1.16</w:t>
+              <w:t xml:space="preserve">0.6</w:t>
             </w:r>
           </w:p>
         </w:tc>
@@ -7468,7 +7507,7 @@
                 <w:sz w:val="16"/>
                 <w:szCs w:val="16"/>
               </w:rPr>
-              <w:t xml:space="preserve">0.33 → 1.5</w:t>
+              <w:t xml:space="preserve">0.1 → 1.7</w:t>
             </w:r>
           </w:p>
         </w:tc>
@@ -7496,7 +7535,7 @@
                 <w:sz w:val="16"/>
                 <w:szCs w:val="16"/>
               </w:rPr>
-              <w:t xml:space="preserve">$0.61</w:t>
+              <w:t xml:space="preserve">$1.48</w:t>
             </w:r>
           </w:p>
         </w:tc>
@@ -7557,7 +7596,7 @@
                 <w:sz w:val="16"/>
                 <w:szCs w:val="16"/>
               </w:rPr>
-              <w:t xml:space="preserve">satin sheets king</w:t>
+              <w:t xml:space="preserve">silk bed sheets queen</w:t>
             </w:r>
           </w:p>
         </w:tc>
@@ -7585,7 +7624,7 @@
                 <w:sz w:val="16"/>
                 <w:szCs w:val="16"/>
               </w:rPr>
-              <w:t xml:space="preserve">4.98</w:t>
+              <w:t xml:space="preserve">5.22</w:t>
             </w:r>
           </w:p>
         </w:tc>
@@ -7613,7 +7652,7 @@
                 <w:sz w:val="16"/>
                 <w:szCs w:val="16"/>
               </w:rPr>
-              <w:t xml:space="preserve">2.87%</w:t>
+              <w:t xml:space="preserve">0.21%</w:t>
             </w:r>
           </w:p>
         </w:tc>
@@ -7641,7 +7680,7 @@
                 <w:sz w:val="16"/>
                 <w:szCs w:val="16"/>
               </w:rPr>
-              <w:t xml:space="preserve">42</w:t>
+              <w:t xml:space="preserve">78</w:t>
             </w:r>
           </w:p>
         </w:tc>
@@ -7697,7 +7736,7 @@
                 <w:sz w:val="16"/>
                 <w:szCs w:val="16"/>
               </w:rPr>
-              <w:t xml:space="preserve">0.8</w:t>
+              <w:t xml:space="preserve">1.15</w:t>
             </w:r>
           </w:p>
         </w:tc>
@@ -7725,7 +7764,7 @@
                 <w:sz w:val="16"/>
                 <w:szCs w:val="16"/>
               </w:rPr>
-              <w:t xml:space="preserve">2.2 → 2.5</w:t>
+              <w:t xml:space="preserve">0.33 → 1.5</w:t>
             </w:r>
           </w:p>
         </w:tc>
@@ -7753,7 +7792,7 @@
                 <w:sz w:val="16"/>
                 <w:szCs w:val="16"/>
               </w:rPr>
-              <w:t xml:space="preserve">$1.66</w:t>
+              <w:t xml:space="preserve">$0.61</w:t>
             </w:r>
           </w:p>
         </w:tc>
@@ -7781,7 +7820,7 @@
                 <w:sz w:val="16"/>
                 <w:szCs w:val="16"/>
               </w:rPr>
-              <w:t xml:space="preserve">King Black</w:t>
+              <w:t xml:space="preserve">Queen Black</w:t>
             </w:r>
           </w:p>
         </w:tc>
@@ -7814,7 +7853,7 @@
                 <w:sz w:val="16"/>
                 <w:szCs w:val="16"/>
               </w:rPr>
-              <w:t xml:space="preserve">satin bed sheets</w:t>
+              <w:t xml:space="preserve">satin sheets king</w:t>
             </w:r>
           </w:p>
         </w:tc>
@@ -7842,7 +7881,7 @@
                 <w:sz w:val="16"/>
                 <w:szCs w:val="16"/>
               </w:rPr>
-              <w:t xml:space="preserve">4.37</w:t>
+              <w:t xml:space="preserve">4.98</w:t>
             </w:r>
           </w:p>
         </w:tc>
@@ -7870,7 +7909,7 @@
                 <w:sz w:val="16"/>
                 <w:szCs w:val="16"/>
               </w:rPr>
-              <w:t xml:space="preserve">0.00%</w:t>
+              <w:t xml:space="preserve">2.87%</w:t>
             </w:r>
           </w:p>
         </w:tc>
@@ -7898,7 +7937,7 @@
                 <w:sz w:val="16"/>
                 <w:szCs w:val="16"/>
               </w:rPr>
-              <w:t xml:space="preserve">62</w:t>
+              <w:t xml:space="preserve">42</w:t>
             </w:r>
           </w:p>
         </w:tc>
@@ -7954,7 +7993,7 @@
                 <w:sz w:val="16"/>
                 <w:szCs w:val="16"/>
               </w:rPr>
-              <w:t xml:space="preserve">3.27</w:t>
+              <w:t xml:space="preserve">0.8</w:t>
             </w:r>
           </w:p>
         </w:tc>
@@ -7982,7 +8021,7 @@
                 <w:sz w:val="16"/>
                 <w:szCs w:val="16"/>
               </w:rPr>
-              <w:t xml:space="preserve">0.37 → 2.0</w:t>
+              <w:t xml:space="preserve">2.2 → 2.5</w:t>
             </w:r>
           </w:p>
         </w:tc>
@@ -8010,7 +8049,7 @@
                 <w:sz w:val="16"/>
                 <w:szCs w:val="16"/>
               </w:rPr>
-              <w:t xml:space="preserve">$1.53</w:t>
+              <w:t xml:space="preserve">$1.66</w:t>
             </w:r>
           </w:p>
         </w:tc>
@@ -8038,7 +8077,7 @@
                 <w:sz w:val="16"/>
                 <w:szCs w:val="16"/>
               </w:rPr>
-              <w:t xml:space="preserve">Queen Black</w:t>
+              <w:t xml:space="preserve">King Black</w:t>
             </w:r>
           </w:p>
         </w:tc>
@@ -8071,7 +8110,7 @@
                 <w:sz w:val="16"/>
                 <w:szCs w:val="16"/>
               </w:rPr>
-              <w:t xml:space="preserve">silk queen bed sheets set</w:t>
+              <w:t xml:space="preserve">queen satin sheet set</w:t>
             </w:r>
           </w:p>
         </w:tc>
@@ -8099,7 +8138,7 @@
                 <w:sz w:val="16"/>
                 <w:szCs w:val="16"/>
               </w:rPr>
-              <w:t xml:space="preserve">4.26</w:t>
+              <w:t xml:space="preserve">3.46</w:t>
             </w:r>
           </w:p>
         </w:tc>
@@ -8127,7 +8166,7 @@
                 <w:sz w:val="16"/>
                 <w:szCs w:val="16"/>
               </w:rPr>
-              <w:t xml:space="preserve">0.00%</w:t>
+              <w:t xml:space="preserve">0.32%</w:t>
             </w:r>
           </w:p>
         </w:tc>
@@ -8155,7 +8194,7 @@
                 <w:sz w:val="16"/>
                 <w:szCs w:val="16"/>
               </w:rPr>
-              <w:t xml:space="preserve">81</w:t>
+              <w:t xml:space="preserve">53</w:t>
             </w:r>
           </w:p>
         </w:tc>
@@ -8211,7 +8250,7 @@
                 <w:sz w:val="16"/>
                 <w:szCs w:val="16"/>
               </w:rPr>
-              <w:t xml:space="preserve">2.32</w:t>
+              <w:t xml:space="preserve">0.94</w:t>
             </w:r>
           </w:p>
         </w:tc>
@@ -8239,7 +8278,7 @@
                 <w:sz w:val="16"/>
                 <w:szCs w:val="16"/>
               </w:rPr>
-              <w:t xml:space="preserve">0.13 → 1.1</w:t>
+              <w:t xml:space="preserve">0.33 → 1.1</w:t>
             </w:r>
           </w:p>
         </w:tc>
@@ -8267,7 +8306,7 @@
                 <w:sz w:val="16"/>
                 <w:szCs w:val="16"/>
               </w:rPr>
-              <w:t xml:space="preserve">$1.68</w:t>
+              <w:t xml:space="preserve">$0.58</w:t>
             </w:r>
           </w:p>
         </w:tc>
@@ -8328,7 +8367,7 @@
                 <w:sz w:val="16"/>
                 <w:szCs w:val="16"/>
               </w:rPr>
-              <w:t xml:space="preserve">queen satin sheet set</w:t>
+              <w:t xml:space="preserve">black satin sheets queen</w:t>
             </w:r>
           </w:p>
         </w:tc>
@@ -8356,7 +8395,7 @@
                 <w:sz w:val="16"/>
                 <w:szCs w:val="16"/>
               </w:rPr>
-              <w:t xml:space="preserve">3.46</w:t>
+              <w:t xml:space="preserve">3.18</w:t>
             </w:r>
           </w:p>
         </w:tc>
@@ -8384,7 +8423,7 @@
                 <w:sz w:val="16"/>
                 <w:szCs w:val="16"/>
               </w:rPr>
-              <w:t xml:space="preserve">0.32%</w:t>
+              <w:t xml:space="preserve">0.69%</w:t>
             </w:r>
           </w:p>
         </w:tc>
@@ -8412,7 +8451,7 @@
                 <w:sz w:val="16"/>
                 <w:szCs w:val="16"/>
               </w:rPr>
-              <w:t xml:space="preserve">53</w:t>
+              <w:t xml:space="preserve">22</w:t>
             </w:r>
           </w:p>
         </w:tc>
@@ -8468,7 +8507,7 @@
                 <w:sz w:val="16"/>
                 <w:szCs w:val="16"/>
               </w:rPr>
-              <w:t xml:space="preserve">0.94</w:t>
+              <w:t xml:space="preserve">1.68</w:t>
             </w:r>
           </w:p>
         </w:tc>
@@ -8496,7 +8535,7 @@
                 <w:sz w:val="16"/>
                 <w:szCs w:val="16"/>
               </w:rPr>
-              <w:t xml:space="preserve">0.33 → 1.1</w:t>
+              <w:t xml:space="preserve">0.03 → 0.6</w:t>
             </w:r>
           </w:p>
         </w:tc>
@@ -8524,7 +8563,7 @@
                 <w:sz w:val="16"/>
                 <w:szCs w:val="16"/>
               </w:rPr>
-              <w:t xml:space="preserve">$0.58</w:t>
+              <w:t xml:space="preserve">$1.56</w:t>
             </w:r>
           </w:p>
         </w:tc>
@@ -8585,7 +8624,7 @@
                 <w:sz w:val="16"/>
                 <w:szCs w:val="16"/>
               </w:rPr>
-              <w:t xml:space="preserve">black satin sheets queen</w:t>
+              <w:t xml:space="preserve">queen silk sheets</w:t>
             </w:r>
           </w:p>
         </w:tc>
@@ -8613,7 +8652,7 @@
                 <w:sz w:val="16"/>
                 <w:szCs w:val="16"/>
               </w:rPr>
-              <w:t xml:space="preserve">3.18</w:t>
+              <w:t xml:space="preserve">2.87</w:t>
             </w:r>
           </w:p>
         </w:tc>
@@ -8641,7 +8680,7 @@
                 <w:sz w:val="16"/>
                 <w:szCs w:val="16"/>
               </w:rPr>
-              <w:t xml:space="preserve">0.69%</w:t>
+              <w:t xml:space="preserve">0.33%</w:t>
             </w:r>
           </w:p>
         </w:tc>
@@ -8669,7 +8708,7 @@
                 <w:sz w:val="16"/>
                 <w:szCs w:val="16"/>
               </w:rPr>
-              <w:t xml:space="preserve">22</w:t>
+              <w:t xml:space="preserve">60</w:t>
             </w:r>
           </w:p>
         </w:tc>
@@ -8725,7 +8764,7 @@
                 <w:sz w:val="16"/>
                 <w:szCs w:val="16"/>
               </w:rPr>
-              <w:t xml:space="preserve">1.68</w:t>
+              <w:t xml:space="preserve">0.94</w:t>
             </w:r>
           </w:p>
         </w:tc>
@@ -8753,7 +8792,7 @@
                 <w:sz w:val="16"/>
                 <w:szCs w:val="16"/>
               </w:rPr>
-              <w:t xml:space="preserve">0.03 → 0.6</w:t>
+              <w:t xml:space="preserve">0.1 → 0.7</w:t>
             </w:r>
           </w:p>
         </w:tc>
@@ -8781,7 +8820,7 @@
                 <w:sz w:val="16"/>
                 <w:szCs w:val="16"/>
               </w:rPr>
-              <w:t xml:space="preserve">$1.56</w:t>
+              <w:t xml:space="preserve">$0.76</w:t>
             </w:r>
           </w:p>
         </w:tc>
@@ -8842,7 +8881,7 @@
                 <w:sz w:val="16"/>
                 <w:szCs w:val="16"/>
               </w:rPr>
-              <w:t xml:space="preserve">queen silk sheets</w:t>
+              <w:t xml:space="preserve">satin sheets queen</w:t>
             </w:r>
           </w:p>
         </w:tc>
@@ -8870,7 +8909,7 @@
                 <w:sz w:val="16"/>
                 <w:szCs w:val="16"/>
               </w:rPr>
-              <w:t xml:space="preserve">2.87</w:t>
+              <w:t xml:space="preserve">2.73</w:t>
             </w:r>
           </w:p>
         </w:tc>
@@ -8898,7 +8937,7 @@
                 <w:sz w:val="16"/>
                 <w:szCs w:val="16"/>
               </w:rPr>
-              <w:t xml:space="preserve">0.33%</w:t>
+              <w:t xml:space="preserve">1.21%</w:t>
             </w:r>
           </w:p>
         </w:tc>
@@ -8926,7 +8965,7 @@
                 <w:sz w:val="16"/>
                 <w:szCs w:val="16"/>
               </w:rPr>
-              <w:t xml:space="preserve">60</w:t>
+              <w:t xml:space="preserve">34</w:t>
             </w:r>
           </w:p>
         </w:tc>
@@ -8982,7 +9021,7 @@
                 <w:sz w:val="16"/>
                 <w:szCs w:val="16"/>
               </w:rPr>
-              <w:t xml:space="preserve">0.81</w:t>
+              <w:t xml:space="preserve">0.92</w:t>
             </w:r>
           </w:p>
         </w:tc>
@@ -9010,7 +9049,7 @@
                 <w:sz w:val="16"/>
                 <w:szCs w:val="16"/>
               </w:rPr>
-              <w:t xml:space="preserve">0.1 → 0.7</w:t>
+              <w:t xml:space="preserve">0.13 → 0.6</w:t>
             </w:r>
           </w:p>
         </w:tc>
@@ -9038,7 +9077,7 @@
                 <w:sz w:val="16"/>
                 <w:szCs w:val="16"/>
               </w:rPr>
-              <w:t xml:space="preserve">$0.76</w:t>
+              <w:t xml:space="preserve">$0.77</w:t>
             </w:r>
           </w:p>
         </w:tc>
@@ -9099,7 +9138,7 @@
                 <w:sz w:val="16"/>
                 <w:szCs w:val="16"/>
               </w:rPr>
-              <w:t xml:space="preserve">satin sheets queen</w:t>
+              <w:t xml:space="preserve">king silk sheets</w:t>
             </w:r>
           </w:p>
         </w:tc>
@@ -9127,7 +9166,7 @@
                 <w:sz w:val="16"/>
                 <w:szCs w:val="16"/>
               </w:rPr>
-              <w:t xml:space="preserve">2.73</w:t>
+              <w:t xml:space="preserve">2.49</w:t>
             </w:r>
           </w:p>
         </w:tc>
@@ -9155,7 +9194,7 @@
                 <w:sz w:val="16"/>
                 <w:szCs w:val="16"/>
               </w:rPr>
-              <w:t xml:space="preserve">1.21%</w:t>
+              <w:t xml:space="preserve">3.46%</w:t>
             </w:r>
           </w:p>
         </w:tc>
@@ -9183,7 +9222,7 @@
                 <w:sz w:val="16"/>
                 <w:szCs w:val="16"/>
               </w:rPr>
-              <w:t xml:space="preserve">34</w:t>
+              <w:t xml:space="preserve">27</w:t>
             </w:r>
           </w:p>
         </w:tc>
@@ -9239,7 +9278,7 @@
                 <w:sz w:val="16"/>
                 <w:szCs w:val="16"/>
               </w:rPr>
-              <w:t xml:space="preserve">0.92</w:t>
+              <w:t xml:space="preserve">0.98</w:t>
             </w:r>
           </w:p>
         </w:tc>
@@ -9267,7 +9306,7 @@
                 <w:sz w:val="16"/>
                 <w:szCs w:val="16"/>
               </w:rPr>
-              <w:t xml:space="preserve">0.13 → 0.6</w:t>
+              <w:t xml:space="preserve">0.87 → 1.0</w:t>
             </w:r>
           </w:p>
         </w:tc>
@@ -9295,7 +9334,7 @@
                 <w:sz w:val="16"/>
                 <w:szCs w:val="16"/>
               </w:rPr>
-              <w:t xml:space="preserve">$0.77</w:t>
+              <w:t xml:space="preserve">$2.5</w:t>
             </w:r>
           </w:p>
         </w:tc>
@@ -9323,7 +9362,7 @@
                 <w:sz w:val="16"/>
                 <w:szCs w:val="16"/>
               </w:rPr>
-              <w:t xml:space="preserve">Queen Black</w:t>
+              <w:t xml:space="preserve">King Black</w:t>
             </w:r>
           </w:p>
         </w:tc>
@@ -9356,7 +9395,7 @@
                 <w:sz w:val="16"/>
                 <w:szCs w:val="16"/>
               </w:rPr>
-              <w:t xml:space="preserve">king silk sheets</w:t>
+              <w:t xml:space="preserve">satin bed sheets queen</w:t>
             </w:r>
           </w:p>
         </w:tc>
@@ -9384,7 +9423,7 @@
                 <w:sz w:val="16"/>
                 <w:szCs w:val="16"/>
               </w:rPr>
-              <w:t xml:space="preserve">2.49</w:t>
+              <w:t xml:space="preserve">2.19</w:t>
             </w:r>
           </w:p>
         </w:tc>
@@ -9412,7 +9451,7 @@
                 <w:sz w:val="16"/>
                 <w:szCs w:val="16"/>
               </w:rPr>
-              <w:t xml:space="preserve">3.46%</w:t>
+              <w:t xml:space="preserve">0.50%</w:t>
             </w:r>
           </w:p>
         </w:tc>
@@ -9440,7 +9479,7 @@
                 <w:sz w:val="16"/>
                 <w:szCs w:val="16"/>
               </w:rPr>
-              <w:t xml:space="preserve">27</w:t>
+              <w:t xml:space="preserve">47</w:t>
             </w:r>
           </w:p>
         </w:tc>
@@ -9496,7 +9535,7 @@
                 <w:sz w:val="16"/>
                 <w:szCs w:val="16"/>
               </w:rPr>
-              <w:t xml:space="preserve">0.96</w:t>
+              <w:t xml:space="preserve">1.71</w:t>
             </w:r>
           </w:p>
         </w:tc>
@@ -9524,7 +9563,7 @@
                 <w:sz w:val="16"/>
                 <w:szCs w:val="16"/>
               </w:rPr>
-              <w:t xml:space="preserve">0.87 → 1.0</w:t>
+              <w:t xml:space="preserve">0.13 → 0.6</w:t>
             </w:r>
           </w:p>
         </w:tc>
@@ -9552,7 +9591,7 @@
                 <w:sz w:val="16"/>
                 <w:szCs w:val="16"/>
               </w:rPr>
-              <w:t xml:space="preserve">$2.5</w:t>
+              <w:t xml:space="preserve">$1.54</w:t>
             </w:r>
           </w:p>
         </w:tc>
@@ -9580,7 +9619,7 @@
                 <w:sz w:val="16"/>
                 <w:szCs w:val="16"/>
               </w:rPr>
-              <w:t xml:space="preserve">King Black</w:t>
+              <w:t xml:space="preserve">Queen Black</w:t>
             </w:r>
           </w:p>
         </w:tc>
@@ -9613,7 +9652,7 @@
                 <w:sz w:val="16"/>
                 <w:szCs w:val="16"/>
               </w:rPr>
-              <w:t xml:space="preserve">silk bed sheets full</w:t>
+              <w:t xml:space="preserve">king size satin sheets</w:t>
             </w:r>
           </w:p>
         </w:tc>
@@ -9641,7 +9680,7 @@
                 <w:sz w:val="16"/>
                 <w:szCs w:val="16"/>
               </w:rPr>
-              <w:t xml:space="preserve">2.19</w:t>
+              <w:t xml:space="preserve">1.95</w:t>
             </w:r>
           </w:p>
         </w:tc>
@@ -9669,7 +9708,7 @@
                 <w:sz w:val="16"/>
                 <w:szCs w:val="16"/>
               </w:rPr>
-              <w:t xml:space="preserve">0.00%</w:t>
+              <w:t xml:space="preserve">1.13%</w:t>
             </w:r>
           </w:p>
         </w:tc>
@@ -9697,7 +9736,7 @@
                 <w:sz w:val="16"/>
                 <w:szCs w:val="16"/>
               </w:rPr>
-              <w:t xml:space="preserve">66</w:t>
+              <w:t xml:space="preserve">25</w:t>
             </w:r>
           </w:p>
         </w:tc>
@@ -9753,7 +9792,7 @@
                 <w:sz w:val="16"/>
                 <w:szCs w:val="16"/>
               </w:rPr>
-              <w:t xml:space="preserve">2.27</w:t>
+              <w:t xml:space="preserve">0.74</w:t>
             </w:r>
           </w:p>
         </w:tc>
@@ -9781,7 +9820,7 @@
                 <w:sz w:val="16"/>
                 <w:szCs w:val="16"/>
               </w:rPr>
-              <w:t xml:space="preserve">0.1 → 0.8</w:t>
+              <w:t xml:space="preserve">0.3 → 0.6</w:t>
             </w:r>
           </w:p>
         </w:tc>
@@ -9809,7 +9848,7 @@
                 <w:sz w:val="16"/>
                 <w:szCs w:val="16"/>
               </w:rPr>
-              <w:t xml:space="preserve">$1.72</w:t>
+              <w:t xml:space="preserve">$1.7</w:t>
             </w:r>
           </w:p>
         </w:tc>
@@ -9837,7 +9876,7 @@
                 <w:sz w:val="16"/>
                 <w:szCs w:val="16"/>
               </w:rPr>
-              <w:t xml:space="preserve">Full Black</w:t>
+              <w:t xml:space="preserve">King Black</w:t>
             </w:r>
           </w:p>
         </w:tc>
@@ -9870,7 +9909,7 @@
                 <w:sz w:val="16"/>
                 <w:szCs w:val="16"/>
               </w:rPr>
-              <w:t xml:space="preserve">satin bed sheets queen</w:t>
+              <w:t xml:space="preserve">silk queen sheets</w:t>
             </w:r>
           </w:p>
         </w:tc>
@@ -9898,7 +9937,7 @@
                 <w:sz w:val="16"/>
                 <w:szCs w:val="16"/>
               </w:rPr>
-              <w:t xml:space="preserve">2.19</w:t>
+              <w:t xml:space="preserve">1.93</w:t>
             </w:r>
           </w:p>
         </w:tc>
@@ -9926,7 +9965,7 @@
                 <w:sz w:val="16"/>
                 <w:szCs w:val="16"/>
               </w:rPr>
-              <w:t xml:space="preserve">0.50%</w:t>
+              <w:t xml:space="preserve">1.13%</w:t>
             </w:r>
           </w:p>
         </w:tc>
@@ -9954,7 +9993,7 @@
                 <w:sz w:val="16"/>
                 <w:szCs w:val="16"/>
               </w:rPr>
-              <w:t xml:space="preserve">47</w:t>
+              <w:t xml:space="preserve">33</w:t>
             </w:r>
           </w:p>
         </w:tc>
@@ -10010,778 +10049,7 @@
                 <w:sz w:val="16"/>
                 <w:szCs w:val="16"/>
               </w:rPr>
-              <w:t xml:space="preserve">1.74</w:t>
-            </w:r>
-          </w:p>
-        </w:tc>
-        <w:tc>
-          <w:tcPr>
-            <w:tcW w:type="dxa" w:w="1040"/>
-            <w:tcBorders>
-              <w:top w:val="single" w:color="BFBFBF" w:sz="4"/>
-              <w:left w:val="single" w:color="BFBFBF" w:sz="4"/>
-              <w:bottom w:val="single" w:color="BFBFBF" w:sz="4"/>
-              <w:right w:val="single" w:color="BFBFBF" w:sz="4"/>
-            </w:tcBorders>
-            <w:tcMar>
-              <w:top w:type="dxa" w:w="40"/>
-              <w:left w:type="dxa" w:w="80"/>
-              <w:bottom w:type="dxa" w:w="40"/>
-              <w:right w:type="dxa" w:w="80"/>
-            </w:tcMar>
-          </w:tcPr>
-          <w:p>
-            <w:r>
-              <w:rPr>
-                <w:b w:val="false"/>
-                <w:bCs w:val="false"/>
-                <w:sz w:val="16"/>
-                <w:szCs w:val="16"/>
-              </w:rPr>
-              <w:t xml:space="preserve">0.13 → 0.6</w:t>
-            </w:r>
-          </w:p>
-        </w:tc>
-        <w:tc>
-          <w:tcPr>
-            <w:tcW w:type="dxa" w:w="1040"/>
-            <w:tcBorders>
-              <w:top w:val="single" w:color="BFBFBF" w:sz="4"/>
-              <w:left w:val="single" w:color="BFBFBF" w:sz="4"/>
-              <w:bottom w:val="single" w:color="BFBFBF" w:sz="4"/>
-              <w:right w:val="single" w:color="BFBFBF" w:sz="4"/>
-            </w:tcBorders>
-            <w:tcMar>
-              <w:top w:type="dxa" w:w="40"/>
-              <w:left w:type="dxa" w:w="80"/>
-              <w:bottom w:type="dxa" w:w="40"/>
-              <w:right w:type="dxa" w:w="80"/>
-            </w:tcMar>
-          </w:tcPr>
-          <w:p>
-            <w:r>
-              <w:rPr>
-                <w:b w:val="false"/>
-                <w:bCs w:val="false"/>
-                <w:sz w:val="16"/>
-                <w:szCs w:val="16"/>
-              </w:rPr>
-              <w:t xml:space="preserve">$1.54</w:t>
-            </w:r>
-          </w:p>
-        </w:tc>
-        <w:tc>
-          <w:tcPr>
-            <w:tcW w:type="dxa" w:w="1040"/>
-            <w:tcBorders>
-              <w:top w:val="single" w:color="BFBFBF" w:sz="4"/>
-              <w:left w:val="single" w:color="BFBFBF" w:sz="4"/>
-              <w:bottom w:val="single" w:color="BFBFBF" w:sz="4"/>
-              <w:right w:val="single" w:color="BFBFBF" w:sz="4"/>
-            </w:tcBorders>
-            <w:tcMar>
-              <w:top w:type="dxa" w:w="40"/>
-              <w:left w:type="dxa" w:w="80"/>
-              <w:bottom w:type="dxa" w:w="40"/>
-              <w:right w:type="dxa" w:w="80"/>
-            </w:tcMar>
-          </w:tcPr>
-          <w:p>
-            <w:r>
-              <w:rPr>
-                <w:b w:val="false"/>
-                <w:bCs w:val="false"/>
-                <w:sz w:val="16"/>
-                <w:szCs w:val="16"/>
-              </w:rPr>
-              <w:t xml:space="preserve">Queen Black</w:t>
-            </w:r>
-          </w:p>
-        </w:tc>
-      </w:tr>
-      <w:tr>
-        <w:trPr>
-          <w:tblHeader w:val="off"/>
-        </w:trPr>
-        <w:tc>
-          <w:tcPr>
-            <w:tcW w:type="dxa" w:w="1040"/>
-            <w:tcBorders>
-              <w:top w:val="single" w:color="BFBFBF" w:sz="4"/>
-              <w:left w:val="single" w:color="BFBFBF" w:sz="4"/>
-              <w:bottom w:val="single" w:color="BFBFBF" w:sz="4"/>
-              <w:right w:val="single" w:color="BFBFBF" w:sz="4"/>
-            </w:tcBorders>
-            <w:tcMar>
-              <w:top w:type="dxa" w:w="40"/>
-              <w:left w:type="dxa" w:w="80"/>
-              <w:bottom w:type="dxa" w:w="40"/>
-              <w:right w:type="dxa" w:w="80"/>
-            </w:tcMar>
-          </w:tcPr>
-          <w:p>
-            <w:r>
-              <w:rPr>
-                <w:b w:val="false"/>
-                <w:bCs w:val="false"/>
-                <w:sz w:val="16"/>
-                <w:szCs w:val="16"/>
-              </w:rPr>
-              <w:t xml:space="preserve">satin queen sheets set</w:t>
-            </w:r>
-          </w:p>
-        </w:tc>
-        <w:tc>
-          <w:tcPr>
-            <w:tcW w:type="dxa" w:w="1040"/>
-            <w:tcBorders>
-              <w:top w:val="single" w:color="BFBFBF" w:sz="4"/>
-              <w:left w:val="single" w:color="BFBFBF" w:sz="4"/>
-              <w:bottom w:val="single" w:color="BFBFBF" w:sz="4"/>
-              <w:right w:val="single" w:color="BFBFBF" w:sz="4"/>
-            </w:tcBorders>
-            <w:tcMar>
-              <w:top w:type="dxa" w:w="40"/>
-              <w:left w:type="dxa" w:w="80"/>
-              <w:bottom w:type="dxa" w:w="40"/>
-              <w:right w:type="dxa" w:w="80"/>
-            </w:tcMar>
-          </w:tcPr>
-          <w:p>
-            <w:r>
-              <w:rPr>
-                <w:b w:val="false"/>
-                <w:bCs w:val="false"/>
-                <w:sz w:val="16"/>
-                <w:szCs w:val="16"/>
-              </w:rPr>
-              <w:t xml:space="preserve">1.96</w:t>
-            </w:r>
-          </w:p>
-        </w:tc>
-        <w:tc>
-          <w:tcPr>
-            <w:tcW w:type="dxa" w:w="1040"/>
-            <w:tcBorders>
-              <w:top w:val="single" w:color="BFBFBF" w:sz="4"/>
-              <w:left w:val="single" w:color="BFBFBF" w:sz="4"/>
-              <w:bottom w:val="single" w:color="BFBFBF" w:sz="4"/>
-              <w:right w:val="single" w:color="BFBFBF" w:sz="4"/>
-            </w:tcBorders>
-            <w:tcMar>
-              <w:top w:type="dxa" w:w="40"/>
-              <w:left w:type="dxa" w:w="80"/>
-              <w:bottom w:type="dxa" w:w="40"/>
-              <w:right w:type="dxa" w:w="80"/>
-            </w:tcMar>
-          </w:tcPr>
-          <w:p>
-            <w:r>
-              <w:rPr>
-                <w:b w:val="false"/>
-                <w:bCs w:val="false"/>
-                <w:sz w:val="16"/>
-                <w:szCs w:val="16"/>
-              </w:rPr>
-              <w:t xml:space="preserve">0.00%</w:t>
-            </w:r>
-          </w:p>
-        </w:tc>
-        <w:tc>
-          <w:tcPr>
-            <w:tcW w:type="dxa" w:w="1040"/>
-            <w:tcBorders>
-              <w:top w:val="single" w:color="BFBFBF" w:sz="4"/>
-              <w:left w:val="single" w:color="BFBFBF" w:sz="4"/>
-              <w:bottom w:val="single" w:color="BFBFBF" w:sz="4"/>
-              <w:right w:val="single" w:color="BFBFBF" w:sz="4"/>
-            </w:tcBorders>
-            <w:tcMar>
-              <w:top w:type="dxa" w:w="40"/>
-              <w:left w:type="dxa" w:w="80"/>
-              <w:bottom w:type="dxa" w:w="40"/>
-              <w:right w:type="dxa" w:w="80"/>
-            </w:tcMar>
-          </w:tcPr>
-          <w:p>
-            <w:r>
-              <w:rPr>
-                <w:b w:val="false"/>
-                <w:bCs w:val="false"/>
-                <w:sz w:val="16"/>
-                <w:szCs w:val="16"/>
-              </w:rPr>
-              <w:t xml:space="preserve">49</w:t>
-            </w:r>
-          </w:p>
-        </w:tc>
-        <w:tc>
-          <w:tcPr>
-            <w:tcW w:type="dxa" w:w="1040"/>
-            <w:tcBorders>
-              <w:top w:val="single" w:color="BFBFBF" w:sz="4"/>
-              <w:left w:val="single" w:color="BFBFBF" w:sz="4"/>
-              <w:bottom w:val="single" w:color="BFBFBF" w:sz="4"/>
-              <w:right w:val="single" w:color="BFBFBF" w:sz="4"/>
-            </w:tcBorders>
-            <w:tcMar>
-              <w:top w:type="dxa" w:w="40"/>
-              <w:left w:type="dxa" w:w="80"/>
-              <w:bottom w:type="dxa" w:w="40"/>
-              <w:right w:type="dxa" w:w="80"/>
-            </w:tcMar>
-          </w:tcPr>
-          <w:p>
-            <w:r>
-              <w:rPr>
-                <w:b w:val="false"/>
-                <w:bCs w:val="false"/>
-                <w:sz w:val="16"/>
-                <w:szCs w:val="16"/>
-              </w:rPr>
-              <w:t xml:space="preserve">≤20</w:t>
-            </w:r>
-          </w:p>
-        </w:tc>
-        <w:tc>
-          <w:tcPr>
-            <w:tcW w:type="dxa" w:w="1040"/>
-            <w:tcBorders>
-              <w:top w:val="single" w:color="BFBFBF" w:sz="4"/>
-              <w:left w:val="single" w:color="BFBFBF" w:sz="4"/>
-              <w:bottom w:val="single" w:color="BFBFBF" w:sz="4"/>
-              <w:right w:val="single" w:color="BFBFBF" w:sz="4"/>
-            </w:tcBorders>
-            <w:tcMar>
-              <w:top w:type="dxa" w:w="40"/>
-              <w:left w:type="dxa" w:w="80"/>
-              <w:bottom w:type="dxa" w:w="40"/>
-              <w:right w:type="dxa" w:w="80"/>
-            </w:tcMar>
-          </w:tcPr>
-          <w:p>
-            <w:r>
-              <w:rPr>
-                <w:b w:val="false"/>
-                <w:bCs w:val="false"/>
-                <w:sz w:val="16"/>
-                <w:szCs w:val="16"/>
-              </w:rPr>
-              <w:t xml:space="preserve">2.22</w:t>
-            </w:r>
-          </w:p>
-        </w:tc>
-        <w:tc>
-          <w:tcPr>
-            <w:tcW w:type="dxa" w:w="1040"/>
-            <w:tcBorders>
-              <w:top w:val="single" w:color="BFBFBF" w:sz="4"/>
-              <w:left w:val="single" w:color="BFBFBF" w:sz="4"/>
-              <w:bottom w:val="single" w:color="BFBFBF" w:sz="4"/>
-              <w:right w:val="single" w:color="BFBFBF" w:sz="4"/>
-            </w:tcBorders>
-            <w:tcMar>
-              <w:top w:type="dxa" w:w="40"/>
-              <w:left w:type="dxa" w:w="80"/>
-              <w:bottom w:type="dxa" w:w="40"/>
-              <w:right w:type="dxa" w:w="80"/>
-            </w:tcMar>
-          </w:tcPr>
-          <w:p>
-            <w:r>
-              <w:rPr>
-                <w:b w:val="false"/>
-                <w:bCs w:val="false"/>
-                <w:sz w:val="16"/>
-                <w:szCs w:val="16"/>
-              </w:rPr>
-              <w:t xml:space="preserve">0.07 → 0.6</w:t>
-            </w:r>
-          </w:p>
-        </w:tc>
-        <w:tc>
-          <w:tcPr>
-            <w:tcW w:type="dxa" w:w="1040"/>
-            <w:tcBorders>
-              <w:top w:val="single" w:color="BFBFBF" w:sz="4"/>
-              <w:left w:val="single" w:color="BFBFBF" w:sz="4"/>
-              <w:bottom w:val="single" w:color="BFBFBF" w:sz="4"/>
-              <w:right w:val="single" w:color="BFBFBF" w:sz="4"/>
-            </w:tcBorders>
-            <w:tcMar>
-              <w:top w:type="dxa" w:w="40"/>
-              <w:left w:type="dxa" w:w="80"/>
-              <w:bottom w:type="dxa" w:w="40"/>
-              <w:right w:type="dxa" w:w="80"/>
-            </w:tcMar>
-          </w:tcPr>
-          <w:p>
-            <w:r>
-              <w:rPr>
-                <w:b w:val="false"/>
-                <w:bCs w:val="false"/>
-                <w:sz w:val="16"/>
-                <w:szCs w:val="16"/>
-              </w:rPr>
-              <w:t xml:space="preserve">$1.72</w:t>
-            </w:r>
-          </w:p>
-        </w:tc>
-        <w:tc>
-          <w:tcPr>
-            <w:tcW w:type="dxa" w:w="1040"/>
-            <w:tcBorders>
-              <w:top w:val="single" w:color="BFBFBF" w:sz="4"/>
-              <w:left w:val="single" w:color="BFBFBF" w:sz="4"/>
-              <w:bottom w:val="single" w:color="BFBFBF" w:sz="4"/>
-              <w:right w:val="single" w:color="BFBFBF" w:sz="4"/>
-            </w:tcBorders>
-            <w:tcMar>
-              <w:top w:type="dxa" w:w="40"/>
-              <w:left w:type="dxa" w:w="80"/>
-              <w:bottom w:type="dxa" w:w="40"/>
-              <w:right w:type="dxa" w:w="80"/>
-            </w:tcMar>
-          </w:tcPr>
-          <w:p>
-            <w:r>
-              <w:rPr>
-                <w:b w:val="false"/>
-                <w:bCs w:val="false"/>
-                <w:sz w:val="16"/>
-                <w:szCs w:val="16"/>
-              </w:rPr>
-              <w:t xml:space="preserve">Queen Black</w:t>
-            </w:r>
-          </w:p>
-        </w:tc>
-      </w:tr>
-      <w:tr>
-        <w:trPr>
-          <w:tblHeader w:val="off"/>
-        </w:trPr>
-        <w:tc>
-          <w:tcPr>
-            <w:tcW w:type="dxa" w:w="1040"/>
-            <w:tcBorders>
-              <w:top w:val="single" w:color="BFBFBF" w:sz="4"/>
-              <w:left w:val="single" w:color="BFBFBF" w:sz="4"/>
-              <w:bottom w:val="single" w:color="BFBFBF" w:sz="4"/>
-              <w:right w:val="single" w:color="BFBFBF" w:sz="4"/>
-            </w:tcBorders>
-            <w:tcMar>
-              <w:top w:type="dxa" w:w="40"/>
-              <w:left w:type="dxa" w:w="80"/>
-              <w:bottom w:type="dxa" w:w="40"/>
-              <w:right w:type="dxa" w:w="80"/>
-            </w:tcMar>
-          </w:tcPr>
-          <w:p>
-            <w:r>
-              <w:rPr>
-                <w:b w:val="false"/>
-                <w:bCs w:val="false"/>
-                <w:sz w:val="16"/>
-                <w:szCs w:val="16"/>
-              </w:rPr>
-              <w:t xml:space="preserve">king size satin sheets</w:t>
-            </w:r>
-          </w:p>
-        </w:tc>
-        <w:tc>
-          <w:tcPr>
-            <w:tcW w:type="dxa" w:w="1040"/>
-            <w:tcBorders>
-              <w:top w:val="single" w:color="BFBFBF" w:sz="4"/>
-              <w:left w:val="single" w:color="BFBFBF" w:sz="4"/>
-              <w:bottom w:val="single" w:color="BFBFBF" w:sz="4"/>
-              <w:right w:val="single" w:color="BFBFBF" w:sz="4"/>
-            </w:tcBorders>
-            <w:tcMar>
-              <w:top w:type="dxa" w:w="40"/>
-              <w:left w:type="dxa" w:w="80"/>
-              <w:bottom w:type="dxa" w:w="40"/>
-              <w:right w:type="dxa" w:w="80"/>
-            </w:tcMar>
-          </w:tcPr>
-          <w:p>
-            <w:r>
-              <w:rPr>
-                <w:b w:val="false"/>
-                <w:bCs w:val="false"/>
-                <w:sz w:val="16"/>
-                <w:szCs w:val="16"/>
-              </w:rPr>
-              <w:t xml:space="preserve">1.95</w:t>
-            </w:r>
-          </w:p>
-        </w:tc>
-        <w:tc>
-          <w:tcPr>
-            <w:tcW w:type="dxa" w:w="1040"/>
-            <w:tcBorders>
-              <w:top w:val="single" w:color="BFBFBF" w:sz="4"/>
-              <w:left w:val="single" w:color="BFBFBF" w:sz="4"/>
-              <w:bottom w:val="single" w:color="BFBFBF" w:sz="4"/>
-              <w:right w:val="single" w:color="BFBFBF" w:sz="4"/>
-            </w:tcBorders>
-            <w:tcMar>
-              <w:top w:type="dxa" w:w="40"/>
-              <w:left w:type="dxa" w:w="80"/>
-              <w:bottom w:type="dxa" w:w="40"/>
-              <w:right w:type="dxa" w:w="80"/>
-            </w:tcMar>
-          </w:tcPr>
-          <w:p>
-            <w:r>
-              <w:rPr>
-                <w:b w:val="false"/>
-                <w:bCs w:val="false"/>
-                <w:sz w:val="16"/>
-                <w:szCs w:val="16"/>
-              </w:rPr>
-              <w:t xml:space="preserve">1.13%</w:t>
-            </w:r>
-          </w:p>
-        </w:tc>
-        <w:tc>
-          <w:tcPr>
-            <w:tcW w:type="dxa" w:w="1040"/>
-            <w:tcBorders>
-              <w:top w:val="single" w:color="BFBFBF" w:sz="4"/>
-              <w:left w:val="single" w:color="BFBFBF" w:sz="4"/>
-              <w:bottom w:val="single" w:color="BFBFBF" w:sz="4"/>
-              <w:right w:val="single" w:color="BFBFBF" w:sz="4"/>
-            </w:tcBorders>
-            <w:tcMar>
-              <w:top w:type="dxa" w:w="40"/>
-              <w:left w:type="dxa" w:w="80"/>
-              <w:bottom w:type="dxa" w:w="40"/>
-              <w:right w:type="dxa" w:w="80"/>
-            </w:tcMar>
-          </w:tcPr>
-          <w:p>
-            <w:r>
-              <w:rPr>
-                <w:b w:val="false"/>
-                <w:bCs w:val="false"/>
-                <w:sz w:val="16"/>
-                <w:szCs w:val="16"/>
-              </w:rPr>
-              <w:t xml:space="preserve">25</w:t>
-            </w:r>
-          </w:p>
-        </w:tc>
-        <w:tc>
-          <w:tcPr>
-            <w:tcW w:type="dxa" w:w="1040"/>
-            <w:tcBorders>
-              <w:top w:val="single" w:color="BFBFBF" w:sz="4"/>
-              <w:left w:val="single" w:color="BFBFBF" w:sz="4"/>
-              <w:bottom w:val="single" w:color="BFBFBF" w:sz="4"/>
-              <w:right w:val="single" w:color="BFBFBF" w:sz="4"/>
-            </w:tcBorders>
-            <w:tcMar>
-              <w:top w:type="dxa" w:w="40"/>
-              <w:left w:type="dxa" w:w="80"/>
-              <w:bottom w:type="dxa" w:w="40"/>
-              <w:right w:type="dxa" w:w="80"/>
-            </w:tcMar>
-          </w:tcPr>
-          <w:p>
-            <w:r>
-              <w:rPr>
-                <w:b w:val="false"/>
-                <w:bCs w:val="false"/>
-                <w:sz w:val="16"/>
-                <w:szCs w:val="16"/>
-              </w:rPr>
-              <w:t xml:space="preserve">≤20</w:t>
-            </w:r>
-          </w:p>
-        </w:tc>
-        <w:tc>
-          <w:tcPr>
-            <w:tcW w:type="dxa" w:w="1040"/>
-            <w:tcBorders>
-              <w:top w:val="single" w:color="BFBFBF" w:sz="4"/>
-              <w:left w:val="single" w:color="BFBFBF" w:sz="4"/>
-              <w:bottom w:val="single" w:color="BFBFBF" w:sz="4"/>
-              <w:right w:val="single" w:color="BFBFBF" w:sz="4"/>
-            </w:tcBorders>
-            <w:tcMar>
-              <w:top w:type="dxa" w:w="40"/>
-              <w:left w:type="dxa" w:w="80"/>
-              <w:bottom w:type="dxa" w:w="40"/>
-              <w:right w:type="dxa" w:w="80"/>
-            </w:tcMar>
-          </w:tcPr>
-          <w:p>
-            <w:r>
-              <w:rPr>
-                <w:b w:val="false"/>
-                <w:bCs w:val="false"/>
-                <w:sz w:val="16"/>
-                <w:szCs w:val="16"/>
-              </w:rPr>
-              <w:t xml:space="preserve">0.74</w:t>
-            </w:r>
-          </w:p>
-        </w:tc>
-        <w:tc>
-          <w:tcPr>
-            <w:tcW w:type="dxa" w:w="1040"/>
-            <w:tcBorders>
-              <w:top w:val="single" w:color="BFBFBF" w:sz="4"/>
-              <w:left w:val="single" w:color="BFBFBF" w:sz="4"/>
-              <w:bottom w:val="single" w:color="BFBFBF" w:sz="4"/>
-              <w:right w:val="single" w:color="BFBFBF" w:sz="4"/>
-            </w:tcBorders>
-            <w:tcMar>
-              <w:top w:type="dxa" w:w="40"/>
-              <w:left w:type="dxa" w:w="80"/>
-              <w:bottom w:type="dxa" w:w="40"/>
-              <w:right w:type="dxa" w:w="80"/>
-            </w:tcMar>
-          </w:tcPr>
-          <w:p>
-            <w:r>
-              <w:rPr>
-                <w:b w:val="false"/>
-                <w:bCs w:val="false"/>
-                <w:sz w:val="16"/>
-                <w:szCs w:val="16"/>
-              </w:rPr>
-              <w:t xml:space="preserve">0.3 → 0.6</w:t>
-            </w:r>
-          </w:p>
-        </w:tc>
-        <w:tc>
-          <w:tcPr>
-            <w:tcW w:type="dxa" w:w="1040"/>
-            <w:tcBorders>
-              <w:top w:val="single" w:color="BFBFBF" w:sz="4"/>
-              <w:left w:val="single" w:color="BFBFBF" w:sz="4"/>
-              <w:bottom w:val="single" w:color="BFBFBF" w:sz="4"/>
-              <w:right w:val="single" w:color="BFBFBF" w:sz="4"/>
-            </w:tcBorders>
-            <w:tcMar>
-              <w:top w:type="dxa" w:w="40"/>
-              <w:left w:type="dxa" w:w="80"/>
-              <w:bottom w:type="dxa" w:w="40"/>
-              <w:right w:type="dxa" w:w="80"/>
-            </w:tcMar>
-          </w:tcPr>
-          <w:p>
-            <w:r>
-              <w:rPr>
-                <w:b w:val="false"/>
-                <w:bCs w:val="false"/>
-                <w:sz w:val="16"/>
-                <w:szCs w:val="16"/>
-              </w:rPr>
-              <w:t xml:space="preserve">$1.7</w:t>
-            </w:r>
-          </w:p>
-        </w:tc>
-        <w:tc>
-          <w:tcPr>
-            <w:tcW w:type="dxa" w:w="1040"/>
-            <w:tcBorders>
-              <w:top w:val="single" w:color="BFBFBF" w:sz="4"/>
-              <w:left w:val="single" w:color="BFBFBF" w:sz="4"/>
-              <w:bottom w:val="single" w:color="BFBFBF" w:sz="4"/>
-              <w:right w:val="single" w:color="BFBFBF" w:sz="4"/>
-            </w:tcBorders>
-            <w:tcMar>
-              <w:top w:type="dxa" w:w="40"/>
-              <w:left w:type="dxa" w:w="80"/>
-              <w:bottom w:type="dxa" w:w="40"/>
-              <w:right w:type="dxa" w:w="80"/>
-            </w:tcMar>
-          </w:tcPr>
-          <w:p>
-            <w:r>
-              <w:rPr>
-                <w:b w:val="false"/>
-                <w:bCs w:val="false"/>
-                <w:sz w:val="16"/>
-                <w:szCs w:val="16"/>
-              </w:rPr>
-              <w:t xml:space="preserve">King Black</w:t>
-            </w:r>
-          </w:p>
-        </w:tc>
-      </w:tr>
-      <w:tr>
-        <w:trPr>
-          <w:tblHeader w:val="off"/>
-        </w:trPr>
-        <w:tc>
-          <w:tcPr>
-            <w:tcW w:type="dxa" w:w="1040"/>
-            <w:tcBorders>
-              <w:top w:val="single" w:color="BFBFBF" w:sz="4"/>
-              <w:left w:val="single" w:color="BFBFBF" w:sz="4"/>
-              <w:bottom w:val="single" w:color="BFBFBF" w:sz="4"/>
-              <w:right w:val="single" w:color="BFBFBF" w:sz="4"/>
-            </w:tcBorders>
-            <w:tcMar>
-              <w:top w:type="dxa" w:w="40"/>
-              <w:left w:type="dxa" w:w="80"/>
-              <w:bottom w:type="dxa" w:w="40"/>
-              <w:right w:type="dxa" w:w="80"/>
-            </w:tcMar>
-          </w:tcPr>
-          <w:p>
-            <w:r>
-              <w:rPr>
-                <w:b w:val="false"/>
-                <w:bCs w:val="false"/>
-                <w:sz w:val="16"/>
-                <w:szCs w:val="16"/>
-              </w:rPr>
-              <w:t xml:space="preserve">silk queen sheets</w:t>
-            </w:r>
-          </w:p>
-        </w:tc>
-        <w:tc>
-          <w:tcPr>
-            <w:tcW w:type="dxa" w:w="1040"/>
-            <w:tcBorders>
-              <w:top w:val="single" w:color="BFBFBF" w:sz="4"/>
-              <w:left w:val="single" w:color="BFBFBF" w:sz="4"/>
-              <w:bottom w:val="single" w:color="BFBFBF" w:sz="4"/>
-              <w:right w:val="single" w:color="BFBFBF" w:sz="4"/>
-            </w:tcBorders>
-            <w:tcMar>
-              <w:top w:type="dxa" w:w="40"/>
-              <w:left w:type="dxa" w:w="80"/>
-              <w:bottom w:type="dxa" w:w="40"/>
-              <w:right w:type="dxa" w:w="80"/>
-            </w:tcMar>
-          </w:tcPr>
-          <w:p>
-            <w:r>
-              <w:rPr>
-                <w:b w:val="false"/>
-                <w:bCs w:val="false"/>
-                <w:sz w:val="16"/>
-                <w:szCs w:val="16"/>
-              </w:rPr>
-              <w:t xml:space="preserve">1.93</w:t>
-            </w:r>
-          </w:p>
-        </w:tc>
-        <w:tc>
-          <w:tcPr>
-            <w:tcW w:type="dxa" w:w="1040"/>
-            <w:tcBorders>
-              <w:top w:val="single" w:color="BFBFBF" w:sz="4"/>
-              <w:left w:val="single" w:color="BFBFBF" w:sz="4"/>
-              <w:bottom w:val="single" w:color="BFBFBF" w:sz="4"/>
-              <w:right w:val="single" w:color="BFBFBF" w:sz="4"/>
-            </w:tcBorders>
-            <w:tcMar>
-              <w:top w:type="dxa" w:w="40"/>
-              <w:left w:type="dxa" w:w="80"/>
-              <w:bottom w:type="dxa" w:w="40"/>
-              <w:right w:type="dxa" w:w="80"/>
-            </w:tcMar>
-          </w:tcPr>
-          <w:p>
-            <w:r>
-              <w:rPr>
-                <w:b w:val="false"/>
-                <w:bCs w:val="false"/>
-                <w:sz w:val="16"/>
-                <w:szCs w:val="16"/>
-              </w:rPr>
-              <w:t xml:space="preserve">1.13%</w:t>
-            </w:r>
-          </w:p>
-        </w:tc>
-        <w:tc>
-          <w:tcPr>
-            <w:tcW w:type="dxa" w:w="1040"/>
-            <w:tcBorders>
-              <w:top w:val="single" w:color="BFBFBF" w:sz="4"/>
-              <w:left w:val="single" w:color="BFBFBF" w:sz="4"/>
-              <w:bottom w:val="single" w:color="BFBFBF" w:sz="4"/>
-              <w:right w:val="single" w:color="BFBFBF" w:sz="4"/>
-            </w:tcBorders>
-            <w:tcMar>
-              <w:top w:type="dxa" w:w="40"/>
-              <w:left w:type="dxa" w:w="80"/>
-              <w:bottom w:type="dxa" w:w="40"/>
-              <w:right w:type="dxa" w:w="80"/>
-            </w:tcMar>
-          </w:tcPr>
-          <w:p>
-            <w:r>
-              <w:rPr>
-                <w:b w:val="false"/>
-                <w:bCs w:val="false"/>
-                <w:sz w:val="16"/>
-                <w:szCs w:val="16"/>
-              </w:rPr>
-              <w:t xml:space="preserve">33</w:t>
-            </w:r>
-          </w:p>
-        </w:tc>
-        <w:tc>
-          <w:tcPr>
-            <w:tcW w:type="dxa" w:w="1040"/>
-            <w:tcBorders>
-              <w:top w:val="single" w:color="BFBFBF" w:sz="4"/>
-              <w:left w:val="single" w:color="BFBFBF" w:sz="4"/>
-              <w:bottom w:val="single" w:color="BFBFBF" w:sz="4"/>
-              <w:right w:val="single" w:color="BFBFBF" w:sz="4"/>
-            </w:tcBorders>
-            <w:tcMar>
-              <w:top w:type="dxa" w:w="40"/>
-              <w:left w:type="dxa" w:w="80"/>
-              <w:bottom w:type="dxa" w:w="40"/>
-              <w:right w:type="dxa" w:w="80"/>
-            </w:tcMar>
-          </w:tcPr>
-          <w:p>
-            <w:r>
-              <w:rPr>
-                <w:b w:val="false"/>
-                <w:bCs w:val="false"/>
-                <w:sz w:val="16"/>
-                <w:szCs w:val="16"/>
-              </w:rPr>
-              <w:t xml:space="preserve">≤20</w:t>
-            </w:r>
-          </w:p>
-        </w:tc>
-        <w:tc>
-          <w:tcPr>
-            <w:tcW w:type="dxa" w:w="1040"/>
-            <w:tcBorders>
-              <w:top w:val="single" w:color="BFBFBF" w:sz="4"/>
-              <w:left w:val="single" w:color="BFBFBF" w:sz="4"/>
-              <w:bottom w:val="single" w:color="BFBFBF" w:sz="4"/>
-              <w:right w:val="single" w:color="BFBFBF" w:sz="4"/>
-            </w:tcBorders>
-            <w:tcMar>
-              <w:top w:type="dxa" w:w="40"/>
-              <w:left w:type="dxa" w:w="80"/>
-              <w:bottom w:type="dxa" w:w="40"/>
-              <w:right w:type="dxa" w:w="80"/>
-            </w:tcMar>
-          </w:tcPr>
-          <w:p>
-            <w:r>
-              <w:rPr>
-                <w:b w:val="false"/>
-                <w:bCs w:val="false"/>
-                <w:sz w:val="16"/>
-                <w:szCs w:val="16"/>
-              </w:rPr>
-              <w:t xml:space="preserve">1.99</w:t>
+              <w:t xml:space="preserve">1.97</w:t>
             </w:r>
           </w:p>
         </w:tc>
@@ -10947,7 +10215,7 @@
         <w:spacing w:after="80"/>
       </w:pPr>
       <w:r>
-        <w:t xml:space="preserve">Decision: push to the top 20. Top-of-search only, base bid $0.17, top-of-search price $1.7 (the campaign's 90-day top-of-search CPC), budget $24/day for 11.7 clicks a day. Cost over today $18.96/day for +1.29 orders/day. Stock: Queen Black to about 2026-12-01 at the plan's pace.</w:t>
+        <w:t xml:space="preserve">Decision: push to the top 20. Top-of-search only, base bid $0.17, top-of-search price $1.7 (the highest of today's bid, the term's top-of-search CPC and the campaign's own 90-day top-of-search CPC), budget $24/day for 11.7 clicks a day. Cost over today $18.96/day for +1.29 orders/day. Stock: Queen Black to about 2026-11-21 at the plan's pace.</w:t>
       </w:r>
     </w:p>
     <w:p>
@@ -10964,7 +10232,7 @@
         <w:spacing w:after="120"/>
       </w:pPr>
       <w:r>
-        <w:t xml:space="preserve">Every non-cosmetic decision in the audit (237; renames and retags excluded) was re-judged on the campaign's objective and its second-order effects: the share of our paid traffic on the term it carries, the term's rank and trend, the change in clicks, orders, sales, spend and profit, TACoS, the child's stock and LTSF status, and the competitors around us. Verdicts: REJECT 163; ACCEPT 41; MODIFY 28; REVIEW 5. Each verdict is read from the final action on the campaign, so the review, the campaign tab and this document agree.</w:t>
+        <w:t xml:space="preserve">Every non-cosmetic decision in the audit (237; renames and retags excluded) was re-judged on the campaign's objective and its second-order effects: the share of our paid traffic on the term it carries, the term's rank and trend, the change in clicks, orders, sales, spend and profit, TACoS, the child's stock and LTSF status, and the competitors around us. Verdicts: REJECT 160; ACCEPT 44; MODIFY 29; REVIEW 4. Each verdict is read from the final action on the campaign, so the review, the campaign tab and this document agree.</w:t>
       </w:r>
     </w:p>
     <w:p>
@@ -10990,7 +10258,7 @@
         <w:spacing w:after="80"/>
       </w:pPr>
       <w:r>
-        <w:t xml:space="preserve">On non-ranking terms the direction is often right but not the size: one −15% step, re-read after 7 days, stop if the term's organic rank slips 3 places. Most of the budget cuts would not bind anyway — those campaigns spend well below the new budget.</w:t>
+        <w:t xml:space="preserve">On non-ranking terms the direction is often right but not the size: one −15% step, re-read after 7 days, stop if the term's organic rank slips by more than its rank guard (the larger of 3 places and twice the term's normal weekly move, Keywords tab). Most of the budget cuts would not bind anyway — those campaigns spend well below the new budget.</w:t>
       </w:r>
     </w:p>
     <w:p>
@@ -11003,7 +10271,7 @@
         <w:spacing w:after="80"/>
       </w:pPr>
       <w:r>
-        <w:t xml:space="preserve">Child moves (audit "hero" and "serving child" rules): Full Black → Full White: 29; Twin Black → White Twin: 16; Red King → King Black: 10; Sea Teal Full → Full White: 5; Ivory Twin → White Twin: 5; Stripe Twin White → White Twin: 5. Ranking campaigns stay on (or move to) the preferred Black child; non-ranking ones go to an LTSF SKU only where it converts and is not a back-up; Twin campaigns stay on Twin Black (Twin White is not an LTSF SKU and sold 0 units in 30 days).</w:t>
+        <w:t xml:space="preserve">Child moves (audit "hero" and "serving child" rules): Full Black → Full White: 29; Twin Black → White Twin: 16; Red King → King Black: 10; Sea Teal Full → Full White: 5; Ivory Twin → White Twin: 5; Stripe Twin White → White Twin: 5. Ranking campaigns stay on (or move to) the preferred Black child; non-ranking ones go to an LTSF SKU only where it converts, is not a back-up and has aged stock left to absorb the traffic; non-ranking Twin campaigns stay on Twin Black (Twin White is not an LTSF SKU and sold 0 units in 30 days).</w:t>
       </w:r>
     </w:p>
     <w:p>
@@ -11405,7 +10673,7 @@
                 <w:sz w:val="16"/>
                 <w:szCs w:val="16"/>
               </w:rPr>
-              <w:t xml:space="preserve">Back-up child: If SATIN-KING-BLACK-6-PCS drops under 14 days of stock (or goes out of stock): enable SATIN-CHAMPAGNE-KING-6PCS, pause SATIN-KING-BLACK-6-PCS and set this campaign to maintain level (the back-up cannot carry the push). Switch</w:t>
+              <w:t xml:space="preserve">Back-up child: If SATIN-KING-BLACK-6-PCS drops under 14 days of stock (or goes out of stock): enable SATIN-CHAMPAGNE-KING-6PCS, pause SATIN-KING-BLACK-6-PCS and set this campaign to maintain level (the back-up cannot carry the push). Switch back when SATIN-KING-BLACK-6-PCS has ≥30 days of stock. | Top-of-search only: modifier 900%, base bid $0.17 (top-of-search price $1.7, = today's effective top-of-search bid (bid × top-of-search modifier) — kept, never lowered on a ranking term); rest of search and product pages 0% → those placements drop to the $0.17 base | Budget $20/day (needs $6/day = the daily click target 2.8 × top-of-search CPC, +20% headroom; never lowered on a ranking campaign) (today 4.1 paid clicks/day on king silk sheet set, king size silk sheets set) | Also buys 3 other term(s) (king size silk sheet set, king size silk sheet sets, king silk sheets set) — they follow the campaign's top-of-search setting</w:t>
             </w:r>
           </w:p>
         </w:tc>
@@ -11578,7 +10846,7 @@
                 <w:sz w:val="16"/>
                 <w:szCs w:val="16"/>
               </w:rPr>
-              <w:t xml:space="preserve">Back-up child: If SATIN-KING-BLACK-6-PCS drops under 14 days of stock (or goes out of stock): enable SATIN-CHAMPAGNE-KING-6PCS, pause SATIN-KING-BLACK-6-PCS and set this campaign to maintain level (the back-up cannot carry the push). Switch</w:t>
+              <w:t xml:space="preserve">Back-up child: If SATIN-KING-BLACK-6-PCS drops under 14 days of stock (or goes out of stock): enable SATIN-CHAMPAGNE-KING-6PCS, pause SATIN-KING-BLACK-6-PCS and set this campaign to maintain level (the back-up cannot carry the push). Switch back when SATIN-KING-BLACK-6-PCS has ≥30 days of stock. | Top-of-search only: modifier 900%, base bid $0.17 (top-of-search price $1.7, = today's effective top-of-search bid (bid × top-of-search modifier) — kept, never lowered on a ranking term); rest of search and product pages 0% → those placements drop to the $0.17 base | Budget $20/day (needs $6/day = the daily click target 2.8 × top-of-search CPC, +20% headroom; never lowered on a ranking campaign) (today 4.1 paid clicks/day on king silk sheet set, king size silk sheets set) | Also buys 3 other term(s) (king size silk sheet set, king size silk sheet sets, king silk sheets set) — they follow the campaign's top-of-search setting</w:t>
             </w:r>
           </w:p>
         </w:tc>
@@ -11751,7 +11019,7 @@
                 <w:sz w:val="16"/>
                 <w:szCs w:val="16"/>
               </w:rPr>
-              <w:t xml:space="preserve">Back-up child: If SATIN-KING-BLACK-6-PCS drops under 14 days of stock (or goes out of stock): enable SATIN-CHAMPAGNE-KING-6PCS, pause SATIN-KING-BLACK-6-PCS and set this campaign to maintain level (the back-up cannot carry the push). Switch</w:t>
+              <w:t xml:space="preserve">Back-up child: If SATIN-KING-BLACK-6-PCS drops under 14 days of stock (or goes out of stock): enable SATIN-CHAMPAGNE-KING-6PCS, pause SATIN-KING-BLACK-6-PCS and set this campaign to maintain level (the back-up cannot carry the push). Switch back when SATIN-KING-BLACK-6-PCS has ≥30 days of stock. | Top-of-search only: modifier 900%, base bid $0.17 (top-of-search price $1.7, = today's effective top-of-search bid (bid × top-of-search modifier) — kept, never lowered on a ranking term); rest of search and product pages 0% → those placements drop to the $0.17 base | Budget $20/day (needs $6/day = the daily click target 2.8 × top-of-search CPC, +20% headroom; never lowered on a ranking campaign) (today 4.1 paid clicks/day on king silk sheet set, king size silk sheets set) | Also buys 3 other term(s) (king size silk sheet set, king size silk sheet sets, king silk sheets set) — they follow the campaign's top-of-search setting</w:t>
             </w:r>
           </w:p>
         </w:tc>
@@ -11924,7 +11192,7 @@
                 <w:sz w:val="16"/>
                 <w:szCs w:val="16"/>
               </w:rPr>
-              <w:t xml:space="preserve">Not a ranking term (outside 95% of market purchases or unranked). ACoS 66.6% vs break-even 19.5% on 8 orders (30 days): one −15% step, re-read after 7 days, stop stepping if organic rank slips ≥3 places | Top-of-search clicks only (all exac</w:t>
+              <w:t xml:space="preserve">Not a ranking term (outside 95% of market purchases or unranked). ACoS 66.6% vs break-even 19.5% on 8 orders (30 days): one −15% step, re-read after 7 days, stop stepping if the 7-day median organic rank worsens by more than 3 places (2 × the term's normal weekly move) | Top-of-search clicks only (all exact campaigns): modifier 900%, base = top-of-search price ÷ 10, rest of search and product pages 0%; top-of-search price = today's effective top-of-search bid −15% (the step above)</w:t>
             </w:r>
           </w:p>
         </w:tc>
@@ -12097,7 +11365,7 @@
                 <w:sz w:val="16"/>
                 <w:szCs w:val="16"/>
               </w:rPr>
-              <w:t xml:space="preserve">Advertises SATIN-RED-KING-6PCS; the King ranking child is SATIN-KING-BLACK-6-PCS (highest profit per top-of-search click among proven sellers (≥10% of the size) with ≥60 days of stock at push pace). Add the SATIN-KING-BLACK-6-PCS product ad</w:t>
+              <w:t xml:space="preserve">Advertises SATIN-RED-KING-6PCS; the King ranking child is SATIN-KING-BLACK-6-PCS (highest profit per top-of-search click among proven sellers (≥10% of the size) with ≥60 days of stock at push pace). Add the SATIN-KING-BLACK-6-PCS product ad, pause SATIN-RED-KING-6PCS | Back-up child: If SATIN-KING-BLACK-6-PCS drops under 14 days of stock (or goes out of stock): enable SATIN-CHAMPAGNE-KING-6PCS, pause SATIN-KING-BLACK-6-PCS and set this campaign to maintain level (the back-up cannot carry the push). Switch back when SATIN-KING-BLACK-6-PCS has ≥30 days of stock. | Top-of-search only: modifier 900%, base bid $0.28 (top-of-search price $2.8, = the campaign's own 90-day top-of-search CPC (today's is lower and buys almost no top-of-search share)); rest of search and product pages 0% → those placements drop to the $0.28 base | Budget $40/day (needs $9/day = the daily click target 2.5 × top-of-search CPC, +20% headroom; never lowered on a ranking campaign) (today 2.2 paid clicks/day on satin sheets king)</w:t>
             </w:r>
           </w:p>
         </w:tc>
@@ -12270,7 +11538,7 @@
                 <w:sz w:val="16"/>
                 <w:szCs w:val="16"/>
               </w:rPr>
-              <w:t xml:space="preserve">Advertises SATIN-RED-KING-6PCS; the King ranking child is SATIN-KING-BLACK-6-PCS (highest profit per top-of-search click among proven sellers (≥10% of the size) with ≥60 days of stock at push pace). Add the SATIN-KING-BLACK-6-PCS product ad</w:t>
+              <w:t xml:space="preserve">Advertises SATIN-RED-KING-6PCS; the King ranking child is SATIN-KING-BLACK-6-PCS (highest profit per top-of-search click among proven sellers (≥10% of the size) with ≥60 days of stock at push pace). Add the SATIN-KING-BLACK-6-PCS product ad, pause SATIN-RED-KING-6PCS | Back-up child: If SATIN-KING-BLACK-6-PCS drops under 14 days of stock (or goes out of stock): enable SATIN-CHAMPAGNE-KING-6PCS, pause SATIN-KING-BLACK-6-PCS and set this campaign to maintain level (the back-up cannot carry the push). Switch back when SATIN-KING-BLACK-6-PCS has ≥30 days of stock. | Top-of-search only: modifier 900%, base bid $0.28 (top-of-search price $2.8, = the campaign's own 90-day top-of-search CPC (today's is lower and buys almost no top-of-search share)); rest of search and product pages 0% → those placements drop to the $0.28 base | Budget $40/day (needs $9/day = the daily click target 2.5 × top-of-search CPC, +20% headroom; never lowered on a ranking campaign) (today 2.2 paid clicks/day on satin sheets king)</w:t>
             </w:r>
           </w:p>
         </w:tc>
@@ -12443,7 +11711,7 @@
                 <w:sz w:val="16"/>
                 <w:szCs w:val="16"/>
               </w:rPr>
-              <w:t xml:space="preserve">Advertises SATIN-RED-KING-6PCS; the King ranking child is SATIN-KING-BLACK-6-PCS (highest profit per top-of-search click among proven sellers (≥10% of the size) with ≥60 days of stock at push pace). Add the SATIN-KING-BLACK-6-PCS product ad</w:t>
+              <w:t xml:space="preserve">Advertises SATIN-RED-KING-6PCS; the King ranking child is SATIN-KING-BLACK-6-PCS (highest profit per top-of-search click among proven sellers (≥10% of the size) with ≥60 days of stock at push pace). Add the SATIN-KING-BLACK-6-PCS product ad, pause SATIN-RED-KING-6PCS | Back-up child: If SATIN-KING-BLACK-6-PCS drops under 14 days of stock (or goes out of stock): enable SATIN-CHAMPAGNE-KING-6PCS, pause SATIN-KING-BLACK-6-PCS and set this campaign to maintain level (the back-up cannot carry the push). Switch back when SATIN-KING-BLACK-6-PCS has ≥30 days of stock. | Top-of-search only: modifier 900%, base bid $0.28 (top-of-search price $2.8, = the campaign's own 90-day top-of-search CPC (today's is lower and buys almost no top-of-search share)); rest of search and product pages 0% → those placements drop to the $0.28 base | Budget $40/day (needs $9/day = the daily click target 2.5 × top-of-search CPC, +20% headroom; never lowered on a ranking campaign) (today 2.2 paid clicks/day on satin sheets king)</w:t>
             </w:r>
           </w:p>
         </w:tc>
@@ -12616,7 +11884,7 @@
                 <w:sz w:val="16"/>
                 <w:szCs w:val="16"/>
               </w:rPr>
-              <w:t xml:space="preserve">Back-up child: If SATIN-QUEEN-BLACK-6-PCS drops under 14 days of stock (or goes out of stock): enable SATIN-SEA-TEAL-QUEEN-6PCS, pause SATIN-QUEEN-BLACK-6-PCS. Switch back when SATIN-QUEEN-BLACK-6-PCS has ≥30 days of stock. Second back-up: </w:t>
+              <w:t xml:space="preserve">Back-up child: If SATIN-QUEEN-BLACK-6-PCS drops under 14 days of stock (or goes out of stock): enable SATIN-RED-QUEEN-6PCS, pause SATIN-QUEEN-BLACK-6-PCS. Switch back when SATIN-QUEEN-BLACK-6-PCS has ≥30 days of stock. | Top-of-search only: modifier 900%, base bid $0.37 (top-of-search price $3.7, = today's effective top-of-search bid (bid × top-of-search modifier) — kept, never lowered on a ranking term); rest of search and product pages 0% → those placements drop to the $0.37 base | Budget $20/day (needs $5.0/day = the daily click target 0.8 × top-of-search CPC, +20% headroom; never lowered on a ranking campaign) (today 0.8 paid clicks/day on queen silk sheets set, queen size silk sheets set) | Also buys 2 other term(s) (queen silk sheet set, queen size silk sheet set) — they follow the campaign's top-of-search setting</w:t>
             </w:r>
           </w:p>
         </w:tc>
@@ -12789,7 +12057,7 @@
                 <w:sz w:val="16"/>
                 <w:szCs w:val="16"/>
               </w:rPr>
-              <w:t xml:space="preserve">Back-up child: If SATIN-QUEEN-BLACK-6-PCS drops under 14 days of stock (or goes out of stock): enable SATIN-SEA-TEAL-QUEEN-6PCS, pause SATIN-QUEEN-BLACK-6-PCS. Switch back when SATIN-QUEEN-BLACK-6-PCS has ≥30 days of stock. Second back-up: </w:t>
+              <w:t xml:space="preserve">Back-up child: If SATIN-QUEEN-BLACK-6-PCS drops under 14 days of stock (or goes out of stock): enable SATIN-RED-QUEEN-6PCS, pause SATIN-QUEEN-BLACK-6-PCS. Switch back when SATIN-QUEEN-BLACK-6-PCS has ≥30 days of stock. | Top-of-search only: modifier 900%, base bid $0.37 (top-of-search price $3.7, = today's effective top-of-search bid (bid × top-of-search modifier) — kept, never lowered on a ranking term); rest of search and product pages 0% → those placements drop to the $0.37 base | Budget $20/day (needs $5.0/day = the daily click target 0.8 × top-of-search CPC, +20% headroom; never lowered on a ranking campaign) (today 0.8 paid clicks/day on queen silk sheets set, queen size silk sheets set) | Also buys 2 other term(s) (queen silk sheet set, queen size silk sheet set) — they follow the campaign's top-of-search setting</w:t>
             </w:r>
           </w:p>
         </w:tc>
@@ -12962,7 +12230,7 @@
                 <w:sz w:val="16"/>
                 <w:szCs w:val="16"/>
               </w:rPr>
-              <w:t xml:space="preserve">Back-up child: If SATIN-QUEEN-BLACK-6-PCS drops under 14 days of stock (or goes out of stock): enable SATIN-SEA-TEAL-QUEEN-6PCS, pause SATIN-QUEEN-BLACK-6-PCS. Switch back when SATIN-QUEEN-BLACK-6-PCS has ≥30 days of stock. Second back-up: </w:t>
+              <w:t xml:space="preserve">Back-up child: If SATIN-QUEEN-BLACK-6-PCS drops under 14 days of stock (or goes out of stock): enable SATIN-RED-QUEEN-6PCS, pause SATIN-QUEEN-BLACK-6-PCS. Switch back when SATIN-QUEEN-BLACK-6-PCS has ≥30 days of stock. | Top-of-search only: modifier 900%, base bid $0.37 (top-of-search price $3.7, = today's effective top-of-search bid (bid × top-of-search modifier) — kept, never lowered on a ranking term); rest of search and product pages 0% → those placements drop to the $0.37 base | Budget $20/day (needs $5.0/day = the daily click target 0.8 × top-of-search CPC, +20% headroom; never lowered on a ranking campaign) (today 0.8 paid clicks/day on queen silk sheets set, queen size silk sheets set) | Also buys 2 other term(s) (queen silk sheet set, queen size silk sheet set) — they follow the campaign's top-of-search setting</w:t>
             </w:r>
           </w:p>
         </w:tc>
@@ -13135,7 +12403,7 @@
                 <w:sz w:val="16"/>
                 <w:szCs w:val="16"/>
               </w:rPr>
-              <w:t xml:space="preserve">Not a ranking term (outside 95% of market purchases or unranked). ACoS 50.9% vs break-even 25.9% on 3 orders (30 days): one −15% step, re-read after 7 days, stop stepping if organic rank slips ≥3 places | Top-of-search clicks only (all exac</w:t>
+              <w:t xml:space="preserve">Not a ranking term (outside 95% of market purchases or unranked). ACoS 50.9% vs break-even 25.9% on 3 orders (30 days): one −15% step, re-read after 7 days, stop stepping if the 7-day median organic rank worsens by more than 3 places (2 × the term's normal weekly move) | Top-of-search clicks only (all exact campaigns): modifier 900%, base = top-of-search price ÷ 10, rest of search and product pages 0%; top-of-search price = today's effective top-of-search bid −15% (the step above)</w:t>
             </w:r>
           </w:p>
         </w:tc>
@@ -13308,7 +12576,7 @@
                 <w:sz w:val="16"/>
                 <w:szCs w:val="16"/>
               </w:rPr>
-              <w:t xml:space="preserve">Not a ranking term (outside 95% of market purchases or unranked). ACoS 50.9% vs break-even 25.9% on 3 orders (30 days): one −15% step, re-read after 7 days, stop stepping if organic rank slips ≥3 places | Top-of-search clicks only (all exac</w:t>
+              <w:t xml:space="preserve">Not a ranking term (outside 95% of market purchases or unranked). ACoS 50.9% vs break-even 25.9% on 3 orders (30 days): one −15% step, re-read after 7 days, stop stepping if the 7-day median organic rank worsens by more than 3 places (2 × the term's normal weekly move) | Top-of-search clicks only (all exact campaigns): modifier 900%, base = top-of-search price ÷ 10, rest of search and product pages 0%; top-of-search price = today's effective top-of-search bid −15% (the step above)</w:t>
             </w:r>
           </w:p>
         </w:tc>
@@ -13481,7 +12749,7 @@
                 <w:sz w:val="16"/>
                 <w:szCs w:val="16"/>
               </w:rPr>
-              <w:t xml:space="preserve">Not a ranking term (outside 95% of market purchases or unranked). ACoS 50.9% vs break-even 25.9% on 3 orders (30 days): one −15% step, re-read after 7 days, stop stepping if organic rank slips ≥3 places | Top-of-search clicks only (all exac</w:t>
+              <w:t xml:space="preserve">Not a ranking term (outside 95% of market purchases or unranked). ACoS 50.9% vs break-even 25.9% on 3 orders (30 days): one −15% step, re-read after 7 days, stop stepping if the 7-day median organic rank worsens by more than 3 places (2 × the term's normal weekly move) | Top-of-search clicks only (all exact campaigns): modifier 900%, base = top-of-search price ÷ 10, rest of search and product pages 0%; top-of-search price = today's effective top-of-search bid −15% (the step above)</w:t>
             </w:r>
           </w:p>
         </w:tc>
@@ -13654,7 +12922,7 @@
                 <w:sz w:val="16"/>
                 <w:szCs w:val="16"/>
               </w:rPr>
-              <w:t xml:space="preserve">Not a ranking term (outside 95% of market purchases or unranked). ACoS 58.3% vs break-even 9.0% on 5 orders (90 days): one −15% step, re-read after 7 days, stop stepping if organic rank slips ≥3 places | Move off SATIN-QUEEN-BLACK-6-PCS (Qu</w:t>
+              <w:t xml:space="preserve">Not a ranking term (outside 95% of market purchases or unranked). ACoS 58.3% vs break-even 9.0% on 5 orders (90 days): one −15% step, re-read after 7 days, stop stepping if the 7-day median organic rank worsens by more than 8 places (2 × the term's normal weekly move) | Top-of-search clicks only (all exact campaigns): modifier 900%, base = top-of-search price ÷ 10, rest of search and product pages 0%; top-of-search price = today's effective top-of-search bid −15% (the step above)</w:t>
             </w:r>
           </w:p>
         </w:tc>
@@ -13679,7 +12947,7 @@
         <w:spacing w:after="120"/>
       </w:pPr>
       <w:r>
-        <w:t xml:space="preserve">All 386 campaign IDs found in any source were checked: the audit export, Command Center (30 and 90 days, with placements), Sellerboard (live budget, utilisation, top-of-search share and bids) and Data Dive (the ASINs each campaign advertises). 357 are enabled. 165 advertise a different child from the one their name says; the actual child is used throughout. 12 advertise other products (4-piece LTSF, fitted sheet, bamboo) and are left to those audits. Roles: Long-tail exact (non-ranking) 148; Discovery / LTSF clearance 109; Colour exact 37; Ranking – push 18; Ranking – maintain 17; Other product (out of scope) 12; Sponsored Brands 9; Brand / listing defence 9; Off-core exact 8; Duplicate of a ranking owner 5; Sponsored Display 5; Sponsored Brands video 4; Product targeting 4; Colour exact (LTSF) 1.</w:t>
+        <w:t xml:space="preserve">All 386 campaign IDs found in any source were checked: the audit export, Command Center (30 and 90 days, with placements), Sellerboard (live budget, utilisation, top-of-search share and bids) and Data Dive (the ASINs each campaign advertises). 357 are enabled. 165 advertise a different child from the one their name says; the actual child is used throughout. 12 advertise other products (4-piece LTSF, fitted sheet, bamboo) and are left to those audits. Roles: Long-tail exact (non-ranking) 148; Discovery / LTSF clearance 109; Colour exact 37; Ranking – maintain 20; Ranking – push 15; Other product (out of scope) 12; Sponsored Brands 9; Brand / listing defence 9; Off-core exact 8; Duplicate of a ranking owner 5; Sponsored Display 5; Sponsored Brands video 4; Product targeting 4; Colour exact (LTSF) 1.</w:t>
       </w:r>
     </w:p>
     <w:p>
@@ -13687,7 +12955,7 @@
         <w:spacing w:after="120"/>
       </w:pPr>
       <w:r>
-        <w:t xml:space="preserve">Spend and click share. Today: ranking 19% of spend, 9% of clicks. Plan: 48% of spend ($88 of $182/day) and 26% of clicks; with LTSF clearance and brand defence ring-fenced, ranking is 78% of the remaining keyword spend. Reaching 80% of ALL spend needs non-ranking at $22/day, which would stop the LTSF clearance — left as an owner decision. Discovery clicks are cheap, so click share trails spend share.</w:t>
+        <w:t xml:space="preserve">Spend and click share. Today: ranking 19% of spend, 9% of clicks. Plan: 51% of spend ($95 of $186/day) and 29% of clicks; with LTSF clearance and brand defence ring-fenced, ranking is 78% of the remaining keyword spend. Reaching 80% of ALL spend needs non-ranking at $24/day, which would stop the LTSF clearance — left as an owner decision. Discovery clicks are cheap, so click share trails spend share.</w:t>
       </w:r>
     </w:p>
     <w:tbl>
@@ -14007,7 +13275,7 @@
                 <w:sz w:val="16"/>
                 <w:szCs w:val="16"/>
               </w:rPr>
-              <w:t xml:space="preserve">$12</w:t>
+              <w:t xml:space="preserve">$13</w:t>
             </w:r>
           </w:p>
         </w:tc>
@@ -14063,7 +13331,7 @@
                 <w:sz w:val="16"/>
                 <w:szCs w:val="16"/>
               </w:rPr>
-              <w:t xml:space="preserve">0.6</w:t>
+              <w:t xml:space="preserve">0.9</w:t>
             </w:r>
           </w:p>
         </w:tc>
@@ -14180,7 +13448,7 @@
                 <w:sz w:val="16"/>
                 <w:szCs w:val="16"/>
               </w:rPr>
-              <w:t xml:space="preserve">$45</w:t>
+              <w:t xml:space="preserve">$40</w:t>
             </w:r>
           </w:p>
         </w:tc>
@@ -14236,7 +13504,7 @@
                 <w:sz w:val="16"/>
                 <w:szCs w:val="16"/>
               </w:rPr>
-              <w:t xml:space="preserve">5.9</w:t>
+              <w:t xml:space="preserve">5.3</w:t>
             </w:r>
           </w:p>
         </w:tc>
@@ -14353,7 +13621,7 @@
                 <w:sz w:val="16"/>
                 <w:szCs w:val="16"/>
               </w:rPr>
-              <w:t xml:space="preserve">$4</w:t>
+              <w:t xml:space="preserve">$5</w:t>
             </w:r>
           </w:p>
         </w:tc>
@@ -14409,7 +13677,7 @@
                 <w:sz w:val="16"/>
                 <w:szCs w:val="16"/>
               </w:rPr>
-              <w:t xml:space="preserve">0.3</w:t>
+              <w:t xml:space="preserve">0.5</w:t>
             </w:r>
           </w:p>
         </w:tc>
@@ -14442,7 +13710,7 @@
                 <w:sz w:val="16"/>
                 <w:szCs w:val="16"/>
               </w:rPr>
-              <w:t xml:space="preserve">Ranking – push</w:t>
+              <w:t xml:space="preserve">Ranking – maintain</w:t>
             </w:r>
           </w:p>
         </w:tc>
@@ -14470,7 +13738,7 @@
                 <w:sz w:val="16"/>
                 <w:szCs w:val="16"/>
               </w:rPr>
-              <w:t xml:space="preserve">18</w:t>
+              <w:t xml:space="preserve">20</w:t>
             </w:r>
           </w:p>
         </w:tc>
@@ -14498,7 +13766,7 @@
                 <w:sz w:val="16"/>
                 <w:szCs w:val="16"/>
               </w:rPr>
-              <w:t xml:space="preserve">$6</w:t>
+              <w:t xml:space="preserve">$19</w:t>
             </w:r>
           </w:p>
         </w:tc>
@@ -14526,7 +13794,7 @@
                 <w:sz w:val="16"/>
                 <w:szCs w:val="16"/>
               </w:rPr>
-              <w:t xml:space="preserve">$60</w:t>
+              <w:t xml:space="preserve">$21</w:t>
             </w:r>
           </w:p>
         </w:tc>
@@ -14554,7 +13822,7 @@
                 <w:sz w:val="16"/>
                 <w:szCs w:val="16"/>
               </w:rPr>
-              <w:t xml:space="preserve">0.8</w:t>
+              <w:t xml:space="preserve">1.3</w:t>
             </w:r>
           </w:p>
         </w:tc>
@@ -14582,7 +13850,7 @@
                 <w:sz w:val="16"/>
                 <w:szCs w:val="16"/>
               </w:rPr>
-              <w:t xml:space="preserve">4.8</w:t>
+              <w:t xml:space="preserve">1.6</w:t>
             </w:r>
           </w:p>
         </w:tc>
@@ -14615,7 +13883,7 @@
                 <w:sz w:val="16"/>
                 <w:szCs w:val="16"/>
               </w:rPr>
-              <w:t xml:space="preserve">Ranking – maintain</w:t>
+              <w:t xml:space="preserve">Ranking – push</w:t>
             </w:r>
           </w:p>
         </w:tc>
@@ -14643,7 +13911,7 @@
                 <w:sz w:val="16"/>
                 <w:szCs w:val="16"/>
               </w:rPr>
-              <w:t xml:space="preserve">17</w:t>
+              <w:t xml:space="preserve">15</w:t>
             </w:r>
           </w:p>
         </w:tc>
@@ -14671,7 +13939,7 @@
                 <w:sz w:val="16"/>
                 <w:szCs w:val="16"/>
               </w:rPr>
-              <w:t xml:space="preserve">$18</w:t>
+              <w:t xml:space="preserve">$5</w:t>
             </w:r>
           </w:p>
         </w:tc>
@@ -14699,7 +13967,7 @@
                 <w:sz w:val="16"/>
                 <w:szCs w:val="16"/>
               </w:rPr>
-              <w:t xml:space="preserve">$28</w:t>
+              <w:t xml:space="preserve">$74</w:t>
             </w:r>
           </w:p>
         </w:tc>
@@ -14727,7 +13995,7 @@
                 <w:sz w:val="16"/>
                 <w:szCs w:val="16"/>
               </w:rPr>
-              <w:t xml:space="preserve">1.3</w:t>
+              <w:t xml:space="preserve">0.8</w:t>
             </w:r>
           </w:p>
         </w:tc>
@@ -14755,7 +14023,7 @@
                 <w:sz w:val="16"/>
                 <w:szCs w:val="16"/>
               </w:rPr>
-              <w:t xml:space="preserve">1.9</w:t>
+              <w:t xml:space="preserve">5.7</w:t>
             </w:r>
           </w:p>
         </w:tc>
@@ -15818,7 +15086,7 @@
         <w:spacing w:after="120"/>
       </w:pPr>
       <w:r>
-        <w:t xml:space="preserve">How it is set: modifier 900% (the maximum), base bid = top-of-search price ÷ 10, rest of search and product pages 0%, bidding "Dynamic bids - down only". Rest of search and product pages then see only the small base bid, so nearly all clicks come from the top row. Ranking terms: the top-of-search bid is never set below today's effective top-of-search bid (bid × current modifier) — a CPC is the price a winning bid paid, so bidding at the CPC would lose auctions we win today. Pushed terms: the higher of today's bid, today's top-of-search CPC and the campaign's own 90-day top-of-search CPC; base bids round up to the cent. Held terms and other exact campaigns keep today's effective top-of-search bid (less the −15% step where one applies). Where a pushed campaign still buys fewer clicks than its target with budget left, raise the top-of-search price 10% a week.</w:t>
+        <w:t xml:space="preserve">How it is set: modifier 900% (the maximum), base bid = top-of-search price ÷ 10, rest of search and product pages 0%, bidding "Dynamic bids - down only". Rest of search and product pages then see only the small base bid, so nearly all clicks come from the top row. Ranking terms: the top-of-search bid is never set below today's effective top-of-search bid (bid × current modifier) — a CPC is the price a winning bid paid, so bidding at the CPC would lose auctions we win today. Pushed terms: the highest of today's bid, the term's top-of-search CPC and the campaign's own 90-day top-of-search CPC; base bids round up to the cent. Held and trial terms keep each term's own effective top-of-search bid — no raise. Budgets on ranking campaigns are never lowered. Where a pushed campaign still buys fewer clicks than its target with budget left, raise the top-of-search price 10% a week.</w:t>
       </w:r>
     </w:p>
     <w:p>
@@ -15826,7 +15094,7 @@
         <w:spacing w:after="120"/>
       </w:pPr>
       <w:r>
-        <w:t xml:space="preserve">217 of the 222 enabled exact campaigns go top-of-search only. The one exception allowed is a campaign whose own 90-day data shows top of search converting significantly worse (both sides ≥20 clicks, 95% test). None meets it. 5 enabled exact campaigns have no clicks in 90 days and no bid in any source, so there is nothing to price; set them the same way when next edited. Second-order effect: non-ranking exact campaigns lose their rest-of-search and product-page clicks; the plan counts only their top-of-search clicks at top-of-search conversion.</w:t>
+        <w:t xml:space="preserve">35 ranking exact campaigns go top-of-search only now (step 3). Other exact campaigns change only where their own data supports it: 14 have at least 20 top-of-search clicks in 90 days and go top-of-search only after 7 Oct (step 7). The other 173 enabled exact campaigns have too little placement data (many had no clicks in 30 days) and are left as they are; revisit after 7 Oct. Second-order effect: those non-ranking exact campaigns lose their rest-of-search and product-page clicks; the plan counts only their top-of-search clicks at top-of-search conversion.</w:t>
       </w:r>
     </w:p>
     <w:p>
@@ -15843,7 +15111,7 @@
         <w:spacing w:after="120"/>
       </w:pPr>
       <w:r>
-        <w:t xml:space="preserve">Rule, from this product's data: among children selling at least 10% of the size's units, the one with the most profit per top-of-search click (profit before ads per unit × top-of-search conversion), among those with at least 60 days of stock at the pace the ranking traffic adds.</w:t>
+        <w:t xml:space="preserve">Rule, from this product's data: among children selling at least 10% of the size's units, the one with the most profit per top-of-search click (profit before ads per unit × top-of-search conversion), among those with at least 60 days of stock at the pace the ranking traffic adds (before the Q4 seasonal lift; the stock-out dates below include the lift and the October deal days, and are the ones to plan on).</w:t>
       </w:r>
     </w:p>
     <w:tbl>
@@ -15956,7 +15224,7 @@
                 <w:sz w:val="16"/>
                 <w:szCs w:val="16"/>
               </w:rPr>
-              <w:t xml:space="preserve">Days at push pace</w:t>
+              <w:t xml:space="preserve">Stock-out at plan pace</w:t>
             </w:r>
           </w:p>
         </w:tc>
@@ -16135,7 +15403,7 @@
                 <w:sz w:val="16"/>
                 <w:szCs w:val="16"/>
               </w:rPr>
-              <w:t xml:space="preserve">139</w:t>
+              <w:t xml:space="preserve">2026-11-21</w:t>
             </w:r>
           </w:p>
         </w:tc>
@@ -16219,7 +15487,7 @@
                 <w:sz w:val="16"/>
                 <w:szCs w:val="16"/>
               </w:rPr>
-              <w:t xml:space="preserve">Sea Teal Queen (push) → Rosewood Queen (push)</w:t>
+              <w:t xml:space="preserve">Red Queen (push (small seller, estimate))</w:t>
             </w:r>
           </w:p>
         </w:tc>
@@ -16308,7 +15576,7 @@
                 <w:sz w:val="16"/>
                 <w:szCs w:val="16"/>
               </w:rPr>
-              <w:t xml:space="preserve">145</w:t>
+              <w:t xml:space="preserve">after 31 Jan</w:t>
             </w:r>
           </w:p>
         </w:tc>
@@ -16481,7 +15749,7 @@
                 <w:sz w:val="16"/>
                 <w:szCs w:val="16"/>
               </w:rPr>
-              <w:t xml:space="preserve">132</w:t>
+              <w:t xml:space="preserve">2026-12-30</w:t>
             </w:r>
           </w:p>
         </w:tc>
@@ -16654,7 +15922,7 @@
                 <w:sz w:val="16"/>
                 <w:szCs w:val="16"/>
               </w:rPr>
-              <w:t xml:space="preserve">150</w:t>
+              <w:t xml:space="preserve">after 31 Jan</w:t>
             </w:r>
           </w:p>
         </w:tc>
@@ -16738,7 +16006,7 @@
                 <w:sz w:val="16"/>
                 <w:szCs w:val="16"/>
               </w:rPr>
-              <w:t xml:space="preserve">Sea Teal Twin (push) → Twin Purple (push)</w:t>
+              <w:t xml:space="preserve">Twin Purple (push)</w:t>
             </w:r>
           </w:p>
         </w:tc>
@@ -16754,7 +16022,15 @@
         <w:spacing w:after="120"/>
       </w:pPr>
       <w:r>
-        <w:t xml:space="preserve">Every ranking campaign carries the back-up product ad, loaded PAUSED. When the preferred child falls under 14 days of stock or goes out, enable the back-up and pause the preferred; switch back at 30 days or more. Back-up rule: another child with positive profit per top-of-search click and at least 5% of the size's units (3% if none, flagged as an estimate); 60+ days at push pace can carry the push, 30–59 days the maintain level only.</w:t>
+        <w:t xml:space="preserve">Every ranking campaign carries the back-up product ad, loaded PAUSED. When the preferred child falls under 14 days of stock or goes out, enable the back-up and pause the preferred; switch back at 30 days or more. Back-up rule: another child with positive profit per top-of-search click, at least 5% of the size's units (3% if none, flagged as an estimate), and its own unit-session % at least half the preferred child's on both 30 and 90 days; 60+ days at push pace can carry the push, 30–59 days the maintain level only. Rejected on their own conversion (30 / 90-day unit-session %): Rosewood Queen (Queen, 4.91% / 5.14%); Sea Teal Queen (Queen, 2.04% / 3.84%); Stripe King Purple (King, — / 4.21%); Sea Teal Full (Full, 1.18% / 2.42%); Full Purple (Full, 6.19% / 4.36%); Full Baby Blue (Full, 4.72% / 3.66%); Full Grey (Full, 3.45% / 4.34%); Sea Teal Twin (Twin, 4.88% / 3.84%); Rosewood Twin (Twin, 4.3% / 4.55%); Twin Blue (Twin, 2.27% / 4.24%); Twin Pink (Twin, 3.45% / 4.15%). No Twin term has a ranking campaign after the plan (the two generic Black campaigns now on Twin Black move to Queen Black), so the Twin back-up applies only if a Twin ranking campaign is added.</w:t>
+      </w:r>
+    </w:p>
+    <w:p>
+      <w:pPr>
+        <w:spacing w:after="120"/>
+      </w:pPr>
+      <w:r>
+        <w:t xml:space="preserve">Queen: 11 Queen ranking campaigns advertise Stone Grey Queen today (106 sellable, 8 units in 30 days). They move to Queen Black, the preferred child. That takes the ranking traffic off Stone Grey Queen; its sales from those campaigns go with it.</w:t>
       </w:r>
     </w:p>
     <w:tbl>
@@ -17046,7 +16322,7 @@
                 <w:sz w:val="16"/>
                 <w:szCs w:val="16"/>
               </w:rPr>
-              <w:t xml:space="preserve">#1 Sea Teal Queen</w:t>
+              <w:t xml:space="preserve">#1 Red Queen</w:t>
             </w:r>
           </w:p>
         </w:tc>
@@ -17074,7 +16350,7 @@
                 <w:sz w:val="16"/>
                 <w:szCs w:val="16"/>
               </w:rPr>
-              <w:t xml:space="preserve">push</w:t>
+              <w:t xml:space="preserve">push (small seller, estimate)</w:t>
             </w:r>
           </w:p>
         </w:tc>
@@ -17102,7 +16378,7 @@
                 <w:sz w:val="16"/>
                 <w:szCs w:val="16"/>
               </w:rPr>
-              <w:t xml:space="preserve">2026-11-18</w:t>
+              <w:t xml:space="preserve">2026-11-09</w:t>
             </w:r>
           </w:p>
         </w:tc>
@@ -17130,7 +16406,7 @@
                 <w:sz w:val="16"/>
                 <w:szCs w:val="16"/>
               </w:rPr>
-              <w:t xml:space="preserve">2027-01-13</w:t>
+              <w:t xml:space="preserve">2026-11-30</w:t>
             </w:r>
           </w:p>
         </w:tc>
@@ -17163,7 +16439,7 @@
                 <w:sz w:val="16"/>
                 <w:szCs w:val="16"/>
               </w:rPr>
-              <w:t xml:space="preserve">Queen</w:t>
+              <w:t xml:space="preserve">King</w:t>
             </w:r>
           </w:p>
         </w:tc>
@@ -17191,7 +16467,7 @@
                 <w:sz w:val="16"/>
                 <w:szCs w:val="16"/>
               </w:rPr>
-              <w:t xml:space="preserve">Queen Black</w:t>
+              <w:t xml:space="preserve">King Black</w:t>
             </w:r>
           </w:p>
         </w:tc>
@@ -17219,7 +16495,7 @@
                 <w:sz w:val="16"/>
                 <w:szCs w:val="16"/>
               </w:rPr>
-              <w:t xml:space="preserve">#2 Rosewood Queen</w:t>
+              <w:t xml:space="preserve">#1 Champagne King</w:t>
             </w:r>
           </w:p>
         </w:tc>
@@ -17247,7 +16523,7 @@
                 <w:sz w:val="16"/>
                 <w:szCs w:val="16"/>
               </w:rPr>
-              <w:t xml:space="preserve">push</w:t>
+              <w:t xml:space="preserve">maintain only (small seller, estimate)</w:t>
             </w:r>
           </w:p>
         </w:tc>
@@ -17275,7 +16551,7 @@
                 <w:sz w:val="16"/>
                 <w:szCs w:val="16"/>
               </w:rPr>
-              <w:t xml:space="preserve">2027-01-13</w:t>
+              <w:t xml:space="preserve">not before 31 Jan</w:t>
             </w:r>
           </w:p>
         </w:tc>
@@ -17336,7 +16612,7 @@
                 <w:sz w:val="16"/>
                 <w:szCs w:val="16"/>
               </w:rPr>
-              <w:t xml:space="preserve">King</w:t>
+              <w:t xml:space="preserve">Full</w:t>
             </w:r>
           </w:p>
         </w:tc>
@@ -17364,7 +16640,7 @@
                 <w:sz w:val="16"/>
                 <w:szCs w:val="16"/>
               </w:rPr>
-              <w:t xml:space="preserve">King Black</w:t>
+              <w:t xml:space="preserve">Full Black</w:t>
             </w:r>
           </w:p>
         </w:tc>
@@ -17392,7 +16668,7 @@
                 <w:sz w:val="16"/>
                 <w:szCs w:val="16"/>
               </w:rPr>
-              <w:t xml:space="preserve">#1 Champagne King</w:t>
+              <w:t xml:space="preserve">#1 Full White</w:t>
             </w:r>
           </w:p>
         </w:tc>
@@ -17420,7 +16696,7 @@
                 <w:sz w:val="16"/>
                 <w:szCs w:val="16"/>
               </w:rPr>
-              <w:t xml:space="preserve">maintain only (small seller, estimate)</w:t>
+              <w:t xml:space="preserve">push (small seller, estimate)</w:t>
             </w:r>
           </w:p>
         </w:tc>
@@ -17448,7 +16724,7 @@
                 <w:sz w:val="16"/>
                 <w:szCs w:val="16"/>
               </w:rPr>
-              <w:t xml:space="preserve">not before 31 Jan</w:t>
+              <w:t xml:space="preserve">2026-12-18</w:t>
             </w:r>
           </w:p>
         </w:tc>
@@ -17509,7 +16785,7 @@
                 <w:sz w:val="16"/>
                 <w:szCs w:val="16"/>
               </w:rPr>
-              <w:t xml:space="preserve">Full</w:t>
+              <w:t xml:space="preserve">Twin</w:t>
             </w:r>
           </w:p>
         </w:tc>
@@ -17537,7 +16813,7 @@
                 <w:sz w:val="16"/>
                 <w:szCs w:val="16"/>
               </w:rPr>
-              <w:t xml:space="preserve">Full Black</w:t>
+              <w:t xml:space="preserve">Twin Black</w:t>
             </w:r>
           </w:p>
         </w:tc>
@@ -17565,7 +16841,7 @@
                 <w:sz w:val="16"/>
                 <w:szCs w:val="16"/>
               </w:rPr>
-              <w:t xml:space="preserve">#1 Full White</w:t>
+              <w:t xml:space="preserve">#1 Twin Purple</w:t>
             </w:r>
           </w:p>
         </w:tc>
@@ -17593,7 +16869,7 @@
                 <w:sz w:val="16"/>
                 <w:szCs w:val="16"/>
               </w:rPr>
-              <w:t xml:space="preserve">push (small seller, estimate)</w:t>
+              <w:t xml:space="preserve">push</w:t>
             </w:r>
           </w:p>
         </w:tc>
@@ -17621,353 +16897,7 @@
                 <w:sz w:val="16"/>
                 <w:szCs w:val="16"/>
               </w:rPr>
-              <w:t xml:space="preserve">2026-12-24</w:t>
-            </w:r>
-          </w:p>
-        </w:tc>
-        <w:tc>
-          <w:tcPr>
-            <w:tcW w:type="dxa" w:w="1560"/>
-            <w:tcBorders>
-              <w:top w:val="single" w:color="BFBFBF" w:sz="4"/>
-              <w:left w:val="single" w:color="BFBFBF" w:sz="4"/>
-              <w:bottom w:val="single" w:color="BFBFBF" w:sz="4"/>
-              <w:right w:val="single" w:color="BFBFBF" w:sz="4"/>
-            </w:tcBorders>
-            <w:tcMar>
-              <w:top w:type="dxa" w:w="40"/>
-              <w:left w:type="dxa" w:w="80"/>
-              <w:bottom w:type="dxa" w:w="40"/>
-              <w:right w:type="dxa" w:w="80"/>
-            </w:tcMar>
-          </w:tcPr>
-          <w:p>
-            <w:r>
-              <w:rPr>
-                <w:b w:val="false"/>
-                <w:bCs w:val="false"/>
-                <w:sz w:val="16"/>
-                <w:szCs w:val="16"/>
-              </w:rPr>
-              <w:t xml:space="preserve">after 31 Jan</w:t>
-            </w:r>
-          </w:p>
-        </w:tc>
-      </w:tr>
-      <w:tr>
-        <w:trPr>
-          <w:tblHeader w:val="off"/>
-        </w:trPr>
-        <w:tc>
-          <w:tcPr>
-            <w:tcW w:type="dxa" w:w="1560"/>
-            <w:tcBorders>
-              <w:top w:val="single" w:color="BFBFBF" w:sz="4"/>
-              <w:left w:val="single" w:color="BFBFBF" w:sz="4"/>
-              <w:bottom w:val="single" w:color="BFBFBF" w:sz="4"/>
-              <w:right w:val="single" w:color="BFBFBF" w:sz="4"/>
-            </w:tcBorders>
-            <w:tcMar>
-              <w:top w:type="dxa" w:w="40"/>
-              <w:left w:type="dxa" w:w="80"/>
-              <w:bottom w:type="dxa" w:w="40"/>
-              <w:right w:type="dxa" w:w="80"/>
-            </w:tcMar>
-          </w:tcPr>
-          <w:p>
-            <w:r>
-              <w:rPr>
-                <w:b w:val="false"/>
-                <w:bCs w:val="false"/>
-                <w:sz w:val="16"/>
-                <w:szCs w:val="16"/>
-              </w:rPr>
-              <w:t xml:space="preserve">Twin</w:t>
-            </w:r>
-          </w:p>
-        </w:tc>
-        <w:tc>
-          <w:tcPr>
-            <w:tcW w:type="dxa" w:w="1560"/>
-            <w:tcBorders>
-              <w:top w:val="single" w:color="BFBFBF" w:sz="4"/>
-              <w:left w:val="single" w:color="BFBFBF" w:sz="4"/>
-              <w:bottom w:val="single" w:color="BFBFBF" w:sz="4"/>
-              <w:right w:val="single" w:color="BFBFBF" w:sz="4"/>
-            </w:tcBorders>
-            <w:tcMar>
-              <w:top w:type="dxa" w:w="40"/>
-              <w:left w:type="dxa" w:w="80"/>
-              <w:bottom w:type="dxa" w:w="40"/>
-              <w:right w:type="dxa" w:w="80"/>
-            </w:tcMar>
-          </w:tcPr>
-          <w:p>
-            <w:r>
-              <w:rPr>
-                <w:b w:val="false"/>
-                <w:bCs w:val="false"/>
-                <w:sz w:val="16"/>
-                <w:szCs w:val="16"/>
-              </w:rPr>
-              <w:t xml:space="preserve">Twin Black</w:t>
-            </w:r>
-          </w:p>
-        </w:tc>
-        <w:tc>
-          <w:tcPr>
-            <w:tcW w:type="dxa" w:w="1560"/>
-            <w:tcBorders>
-              <w:top w:val="single" w:color="BFBFBF" w:sz="4"/>
-              <w:left w:val="single" w:color="BFBFBF" w:sz="4"/>
-              <w:bottom w:val="single" w:color="BFBFBF" w:sz="4"/>
-              <w:right w:val="single" w:color="BFBFBF" w:sz="4"/>
-            </w:tcBorders>
-            <w:tcMar>
-              <w:top w:type="dxa" w:w="40"/>
-              <w:left w:type="dxa" w:w="80"/>
-              <w:bottom w:type="dxa" w:w="40"/>
-              <w:right w:type="dxa" w:w="80"/>
-            </w:tcMar>
-          </w:tcPr>
-          <w:p>
-            <w:r>
-              <w:rPr>
-                <w:b w:val="false"/>
-                <w:bCs w:val="false"/>
-                <w:sz w:val="16"/>
-                <w:szCs w:val="16"/>
-              </w:rPr>
-              <w:t xml:space="preserve">#1 Sea Teal Twin</w:t>
-            </w:r>
-          </w:p>
-        </w:tc>
-        <w:tc>
-          <w:tcPr>
-            <w:tcW w:type="dxa" w:w="1560"/>
-            <w:tcBorders>
-              <w:top w:val="single" w:color="BFBFBF" w:sz="4"/>
-              <w:left w:val="single" w:color="BFBFBF" w:sz="4"/>
-              <w:bottom w:val="single" w:color="BFBFBF" w:sz="4"/>
-              <w:right w:val="single" w:color="BFBFBF" w:sz="4"/>
-            </w:tcBorders>
-            <w:tcMar>
-              <w:top w:type="dxa" w:w="40"/>
-              <w:left w:type="dxa" w:w="80"/>
-              <w:bottom w:type="dxa" w:w="40"/>
-              <w:right w:type="dxa" w:w="80"/>
-            </w:tcMar>
-          </w:tcPr>
-          <w:p>
-            <w:r>
-              <w:rPr>
-                <w:b w:val="false"/>
-                <w:bCs w:val="false"/>
-                <w:sz w:val="16"/>
-                <w:szCs w:val="16"/>
-              </w:rPr>
-              <w:t xml:space="preserve">push</w:t>
-            </w:r>
-          </w:p>
-        </w:tc>
-        <w:tc>
-          <w:tcPr>
-            <w:tcW w:type="dxa" w:w="1560"/>
-            <w:tcBorders>
-              <w:top w:val="single" w:color="BFBFBF" w:sz="4"/>
-              <w:left w:val="single" w:color="BFBFBF" w:sz="4"/>
-              <w:bottom w:val="single" w:color="BFBFBF" w:sz="4"/>
-              <w:right w:val="single" w:color="BFBFBF" w:sz="4"/>
-            </w:tcBorders>
-            <w:tcMar>
-              <w:top w:type="dxa" w:w="40"/>
-              <w:left w:type="dxa" w:w="80"/>
-              <w:bottom w:type="dxa" w:w="40"/>
-              <w:right w:type="dxa" w:w="80"/>
-            </w:tcMar>
-          </w:tcPr>
-          <w:p>
-            <w:r>
-              <w:rPr>
-                <w:b w:val="false"/>
-                <w:bCs w:val="false"/>
-                <w:sz w:val="16"/>
-                <w:szCs w:val="16"/>
-              </w:rPr>
               <w:t xml:space="preserve">2027-01-30</w:t>
-            </w:r>
-          </w:p>
-        </w:tc>
-        <w:tc>
-          <w:tcPr>
-            <w:tcW w:type="dxa" w:w="1560"/>
-            <w:tcBorders>
-              <w:top w:val="single" w:color="BFBFBF" w:sz="4"/>
-              <w:left w:val="single" w:color="BFBFBF" w:sz="4"/>
-              <w:bottom w:val="single" w:color="BFBFBF" w:sz="4"/>
-              <w:right w:val="single" w:color="BFBFBF" w:sz="4"/>
-            </w:tcBorders>
-            <w:tcMar>
-              <w:top w:type="dxa" w:w="40"/>
-              <w:left w:type="dxa" w:w="80"/>
-              <w:bottom w:type="dxa" w:w="40"/>
-              <w:right w:type="dxa" w:w="80"/>
-            </w:tcMar>
-          </w:tcPr>
-          <w:p>
-            <w:r>
-              <w:rPr>
-                <w:b w:val="false"/>
-                <w:bCs w:val="false"/>
-                <w:sz w:val="16"/>
-                <w:szCs w:val="16"/>
-              </w:rPr>
-              <w:t xml:space="preserve">2026-12-22</w:t>
-            </w:r>
-          </w:p>
-        </w:tc>
-      </w:tr>
-      <w:tr>
-        <w:trPr>
-          <w:tblHeader w:val="off"/>
-        </w:trPr>
-        <w:tc>
-          <w:tcPr>
-            <w:tcW w:type="dxa" w:w="1560"/>
-            <w:tcBorders>
-              <w:top w:val="single" w:color="BFBFBF" w:sz="4"/>
-              <w:left w:val="single" w:color="BFBFBF" w:sz="4"/>
-              <w:bottom w:val="single" w:color="BFBFBF" w:sz="4"/>
-              <w:right w:val="single" w:color="BFBFBF" w:sz="4"/>
-            </w:tcBorders>
-            <w:tcMar>
-              <w:top w:type="dxa" w:w="40"/>
-              <w:left w:type="dxa" w:w="80"/>
-              <w:bottom w:type="dxa" w:w="40"/>
-              <w:right w:type="dxa" w:w="80"/>
-            </w:tcMar>
-          </w:tcPr>
-          <w:p>
-            <w:r>
-              <w:rPr>
-                <w:b w:val="false"/>
-                <w:bCs w:val="false"/>
-                <w:sz w:val="16"/>
-                <w:szCs w:val="16"/>
-              </w:rPr>
-              <w:t xml:space="preserve">Twin</w:t>
-            </w:r>
-          </w:p>
-        </w:tc>
-        <w:tc>
-          <w:tcPr>
-            <w:tcW w:type="dxa" w:w="1560"/>
-            <w:tcBorders>
-              <w:top w:val="single" w:color="BFBFBF" w:sz="4"/>
-              <w:left w:val="single" w:color="BFBFBF" w:sz="4"/>
-              <w:bottom w:val="single" w:color="BFBFBF" w:sz="4"/>
-              <w:right w:val="single" w:color="BFBFBF" w:sz="4"/>
-            </w:tcBorders>
-            <w:tcMar>
-              <w:top w:type="dxa" w:w="40"/>
-              <w:left w:type="dxa" w:w="80"/>
-              <w:bottom w:type="dxa" w:w="40"/>
-              <w:right w:type="dxa" w:w="80"/>
-            </w:tcMar>
-          </w:tcPr>
-          <w:p>
-            <w:r>
-              <w:rPr>
-                <w:b w:val="false"/>
-                <w:bCs w:val="false"/>
-                <w:sz w:val="16"/>
-                <w:szCs w:val="16"/>
-              </w:rPr>
-              <w:t xml:space="preserve">Twin Black</w:t>
-            </w:r>
-          </w:p>
-        </w:tc>
-        <w:tc>
-          <w:tcPr>
-            <w:tcW w:type="dxa" w:w="1560"/>
-            <w:tcBorders>
-              <w:top w:val="single" w:color="BFBFBF" w:sz="4"/>
-              <w:left w:val="single" w:color="BFBFBF" w:sz="4"/>
-              <w:bottom w:val="single" w:color="BFBFBF" w:sz="4"/>
-              <w:right w:val="single" w:color="BFBFBF" w:sz="4"/>
-            </w:tcBorders>
-            <w:tcMar>
-              <w:top w:type="dxa" w:w="40"/>
-              <w:left w:type="dxa" w:w="80"/>
-              <w:bottom w:type="dxa" w:w="40"/>
-              <w:right w:type="dxa" w:w="80"/>
-            </w:tcMar>
-          </w:tcPr>
-          <w:p>
-            <w:r>
-              <w:rPr>
-                <w:b w:val="false"/>
-                <w:bCs w:val="false"/>
-                <w:sz w:val="16"/>
-                <w:szCs w:val="16"/>
-              </w:rPr>
-              <w:t xml:space="preserve">#2 Twin Purple</w:t>
-            </w:r>
-          </w:p>
-        </w:tc>
-        <w:tc>
-          <w:tcPr>
-            <w:tcW w:type="dxa" w:w="1560"/>
-            <w:tcBorders>
-              <w:top w:val="single" w:color="BFBFBF" w:sz="4"/>
-              <w:left w:val="single" w:color="BFBFBF" w:sz="4"/>
-              <w:bottom w:val="single" w:color="BFBFBF" w:sz="4"/>
-              <w:right w:val="single" w:color="BFBFBF" w:sz="4"/>
-            </w:tcBorders>
-            <w:tcMar>
-              <w:top w:type="dxa" w:w="40"/>
-              <w:left w:type="dxa" w:w="80"/>
-              <w:bottom w:type="dxa" w:w="40"/>
-              <w:right w:type="dxa" w:w="80"/>
-            </w:tcMar>
-          </w:tcPr>
-          <w:p>
-            <w:r>
-              <w:rPr>
-                <w:b w:val="false"/>
-                <w:bCs w:val="false"/>
-                <w:sz w:val="16"/>
-                <w:szCs w:val="16"/>
-              </w:rPr>
-              <w:t xml:space="preserve">push</w:t>
-            </w:r>
-          </w:p>
-        </w:tc>
-        <w:tc>
-          <w:tcPr>
-            <w:tcW w:type="dxa" w:w="1560"/>
-            <w:tcBorders>
-              <w:top w:val="single" w:color="BFBFBF" w:sz="4"/>
-              <w:left w:val="single" w:color="BFBFBF" w:sz="4"/>
-              <w:bottom w:val="single" w:color="BFBFBF" w:sz="4"/>
-              <w:right w:val="single" w:color="BFBFBF" w:sz="4"/>
-            </w:tcBorders>
-            <w:tcMar>
-              <w:top w:type="dxa" w:w="40"/>
-              <w:left w:type="dxa" w:w="80"/>
-              <w:bottom w:type="dxa" w:w="40"/>
-              <w:right w:type="dxa" w:w="80"/>
-            </w:tcMar>
-          </w:tcPr>
-          <w:p>
-            <w:r>
-              <w:rPr>
-                <w:b w:val="false"/>
-                <w:bCs w:val="false"/>
-                <w:sz w:val="16"/>
-                <w:szCs w:val="16"/>
-              </w:rPr>
-              <w:t xml:space="preserve">not before 31 Jan</w:t>
             </w:r>
           </w:p>
         </w:tc>
@@ -18005,14 +16935,6 @@
       <w:pPr>
         <w:spacing w:after="120"/>
       </w:pPr>
-    </w:p>
-    <w:p>
-      <w:pPr>
-        <w:spacing w:after="120"/>
-      </w:pPr>
-      <w:r>
-        <w:t xml:space="preserve">Note: Sea Teal Twin (Twin back-up #1) is projected to sell out on its own (2026-12-22) before the switch would be needed, so the next back-up in the chain applies.</w:t>
-      </w:r>
     </w:p>
     <w:p>
       <w:pPr>
@@ -21070,7 +19992,7 @@
         <w:spacing w:after="80"/>
       </w:pPr>
       <w:r>
-        <w:t xml:space="preserve">Generic non-ranking traffic goes to a size's LTSF SKU only if that SKU converts at least half as well as the ranking child and is not the size's back-up ranking child. Targets: King: Ivory King; Full: none; Queen: Stripe Queen Red; Twin: none. Not routed: Stripe Full Gold (converts under half the ranking child, 2.04% vs guard 4.4%); Full White (back-up ranking child — its stock is kept for the ranking terms); Stripe Queen Blue (converts under half the ranking child, 3.78% vs guard 4.17%).</w:t>
+        <w:t xml:space="preserve">Generic non-ranking traffic goes to a size's LTSF SKU only if that SKU converts at least half as well as the ranking child on both 30 and 90 days (unit-session %), and is not the size's back-up ranking child. Only as much traffic moves as its aged stock can absorb: expected orders × 60 days must not exceed the aged units left, filling the smallest campaigns first. Campaigns whose terms name another size or a colour are never re-pointed. Targets: King: Ivory King; Full: none; Queen: none; Twin: none. Not routed: Stripe Full Gold (converts under half the ranking child (30- or 90-day unit-session %), 4.06% / 2.04% vs guard 5.46% / 4.4%); Full White (back-up ranking child — its stock is kept for the ranking terms); Stripe Queen Blue (converts under half the ranking child (30- or 90-day unit-session %), 6.67% / 3.78% vs guard 5.0% / 4.17%); Stripe Queen Red (converts under half the ranking child (30- or 90-day unit-session %), 1.96% / 4.7% vs guard 5.0% / 4.17%).</w:t>
       </w:r>
     </w:p>
     <w:p>
@@ -21083,7 +20005,7 @@
         <w:spacing w:after="80"/>
       </w:pPr>
       <w:r>
-        <w:t xml:space="preserve">'DCS-SP-Auto/LTSF-Def-Multi LTSF SKUs' ($270 in 30 days, 14 ASINs advertised): add Ivory King, Stripe Full Gold, Stripe Queen Blue, Stripe Queen Red, Stripe Queen White, Full White, Full Lavender, Twin Blue; pause 12 product ads that are not on the LTSF sheet or are estimated cleared.</w:t>
+        <w:t xml:space="preserve">'DCS-SP-Auto/LTSF-Def-Multi LTSF SKUs' ($270 in 30 days, 14 ASINs advertised): add Ivory King, Stripe Full Gold, Stripe Queen Blue, Stripe Queen Red, Stripe Queen White, Full Lavender, Twin Blue; pause 0 product ads that are not on the LTSF sheet and have no sellable stock (they cannot serve). Ranking and back-up children are not added.</w:t>
       </w:r>
     </w:p>
     <w:p>
@@ -21096,7 +20018,7 @@
         <w:spacing w:after="80"/>
       </w:pPr>
       <w:r>
-        <w:t xml:space="preserve">'DECOLURE-SATIN 6PCS-LTSF Campaigns' ($685 in 30 days, 68 ASINs advertised): add Full White; pause 53 product ads that are not on the LTSF sheet or are estimated cleared.</w:t>
+        <w:t xml:space="preserve">'DECOLURE-SATIN 6PCS-LTSF Campaigns' ($685 in 30 days, 68 ASINs advertised): add nothing; pause 5 product ads that are not on the LTSF sheet and have no sellable stock (they cannot serve). Ranking and back-up children are not added.</w:t>
       </w:r>
     </w:p>
     <w:p>
@@ -21123,6 +20045,19 @@
       </w:pPr>
       <w:r>
         <w:t xml:space="preserve">When a routed LTSF SKU is down to 14 days of stock (aged units sold through), move the ad back or on to the size's next LTSF SKU (rule in each campaign row).</w:t>
+      </w:r>
+    </w:p>
+    <w:p>
+      <w:pPr>
+        <w:pStyle w:val="ListParagraph"/>
+        <w:numPr>
+          <w:ilvl w:val="0"/>
+          <w:numId w:val="2"/>
+        </w:numPr>
+        <w:spacing w:after="80"/>
+      </w:pPr>
+      <w:r>
+        <w:t xml:space="preserve">Storage avoided per aged unit sold = the sheet's monthly charge ÷ aged units (the charge already covers the months on hand). It lifts the break-even used for LTSF SKUs only by that amount.</w:t>
       </w:r>
     </w:p>
     <w:p>
@@ -22012,91 +20947,91 @@
                 <w:sz w:val="16"/>
                 <w:szCs w:val="16"/>
               </w:rPr>
-              <w:t xml:space="preserve">0.77</w:t>
-            </w:r>
-          </w:p>
-        </w:tc>
-        <w:tc>
-          <w:tcPr>
-            <w:tcW w:type="dxa" w:w="1170"/>
-            <w:tcBorders>
-              <w:top w:val="single" w:color="BFBFBF" w:sz="4"/>
-              <w:left w:val="single" w:color="BFBFBF" w:sz="4"/>
-              <w:bottom w:val="single" w:color="BFBFBF" w:sz="4"/>
-              <w:right w:val="single" w:color="BFBFBF" w:sz="4"/>
-            </w:tcBorders>
-            <w:tcMar>
-              <w:top w:type="dxa" w:w="40"/>
-              <w:left w:type="dxa" w:w="80"/>
-              <w:bottom w:type="dxa" w:w="40"/>
-              <w:right w:type="dxa" w:w="80"/>
-            </w:tcMar>
-          </w:tcPr>
-          <w:p>
-            <w:r>
-              <w:rPr>
-                <w:b w:val="false"/>
-                <w:bCs w:val="false"/>
-                <w:sz w:val="16"/>
-                <w:szCs w:val="16"/>
-              </w:rPr>
-              <w:t xml:space="preserve">2027-01-06</w:t>
-            </w:r>
-          </w:p>
-        </w:tc>
-        <w:tc>
-          <w:tcPr>
-            <w:tcW w:type="dxa" w:w="1170"/>
-            <w:tcBorders>
-              <w:top w:val="single" w:color="BFBFBF" w:sz="4"/>
-              <w:left w:val="single" w:color="BFBFBF" w:sz="4"/>
-              <w:bottom w:val="single" w:color="BFBFBF" w:sz="4"/>
-              <w:right w:val="single" w:color="BFBFBF" w:sz="4"/>
-            </w:tcBorders>
-            <w:tcMar>
-              <w:top w:type="dxa" w:w="40"/>
-              <w:left w:type="dxa" w:w="80"/>
-              <w:bottom w:type="dxa" w:w="40"/>
-              <w:right w:type="dxa" w:w="80"/>
-            </w:tcMar>
-          </w:tcPr>
-          <w:p>
-            <w:r>
-              <w:rPr>
-                <w:b w:val="false"/>
-                <w:bCs w:val="false"/>
-                <w:sz w:val="16"/>
-                <w:szCs w:val="16"/>
-              </w:rPr>
-              <w:t xml:space="preserve">2027-01-10</w:t>
-            </w:r>
-          </w:p>
-        </w:tc>
-        <w:tc>
-          <w:tcPr>
-            <w:tcW w:type="dxa" w:w="1170"/>
-            <w:tcBorders>
-              <w:top w:val="single" w:color="BFBFBF" w:sz="4"/>
-              <w:left w:val="single" w:color="BFBFBF" w:sz="4"/>
-              <w:bottom w:val="single" w:color="BFBFBF" w:sz="4"/>
-              <w:right w:val="single" w:color="BFBFBF" w:sz="4"/>
-            </w:tcBorders>
-            <w:tcMar>
-              <w:top w:type="dxa" w:w="40"/>
-              <w:left w:type="dxa" w:w="80"/>
-              <w:bottom w:type="dxa" w:w="40"/>
-              <w:right w:type="dxa" w:w="80"/>
-            </w:tcMar>
-          </w:tcPr>
-          <w:p>
-            <w:r>
-              <w:rPr>
-                <w:b w:val="false"/>
-                <w:bCs w:val="false"/>
-                <w:sz w:val="16"/>
-                <w:szCs w:val="16"/>
-              </w:rPr>
-              <w:t xml:space="preserve">30</w:t>
+              <w:t xml:space="preserve">0.85</w:t>
+            </w:r>
+          </w:p>
+        </w:tc>
+        <w:tc>
+          <w:tcPr>
+            <w:tcW w:type="dxa" w:w="1170"/>
+            <w:tcBorders>
+              <w:top w:val="single" w:color="BFBFBF" w:sz="4"/>
+              <w:left w:val="single" w:color="BFBFBF" w:sz="4"/>
+              <w:bottom w:val="single" w:color="BFBFBF" w:sz="4"/>
+              <w:right w:val="single" w:color="BFBFBF" w:sz="4"/>
+            </w:tcBorders>
+            <w:tcMar>
+              <w:top w:type="dxa" w:w="40"/>
+              <w:left w:type="dxa" w:w="80"/>
+              <w:bottom w:type="dxa" w:w="40"/>
+              <w:right w:type="dxa" w:w="80"/>
+            </w:tcMar>
+          </w:tcPr>
+          <w:p>
+            <w:r>
+              <w:rPr>
+                <w:b w:val="false"/>
+                <w:bCs w:val="false"/>
+                <w:sz w:val="16"/>
+                <w:szCs w:val="16"/>
+              </w:rPr>
+              <w:t xml:space="preserve">2027-01-05</w:t>
+            </w:r>
+          </w:p>
+        </w:tc>
+        <w:tc>
+          <w:tcPr>
+            <w:tcW w:type="dxa" w:w="1170"/>
+            <w:tcBorders>
+              <w:top w:val="single" w:color="BFBFBF" w:sz="4"/>
+              <w:left w:val="single" w:color="BFBFBF" w:sz="4"/>
+              <w:bottom w:val="single" w:color="BFBFBF" w:sz="4"/>
+              <w:right w:val="single" w:color="BFBFBF" w:sz="4"/>
+            </w:tcBorders>
+            <w:tcMar>
+              <w:top w:type="dxa" w:w="40"/>
+              <w:left w:type="dxa" w:w="80"/>
+              <w:bottom w:type="dxa" w:w="40"/>
+              <w:right w:type="dxa" w:w="80"/>
+            </w:tcMar>
+          </w:tcPr>
+          <w:p>
+            <w:r>
+              <w:rPr>
+                <w:b w:val="false"/>
+                <w:bCs w:val="false"/>
+                <w:sz w:val="16"/>
+                <w:szCs w:val="16"/>
+              </w:rPr>
+              <w:t xml:space="preserve">2026-12-30</w:t>
+            </w:r>
+          </w:p>
+        </w:tc>
+        <w:tc>
+          <w:tcPr>
+            <w:tcW w:type="dxa" w:w="1170"/>
+            <w:tcBorders>
+              <w:top w:val="single" w:color="BFBFBF" w:sz="4"/>
+              <w:left w:val="single" w:color="BFBFBF" w:sz="4"/>
+              <w:bottom w:val="single" w:color="BFBFBF" w:sz="4"/>
+              <w:right w:val="single" w:color="BFBFBF" w:sz="4"/>
+            </w:tcBorders>
+            <w:tcMar>
+              <w:top w:type="dxa" w:w="40"/>
+              <w:left w:type="dxa" w:w="80"/>
+              <w:bottom w:type="dxa" w:w="40"/>
+              <w:right w:type="dxa" w:w="80"/>
+            </w:tcMar>
+          </w:tcPr>
+          <w:p>
+            <w:r>
+              <w:rPr>
+                <w:b w:val="false"/>
+                <w:bCs w:val="false"/>
+                <w:sz w:val="16"/>
+                <w:szCs w:val="16"/>
+              </w:rPr>
+              <w:t xml:space="preserve">51</w:t>
             </w:r>
           </w:p>
         </w:tc>
@@ -22470,7 +21405,7 @@
                 <w:sz w:val="16"/>
                 <w:szCs w:val="16"/>
               </w:rPr>
-              <w:t xml:space="preserve">2.41</w:t>
+              <w:t xml:space="preserve">2.44</w:t>
             </w:r>
           </w:p>
         </w:tc>
@@ -22699,91 +21634,91 @@
                 <w:sz w:val="16"/>
                 <w:szCs w:val="16"/>
               </w:rPr>
-              <w:t xml:space="preserve">5.85</w:t>
-            </w:r>
-          </w:p>
-        </w:tc>
-        <w:tc>
-          <w:tcPr>
-            <w:tcW w:type="dxa" w:w="1170"/>
-            <w:tcBorders>
-              <w:top w:val="single" w:color="BFBFBF" w:sz="4"/>
-              <w:left w:val="single" w:color="BFBFBF" w:sz="4"/>
-              <w:bottom w:val="single" w:color="BFBFBF" w:sz="4"/>
-              <w:right w:val="single" w:color="BFBFBF" w:sz="4"/>
-            </w:tcBorders>
-            <w:tcMar>
-              <w:top w:type="dxa" w:w="40"/>
-              <w:left w:type="dxa" w:w="80"/>
-              <w:bottom w:type="dxa" w:w="40"/>
-              <w:right w:type="dxa" w:w="80"/>
-            </w:tcMar>
-          </w:tcPr>
-          <w:p>
-            <w:r>
-              <w:rPr>
-                <w:b w:val="false"/>
-                <w:bCs w:val="false"/>
-                <w:sz w:val="16"/>
-                <w:szCs w:val="16"/>
-              </w:rPr>
-              <w:t xml:space="preserve">2027-01-22</w:t>
-            </w:r>
-          </w:p>
-        </w:tc>
-        <w:tc>
-          <w:tcPr>
-            <w:tcW w:type="dxa" w:w="1170"/>
-            <w:tcBorders>
-              <w:top w:val="single" w:color="BFBFBF" w:sz="4"/>
-              <w:left w:val="single" w:color="BFBFBF" w:sz="4"/>
-              <w:bottom w:val="single" w:color="BFBFBF" w:sz="4"/>
-              <w:right w:val="single" w:color="BFBFBF" w:sz="4"/>
-            </w:tcBorders>
-            <w:tcMar>
-              <w:top w:type="dxa" w:w="40"/>
-              <w:left w:type="dxa" w:w="80"/>
-              <w:bottom w:type="dxa" w:w="40"/>
-              <w:right w:type="dxa" w:w="80"/>
-            </w:tcMar>
-          </w:tcPr>
-          <w:p>
-            <w:r>
-              <w:rPr>
-                <w:b w:val="false"/>
-                <w:bCs w:val="false"/>
-                <w:sz w:val="16"/>
-                <w:szCs w:val="16"/>
-              </w:rPr>
-              <w:t xml:space="preserve">2026-12-01</w:t>
-            </w:r>
-          </w:p>
-        </w:tc>
-        <w:tc>
-          <w:tcPr>
-            <w:tcW w:type="dxa" w:w="1170"/>
-            <w:tcBorders>
-              <w:top w:val="single" w:color="BFBFBF" w:sz="4"/>
-              <w:left w:val="single" w:color="BFBFBF" w:sz="4"/>
-              <w:bottom w:val="single" w:color="BFBFBF" w:sz="4"/>
-              <w:right w:val="single" w:color="BFBFBF" w:sz="4"/>
-            </w:tcBorders>
-            <w:tcMar>
-              <w:top w:type="dxa" w:w="40"/>
-              <w:left w:type="dxa" w:w="80"/>
-              <w:bottom w:type="dxa" w:w="40"/>
-              <w:right w:type="dxa" w:w="80"/>
-            </w:tcMar>
-          </w:tcPr>
-          <w:p>
-            <w:r>
-              <w:rPr>
-                <w:b w:val="false"/>
-                <w:bCs w:val="false"/>
-                <w:sz w:val="16"/>
-                <w:szCs w:val="16"/>
-              </w:rPr>
-              <w:t xml:space="preserve">876</w:t>
+              <w:t xml:space="preserve">7.1</w:t>
+            </w:r>
+          </w:p>
+        </w:tc>
+        <w:tc>
+          <w:tcPr>
+            <w:tcW w:type="dxa" w:w="1170"/>
+            <w:tcBorders>
+              <w:top w:val="single" w:color="BFBFBF" w:sz="4"/>
+              <w:left w:val="single" w:color="BFBFBF" w:sz="4"/>
+              <w:bottom w:val="single" w:color="BFBFBF" w:sz="4"/>
+              <w:right w:val="single" w:color="BFBFBF" w:sz="4"/>
+            </w:tcBorders>
+            <w:tcMar>
+              <w:top w:type="dxa" w:w="40"/>
+              <w:left w:type="dxa" w:w="80"/>
+              <w:bottom w:type="dxa" w:w="40"/>
+              <w:right w:type="dxa" w:w="80"/>
+            </w:tcMar>
+          </w:tcPr>
+          <w:p>
+            <w:r>
+              <w:rPr>
+                <w:b w:val="false"/>
+                <w:bCs w:val="false"/>
+                <w:sz w:val="16"/>
+                <w:szCs w:val="16"/>
+              </w:rPr>
+              <w:t xml:space="preserve">2027-01-21</w:t>
+            </w:r>
+          </w:p>
+        </w:tc>
+        <w:tc>
+          <w:tcPr>
+            <w:tcW w:type="dxa" w:w="1170"/>
+            <w:tcBorders>
+              <w:top w:val="single" w:color="BFBFBF" w:sz="4"/>
+              <w:left w:val="single" w:color="BFBFBF" w:sz="4"/>
+              <w:bottom w:val="single" w:color="BFBFBF" w:sz="4"/>
+              <w:right w:val="single" w:color="BFBFBF" w:sz="4"/>
+            </w:tcBorders>
+            <w:tcMar>
+              <w:top w:type="dxa" w:w="40"/>
+              <w:left w:type="dxa" w:w="80"/>
+              <w:bottom w:type="dxa" w:w="40"/>
+              <w:right w:type="dxa" w:w="80"/>
+            </w:tcMar>
+          </w:tcPr>
+          <w:p>
+            <w:r>
+              <w:rPr>
+                <w:b w:val="false"/>
+                <w:bCs w:val="false"/>
+                <w:sz w:val="16"/>
+                <w:szCs w:val="16"/>
+              </w:rPr>
+              <w:t xml:space="preserve">2026-11-21</w:t>
+            </w:r>
+          </w:p>
+        </w:tc>
+        <w:tc>
+          <w:tcPr>
+            <w:tcW w:type="dxa" w:w="1170"/>
+            <w:tcBorders>
+              <w:top w:val="single" w:color="BFBFBF" w:sz="4"/>
+              <w:left w:val="single" w:color="BFBFBF" w:sz="4"/>
+              <w:bottom w:val="single" w:color="BFBFBF" w:sz="4"/>
+              <w:right w:val="single" w:color="BFBFBF" w:sz="4"/>
+            </w:tcBorders>
+            <w:tcMar>
+              <w:top w:type="dxa" w:w="40"/>
+              <w:left w:type="dxa" w:w="80"/>
+              <w:bottom w:type="dxa" w:w="40"/>
+              <w:right w:type="dxa" w:w="80"/>
+            </w:tcMar>
+          </w:tcPr>
+          <w:p>
+            <w:r>
+              <w:rPr>
+                <w:b w:val="false"/>
+                <w:bCs w:val="false"/>
+                <w:sz w:val="16"/>
+                <w:szCs w:val="16"/>
+              </w:rPr>
+              <w:t xml:space="preserve">1,195</w:t>
             </w:r>
           </w:p>
         </w:tc>
@@ -22816,7 +21751,7 @@
                 <w:sz w:val="16"/>
                 <w:szCs w:val="16"/>
               </w:rPr>
-              <w:t xml:space="preserve">Rosewood Queen</w:t>
+              <w:t xml:space="preserve">Red Queen</w:t>
             </w:r>
           </w:p>
         </w:tc>
@@ -22872,63 +21807,63 @@
                 <w:sz w:val="16"/>
                 <w:szCs w:val="16"/>
               </w:rPr>
-              <w:t xml:space="preserve">426</w:t>
-            </w:r>
-          </w:p>
-        </w:tc>
-        <w:tc>
-          <w:tcPr>
-            <w:tcW w:type="dxa" w:w="1170"/>
-            <w:tcBorders>
-              <w:top w:val="single" w:color="BFBFBF" w:sz="4"/>
-              <w:left w:val="single" w:color="BFBFBF" w:sz="4"/>
-              <w:bottom w:val="single" w:color="BFBFBF" w:sz="4"/>
-              <w:right w:val="single" w:color="BFBFBF" w:sz="4"/>
-            </w:tcBorders>
-            <w:tcMar>
-              <w:top w:type="dxa" w:w="40"/>
-              <w:left w:type="dxa" w:w="80"/>
-              <w:bottom w:type="dxa" w:w="40"/>
-              <w:right w:type="dxa" w:w="80"/>
-            </w:tcMar>
-          </w:tcPr>
-          <w:p>
-            <w:r>
-              <w:rPr>
-                <w:b w:val="false"/>
-                <w:bCs w:val="false"/>
-                <w:sz w:val="16"/>
-                <w:szCs w:val="16"/>
-              </w:rPr>
-              <w:t xml:space="preserve">1.13</w:t>
-            </w:r>
-          </w:p>
-        </w:tc>
-        <w:tc>
-          <w:tcPr>
-            <w:tcW w:type="dxa" w:w="1170"/>
-            <w:tcBorders>
-              <w:top w:val="single" w:color="BFBFBF" w:sz="4"/>
-              <w:left w:val="single" w:color="BFBFBF" w:sz="4"/>
-              <w:bottom w:val="single" w:color="BFBFBF" w:sz="4"/>
-              <w:right w:val="single" w:color="BFBFBF" w:sz="4"/>
-            </w:tcBorders>
-            <w:tcMar>
-              <w:top w:type="dxa" w:w="40"/>
-              <w:left w:type="dxa" w:w="80"/>
-              <w:bottom w:type="dxa" w:w="40"/>
-              <w:right w:type="dxa" w:w="80"/>
-            </w:tcMar>
-          </w:tcPr>
-          <w:p>
-            <w:r>
-              <w:rPr>
-                <w:b w:val="false"/>
-                <w:bCs w:val="false"/>
-                <w:sz w:val="16"/>
-                <w:szCs w:val="16"/>
-              </w:rPr>
-              <w:t xml:space="preserve">0.43</w:t>
+              <w:t xml:space="preserve">227</w:t>
+            </w:r>
+          </w:p>
+        </w:tc>
+        <w:tc>
+          <w:tcPr>
+            <w:tcW w:type="dxa" w:w="1170"/>
+            <w:tcBorders>
+              <w:top w:val="single" w:color="BFBFBF" w:sz="4"/>
+              <w:left w:val="single" w:color="BFBFBF" w:sz="4"/>
+              <w:bottom w:val="single" w:color="BFBFBF" w:sz="4"/>
+              <w:right w:val="single" w:color="BFBFBF" w:sz="4"/>
+            </w:tcBorders>
+            <w:tcMar>
+              <w:top w:type="dxa" w:w="40"/>
+              <w:left w:type="dxa" w:w="80"/>
+              <w:bottom w:type="dxa" w:w="40"/>
+              <w:right w:type="dxa" w:w="80"/>
+            </w:tcMar>
+          </w:tcPr>
+          <w:p>
+            <w:r>
+              <w:rPr>
+                <w:b w:val="false"/>
+                <w:bCs w:val="false"/>
+                <w:sz w:val="16"/>
+                <w:szCs w:val="16"/>
+              </w:rPr>
+              <w:t xml:space="preserve">0.13</w:t>
+            </w:r>
+          </w:p>
+        </w:tc>
+        <w:tc>
+          <w:tcPr>
+            <w:tcW w:type="dxa" w:w="1170"/>
+            <w:tcBorders>
+              <w:top w:val="single" w:color="BFBFBF" w:sz="4"/>
+              <w:left w:val="single" w:color="BFBFBF" w:sz="4"/>
+              <w:bottom w:val="single" w:color="BFBFBF" w:sz="4"/>
+              <w:right w:val="single" w:color="BFBFBF" w:sz="4"/>
+            </w:tcBorders>
+            <w:tcMar>
+              <w:top w:type="dxa" w:w="40"/>
+              <w:left w:type="dxa" w:w="80"/>
+              <w:bottom w:type="dxa" w:w="40"/>
+              <w:right w:type="dxa" w:w="80"/>
+            </w:tcMar>
+          </w:tcPr>
+          <w:p>
+            <w:r>
+              <w:rPr>
+                <w:b w:val="false"/>
+                <w:bCs w:val="false"/>
+                <w:sz w:val="16"/>
+                <w:szCs w:val="16"/>
+              </w:rPr>
+              <w:t xml:space="preserve">0.13</w:t>
             </w:r>
           </w:p>
         </w:tc>
@@ -23045,693 +21980,6 @@
                 <w:sz w:val="16"/>
                 <w:szCs w:val="16"/>
               </w:rPr>
-              <w:t xml:space="preserve">Sea Teal Queen</w:t>
-            </w:r>
-          </w:p>
-        </w:tc>
-        <w:tc>
-          <w:tcPr>
-            <w:tcW w:type="dxa" w:w="1170"/>
-            <w:tcBorders>
-              <w:top w:val="single" w:color="BFBFBF" w:sz="4"/>
-              <w:left w:val="single" w:color="BFBFBF" w:sz="4"/>
-              <w:bottom w:val="single" w:color="BFBFBF" w:sz="4"/>
-              <w:right w:val="single" w:color="BFBFBF" w:sz="4"/>
-            </w:tcBorders>
-            <w:tcMar>
-              <w:top w:type="dxa" w:w="40"/>
-              <w:left w:type="dxa" w:w="80"/>
-              <w:bottom w:type="dxa" w:w="40"/>
-              <w:right w:type="dxa" w:w="80"/>
-            </w:tcMar>
-          </w:tcPr>
-          <w:p>
-            <w:r>
-              <w:rPr>
-                <w:b w:val="false"/>
-                <w:bCs w:val="false"/>
-                <w:sz w:val="16"/>
-                <w:szCs w:val="16"/>
-              </w:rPr>
-              <w:t xml:space="preserve">back-up</w:t>
-            </w:r>
-          </w:p>
-        </w:tc>
-        <w:tc>
-          <w:tcPr>
-            <w:tcW w:type="dxa" w:w="1170"/>
-            <w:tcBorders>
-              <w:top w:val="single" w:color="BFBFBF" w:sz="4"/>
-              <w:left w:val="single" w:color="BFBFBF" w:sz="4"/>
-              <w:bottom w:val="single" w:color="BFBFBF" w:sz="4"/>
-              <w:right w:val="single" w:color="BFBFBF" w:sz="4"/>
-            </w:tcBorders>
-            <w:tcMar>
-              <w:top w:type="dxa" w:w="40"/>
-              <w:left w:type="dxa" w:w="80"/>
-              <w:bottom w:type="dxa" w:w="40"/>
-              <w:right w:type="dxa" w:w="80"/>
-            </w:tcMar>
-          </w:tcPr>
-          <w:p>
-            <w:r>
-              <w:rPr>
-                <w:b w:val="false"/>
-                <w:bCs w:val="false"/>
-                <w:sz w:val="16"/>
-                <w:szCs w:val="16"/>
-              </w:rPr>
-              <w:t xml:space="preserve">640</w:t>
-            </w:r>
-          </w:p>
-        </w:tc>
-        <w:tc>
-          <w:tcPr>
-            <w:tcW w:type="dxa" w:w="1170"/>
-            <w:tcBorders>
-              <w:top w:val="single" w:color="BFBFBF" w:sz="4"/>
-              <w:left w:val="single" w:color="BFBFBF" w:sz="4"/>
-              <w:bottom w:val="single" w:color="BFBFBF" w:sz="4"/>
-              <w:right w:val="single" w:color="BFBFBF" w:sz="4"/>
-            </w:tcBorders>
-            <w:tcMar>
-              <w:top w:type="dxa" w:w="40"/>
-              <w:left w:type="dxa" w:w="80"/>
-              <w:bottom w:type="dxa" w:w="40"/>
-              <w:right w:type="dxa" w:w="80"/>
-            </w:tcMar>
-          </w:tcPr>
-          <w:p>
-            <w:r>
-              <w:rPr>
-                <w:b w:val="false"/>
-                <w:bCs w:val="false"/>
-                <w:sz w:val="16"/>
-                <w:szCs w:val="16"/>
-              </w:rPr>
-              <w:t xml:space="preserve">0.03</w:t>
-            </w:r>
-          </w:p>
-        </w:tc>
-        <w:tc>
-          <w:tcPr>
-            <w:tcW w:type="dxa" w:w="1170"/>
-            <w:tcBorders>
-              <w:top w:val="single" w:color="BFBFBF" w:sz="4"/>
-              <w:left w:val="single" w:color="BFBFBF" w:sz="4"/>
-              <w:bottom w:val="single" w:color="BFBFBF" w:sz="4"/>
-              <w:right w:val="single" w:color="BFBFBF" w:sz="4"/>
-            </w:tcBorders>
-            <w:tcMar>
-              <w:top w:type="dxa" w:w="40"/>
-              <w:left w:type="dxa" w:w="80"/>
-              <w:bottom w:type="dxa" w:w="40"/>
-              <w:right w:type="dxa" w:w="80"/>
-            </w:tcMar>
-          </w:tcPr>
-          <w:p>
-            <w:r>
-              <w:rPr>
-                <w:b w:val="false"/>
-                <w:bCs w:val="false"/>
-                <w:sz w:val="16"/>
-                <w:szCs w:val="16"/>
-              </w:rPr>
-              <w:t xml:space="preserve">0.03</w:t>
-            </w:r>
-          </w:p>
-        </w:tc>
-        <w:tc>
-          <w:tcPr>
-            <w:tcW w:type="dxa" w:w="1170"/>
-            <w:tcBorders>
-              <w:top w:val="single" w:color="BFBFBF" w:sz="4"/>
-              <w:left w:val="single" w:color="BFBFBF" w:sz="4"/>
-              <w:bottom w:val="single" w:color="BFBFBF" w:sz="4"/>
-              <w:right w:val="single" w:color="BFBFBF" w:sz="4"/>
-            </w:tcBorders>
-            <w:tcMar>
-              <w:top w:type="dxa" w:w="40"/>
-              <w:left w:type="dxa" w:w="80"/>
-              <w:bottom w:type="dxa" w:w="40"/>
-              <w:right w:type="dxa" w:w="80"/>
-            </w:tcMar>
-          </w:tcPr>
-          <w:p>
-            <w:r>
-              <w:rPr>
-                <w:b w:val="false"/>
-                <w:bCs w:val="false"/>
-                <w:sz w:val="16"/>
-                <w:szCs w:val="16"/>
-              </w:rPr>
-              <w:t xml:space="preserve">after 31 Jan</w:t>
-            </w:r>
-          </w:p>
-        </w:tc>
-        <w:tc>
-          <w:tcPr>
-            <w:tcW w:type="dxa" w:w="1170"/>
-            <w:tcBorders>
-              <w:top w:val="single" w:color="BFBFBF" w:sz="4"/>
-              <w:left w:val="single" w:color="BFBFBF" w:sz="4"/>
-              <w:bottom w:val="single" w:color="BFBFBF" w:sz="4"/>
-              <w:right w:val="single" w:color="BFBFBF" w:sz="4"/>
-            </w:tcBorders>
-            <w:tcMar>
-              <w:top w:type="dxa" w:w="40"/>
-              <w:left w:type="dxa" w:w="80"/>
-              <w:bottom w:type="dxa" w:w="40"/>
-              <w:right w:type="dxa" w:w="80"/>
-            </w:tcMar>
-          </w:tcPr>
-          <w:p>
-            <w:r>
-              <w:rPr>
-                <w:b w:val="false"/>
-                <w:bCs w:val="false"/>
-                <w:sz w:val="16"/>
-                <w:szCs w:val="16"/>
-              </w:rPr>
-              <w:t xml:space="preserve">after 31 Jan</w:t>
-            </w:r>
-          </w:p>
-        </w:tc>
-        <w:tc>
-          <w:tcPr>
-            <w:tcW w:type="dxa" w:w="1170"/>
-            <w:tcBorders>
-              <w:top w:val="single" w:color="BFBFBF" w:sz="4"/>
-              <w:left w:val="single" w:color="BFBFBF" w:sz="4"/>
-              <w:bottom w:val="single" w:color="BFBFBF" w:sz="4"/>
-              <w:right w:val="single" w:color="BFBFBF" w:sz="4"/>
-            </w:tcBorders>
-            <w:tcMar>
-              <w:top w:type="dxa" w:w="40"/>
-              <w:left w:type="dxa" w:w="80"/>
-              <w:bottom w:type="dxa" w:w="40"/>
-              <w:right w:type="dxa" w:w="80"/>
-            </w:tcMar>
-          </w:tcPr>
-          <w:p>
-            <w:r>
-              <w:rPr>
-                <w:b w:val="false"/>
-                <w:bCs w:val="false"/>
-                <w:sz w:val="16"/>
-                <w:szCs w:val="16"/>
-              </w:rPr>
-              <w:t xml:space="preserve">— (not reordered)</w:t>
-            </w:r>
-          </w:p>
-        </w:tc>
-      </w:tr>
-      <w:tr>
-        <w:trPr>
-          <w:tblHeader w:val="off"/>
-        </w:trPr>
-        <w:tc>
-          <w:tcPr>
-            <w:tcW w:type="dxa" w:w="1170"/>
-            <w:tcBorders>
-              <w:top w:val="single" w:color="BFBFBF" w:sz="4"/>
-              <w:left w:val="single" w:color="BFBFBF" w:sz="4"/>
-              <w:bottom w:val="single" w:color="BFBFBF" w:sz="4"/>
-              <w:right w:val="single" w:color="BFBFBF" w:sz="4"/>
-            </w:tcBorders>
-            <w:tcMar>
-              <w:top w:type="dxa" w:w="40"/>
-              <w:left w:type="dxa" w:w="80"/>
-              <w:bottom w:type="dxa" w:w="40"/>
-              <w:right w:type="dxa" w:w="80"/>
-            </w:tcMar>
-          </w:tcPr>
-          <w:p>
-            <w:r>
-              <w:rPr>
-                <w:b w:val="false"/>
-                <w:bCs w:val="false"/>
-                <w:sz w:val="16"/>
-                <w:szCs w:val="16"/>
-              </w:rPr>
-              <w:t xml:space="preserve">Sea Teal Twin</w:t>
-            </w:r>
-          </w:p>
-        </w:tc>
-        <w:tc>
-          <w:tcPr>
-            <w:tcW w:type="dxa" w:w="1170"/>
-            <w:tcBorders>
-              <w:top w:val="single" w:color="BFBFBF" w:sz="4"/>
-              <w:left w:val="single" w:color="BFBFBF" w:sz="4"/>
-              <w:bottom w:val="single" w:color="BFBFBF" w:sz="4"/>
-              <w:right w:val="single" w:color="BFBFBF" w:sz="4"/>
-            </w:tcBorders>
-            <w:tcMar>
-              <w:top w:type="dxa" w:w="40"/>
-              <w:left w:type="dxa" w:w="80"/>
-              <w:bottom w:type="dxa" w:w="40"/>
-              <w:right w:type="dxa" w:w="80"/>
-            </w:tcMar>
-          </w:tcPr>
-          <w:p>
-            <w:r>
-              <w:rPr>
-                <w:b w:val="false"/>
-                <w:bCs w:val="false"/>
-                <w:sz w:val="16"/>
-                <w:szCs w:val="16"/>
-              </w:rPr>
-              <w:t xml:space="preserve">back-up + LTSF</w:t>
-            </w:r>
-          </w:p>
-        </w:tc>
-        <w:tc>
-          <w:tcPr>
-            <w:tcW w:type="dxa" w:w="1170"/>
-            <w:tcBorders>
-              <w:top w:val="single" w:color="BFBFBF" w:sz="4"/>
-              <w:left w:val="single" w:color="BFBFBF" w:sz="4"/>
-              <w:bottom w:val="single" w:color="BFBFBF" w:sz="4"/>
-              <w:right w:val="single" w:color="BFBFBF" w:sz="4"/>
-            </w:tcBorders>
-            <w:tcMar>
-              <w:top w:type="dxa" w:w="40"/>
-              <w:left w:type="dxa" w:w="80"/>
-              <w:bottom w:type="dxa" w:w="40"/>
-              <w:right w:type="dxa" w:w="80"/>
-            </w:tcMar>
-          </w:tcPr>
-          <w:p>
-            <w:r>
-              <w:rPr>
-                <w:b w:val="false"/>
-                <w:bCs w:val="false"/>
-                <w:sz w:val="16"/>
-                <w:szCs w:val="16"/>
-              </w:rPr>
-              <w:t xml:space="preserve">32</w:t>
-            </w:r>
-          </w:p>
-        </w:tc>
-        <w:tc>
-          <w:tcPr>
-            <w:tcW w:type="dxa" w:w="1170"/>
-            <w:tcBorders>
-              <w:top w:val="single" w:color="BFBFBF" w:sz="4"/>
-              <w:left w:val="single" w:color="BFBFBF" w:sz="4"/>
-              <w:bottom w:val="single" w:color="BFBFBF" w:sz="4"/>
-              <w:right w:val="single" w:color="BFBFBF" w:sz="4"/>
-            </w:tcBorders>
-            <w:tcMar>
-              <w:top w:type="dxa" w:w="40"/>
-              <w:left w:type="dxa" w:w="80"/>
-              <w:bottom w:type="dxa" w:w="40"/>
-              <w:right w:type="dxa" w:w="80"/>
-            </w:tcMar>
-          </w:tcPr>
-          <w:p>
-            <w:r>
-              <w:rPr>
-                <w:b w:val="false"/>
-                <w:bCs w:val="false"/>
-                <w:sz w:val="16"/>
-                <w:szCs w:val="16"/>
-              </w:rPr>
-              <w:t xml:space="preserve">0.2</w:t>
-            </w:r>
-          </w:p>
-        </w:tc>
-        <w:tc>
-          <w:tcPr>
-            <w:tcW w:type="dxa" w:w="1170"/>
-            <w:tcBorders>
-              <w:top w:val="single" w:color="BFBFBF" w:sz="4"/>
-              <w:left w:val="single" w:color="BFBFBF" w:sz="4"/>
-              <w:bottom w:val="single" w:color="BFBFBF" w:sz="4"/>
-              <w:right w:val="single" w:color="BFBFBF" w:sz="4"/>
-            </w:tcBorders>
-            <w:tcMar>
-              <w:top w:type="dxa" w:w="40"/>
-              <w:left w:type="dxa" w:w="80"/>
-              <w:bottom w:type="dxa" w:w="40"/>
-              <w:right w:type="dxa" w:w="80"/>
-            </w:tcMar>
-          </w:tcPr>
-          <w:p>
-            <w:r>
-              <w:rPr>
-                <w:b w:val="false"/>
-                <w:bCs w:val="false"/>
-                <w:sz w:val="16"/>
-                <w:szCs w:val="16"/>
-              </w:rPr>
-              <w:t xml:space="preserve">0.2</w:t>
-            </w:r>
-          </w:p>
-        </w:tc>
-        <w:tc>
-          <w:tcPr>
-            <w:tcW w:type="dxa" w:w="1170"/>
-            <w:tcBorders>
-              <w:top w:val="single" w:color="BFBFBF" w:sz="4"/>
-              <w:left w:val="single" w:color="BFBFBF" w:sz="4"/>
-              <w:bottom w:val="single" w:color="BFBFBF" w:sz="4"/>
-              <w:right w:val="single" w:color="BFBFBF" w:sz="4"/>
-            </w:tcBorders>
-            <w:tcMar>
-              <w:top w:type="dxa" w:w="40"/>
-              <w:left w:type="dxa" w:w="80"/>
-              <w:bottom w:type="dxa" w:w="40"/>
-              <w:right w:type="dxa" w:w="80"/>
-            </w:tcMar>
-          </w:tcPr>
-          <w:p>
-            <w:r>
-              <w:rPr>
-                <w:b w:val="false"/>
-                <w:bCs w:val="false"/>
-                <w:sz w:val="16"/>
-                <w:szCs w:val="16"/>
-              </w:rPr>
-              <w:t xml:space="preserve">2026-12-22</w:t>
-            </w:r>
-          </w:p>
-        </w:tc>
-        <w:tc>
-          <w:tcPr>
-            <w:tcW w:type="dxa" w:w="1170"/>
-            <w:tcBorders>
-              <w:top w:val="single" w:color="BFBFBF" w:sz="4"/>
-              <w:left w:val="single" w:color="BFBFBF" w:sz="4"/>
-              <w:bottom w:val="single" w:color="BFBFBF" w:sz="4"/>
-              <w:right w:val="single" w:color="BFBFBF" w:sz="4"/>
-            </w:tcBorders>
-            <w:tcMar>
-              <w:top w:type="dxa" w:w="40"/>
-              <w:left w:type="dxa" w:w="80"/>
-              <w:bottom w:type="dxa" w:w="40"/>
-              <w:right w:type="dxa" w:w="80"/>
-            </w:tcMar>
-          </w:tcPr>
-          <w:p>
-            <w:r>
-              <w:rPr>
-                <w:b w:val="false"/>
-                <w:bCs w:val="false"/>
-                <w:sz w:val="16"/>
-                <w:szCs w:val="16"/>
-              </w:rPr>
-              <w:t xml:space="preserve">2026-12-22</w:t>
-            </w:r>
-          </w:p>
-        </w:tc>
-        <w:tc>
-          <w:tcPr>
-            <w:tcW w:type="dxa" w:w="1170"/>
-            <w:tcBorders>
-              <w:top w:val="single" w:color="BFBFBF" w:sz="4"/>
-              <w:left w:val="single" w:color="BFBFBF" w:sz="4"/>
-              <w:bottom w:val="single" w:color="BFBFBF" w:sz="4"/>
-              <w:right w:val="single" w:color="BFBFBF" w:sz="4"/>
-            </w:tcBorders>
-            <w:tcMar>
-              <w:top w:type="dxa" w:w="40"/>
-              <w:left w:type="dxa" w:w="80"/>
-              <w:bottom w:type="dxa" w:w="40"/>
-              <w:right w:type="dxa" w:w="80"/>
-            </w:tcMar>
-          </w:tcPr>
-          <w:p>
-            <w:r>
-              <w:rPr>
-                <w:b w:val="false"/>
-                <w:bCs w:val="false"/>
-                <w:sz w:val="16"/>
-                <w:szCs w:val="16"/>
-              </w:rPr>
-              <w:t xml:space="preserve">— (not reordered)</w:t>
-            </w:r>
-          </w:p>
-        </w:tc>
-      </w:tr>
-      <w:tr>
-        <w:trPr>
-          <w:tblHeader w:val="off"/>
-        </w:trPr>
-        <w:tc>
-          <w:tcPr>
-            <w:tcW w:type="dxa" w:w="1170"/>
-            <w:tcBorders>
-              <w:top w:val="single" w:color="BFBFBF" w:sz="4"/>
-              <w:left w:val="single" w:color="BFBFBF" w:sz="4"/>
-              <w:bottom w:val="single" w:color="BFBFBF" w:sz="4"/>
-              <w:right w:val="single" w:color="BFBFBF" w:sz="4"/>
-            </w:tcBorders>
-            <w:tcMar>
-              <w:top w:type="dxa" w:w="40"/>
-              <w:left w:type="dxa" w:w="80"/>
-              <w:bottom w:type="dxa" w:w="40"/>
-              <w:right w:type="dxa" w:w="80"/>
-            </w:tcMar>
-          </w:tcPr>
-          <w:p>
-            <w:r>
-              <w:rPr>
-                <w:b w:val="false"/>
-                <w:bCs w:val="false"/>
-                <w:sz w:val="16"/>
-                <w:szCs w:val="16"/>
-              </w:rPr>
-              <w:t xml:space="preserve">Stripe Queen Red</w:t>
-            </w:r>
-          </w:p>
-        </w:tc>
-        <w:tc>
-          <w:tcPr>
-            <w:tcW w:type="dxa" w:w="1170"/>
-            <w:tcBorders>
-              <w:top w:val="single" w:color="BFBFBF" w:sz="4"/>
-              <w:left w:val="single" w:color="BFBFBF" w:sz="4"/>
-              <w:bottom w:val="single" w:color="BFBFBF" w:sz="4"/>
-              <w:right w:val="single" w:color="BFBFBF" w:sz="4"/>
-            </w:tcBorders>
-            <w:tcMar>
-              <w:top w:type="dxa" w:w="40"/>
-              <w:left w:type="dxa" w:w="80"/>
-              <w:bottom w:type="dxa" w:w="40"/>
-              <w:right w:type="dxa" w:w="80"/>
-            </w:tcMar>
-          </w:tcPr>
-          <w:p>
-            <w:r>
-              <w:rPr>
-                <w:b w:val="false"/>
-                <w:bCs w:val="false"/>
-                <w:sz w:val="16"/>
-                <w:szCs w:val="16"/>
-              </w:rPr>
-              <w:t xml:space="preserve">LTSF</w:t>
-            </w:r>
-          </w:p>
-        </w:tc>
-        <w:tc>
-          <w:tcPr>
-            <w:tcW w:type="dxa" w:w="1170"/>
-            <w:tcBorders>
-              <w:top w:val="single" w:color="BFBFBF" w:sz="4"/>
-              <w:left w:val="single" w:color="BFBFBF" w:sz="4"/>
-              <w:bottom w:val="single" w:color="BFBFBF" w:sz="4"/>
-              <w:right w:val="single" w:color="BFBFBF" w:sz="4"/>
-            </w:tcBorders>
-            <w:tcMar>
-              <w:top w:type="dxa" w:w="40"/>
-              <w:left w:type="dxa" w:w="80"/>
-              <w:bottom w:type="dxa" w:w="40"/>
-              <w:right w:type="dxa" w:w="80"/>
-            </w:tcMar>
-          </w:tcPr>
-          <w:p>
-            <w:r>
-              <w:rPr>
-                <w:b w:val="false"/>
-                <w:bCs w:val="false"/>
-                <w:sz w:val="16"/>
-                <w:szCs w:val="16"/>
-              </w:rPr>
-              <w:t xml:space="preserve">79</w:t>
-            </w:r>
-          </w:p>
-        </w:tc>
-        <w:tc>
-          <w:tcPr>
-            <w:tcW w:type="dxa" w:w="1170"/>
-            <w:tcBorders>
-              <w:top w:val="single" w:color="BFBFBF" w:sz="4"/>
-              <w:left w:val="single" w:color="BFBFBF" w:sz="4"/>
-              <w:bottom w:val="single" w:color="BFBFBF" w:sz="4"/>
-              <w:right w:val="single" w:color="BFBFBF" w:sz="4"/>
-            </w:tcBorders>
-            <w:tcMar>
-              <w:top w:type="dxa" w:w="40"/>
-              <w:left w:type="dxa" w:w="80"/>
-              <w:bottom w:type="dxa" w:w="40"/>
-              <w:right w:type="dxa" w:w="80"/>
-            </w:tcMar>
-          </w:tcPr>
-          <w:p>
-            <w:r>
-              <w:rPr>
-                <w:b w:val="false"/>
-                <w:bCs w:val="false"/>
-                <w:sz w:val="16"/>
-                <w:szCs w:val="16"/>
-              </w:rPr>
-              <w:t xml:space="preserve">0.03</w:t>
-            </w:r>
-          </w:p>
-        </w:tc>
-        <w:tc>
-          <w:tcPr>
-            <w:tcW w:type="dxa" w:w="1170"/>
-            <w:tcBorders>
-              <w:top w:val="single" w:color="BFBFBF" w:sz="4"/>
-              <w:left w:val="single" w:color="BFBFBF" w:sz="4"/>
-              <w:bottom w:val="single" w:color="BFBFBF" w:sz="4"/>
-              <w:right w:val="single" w:color="BFBFBF" w:sz="4"/>
-            </w:tcBorders>
-            <w:tcMar>
-              <w:top w:type="dxa" w:w="40"/>
-              <w:left w:type="dxa" w:w="80"/>
-              <w:bottom w:type="dxa" w:w="40"/>
-              <w:right w:type="dxa" w:w="80"/>
-            </w:tcMar>
-          </w:tcPr>
-          <w:p>
-            <w:r>
-              <w:rPr>
-                <w:b w:val="false"/>
-                <w:bCs w:val="false"/>
-                <w:sz w:val="16"/>
-                <w:szCs w:val="16"/>
-              </w:rPr>
-              <w:t xml:space="preserve">1.34</w:t>
-            </w:r>
-          </w:p>
-        </w:tc>
-        <w:tc>
-          <w:tcPr>
-            <w:tcW w:type="dxa" w:w="1170"/>
-            <w:tcBorders>
-              <w:top w:val="single" w:color="BFBFBF" w:sz="4"/>
-              <w:left w:val="single" w:color="BFBFBF" w:sz="4"/>
-              <w:bottom w:val="single" w:color="BFBFBF" w:sz="4"/>
-              <w:right w:val="single" w:color="BFBFBF" w:sz="4"/>
-            </w:tcBorders>
-            <w:tcMar>
-              <w:top w:type="dxa" w:w="40"/>
-              <w:left w:type="dxa" w:w="80"/>
-              <w:bottom w:type="dxa" w:w="40"/>
-              <w:right w:type="dxa" w:w="80"/>
-            </w:tcMar>
-          </w:tcPr>
-          <w:p>
-            <w:r>
-              <w:rPr>
-                <w:b w:val="false"/>
-                <w:bCs w:val="false"/>
-                <w:sz w:val="16"/>
-                <w:szCs w:val="16"/>
-              </w:rPr>
-              <w:t xml:space="preserve">after 31 Jan</w:t>
-            </w:r>
-          </w:p>
-        </w:tc>
-        <w:tc>
-          <w:tcPr>
-            <w:tcW w:type="dxa" w:w="1170"/>
-            <w:tcBorders>
-              <w:top w:val="single" w:color="BFBFBF" w:sz="4"/>
-              <w:left w:val="single" w:color="BFBFBF" w:sz="4"/>
-              <w:bottom w:val="single" w:color="BFBFBF" w:sz="4"/>
-              <w:right w:val="single" w:color="BFBFBF" w:sz="4"/>
-            </w:tcBorders>
-            <w:tcMar>
-              <w:top w:type="dxa" w:w="40"/>
-              <w:left w:type="dxa" w:w="80"/>
-              <w:bottom w:type="dxa" w:w="40"/>
-              <w:right w:type="dxa" w:w="80"/>
-            </w:tcMar>
-          </w:tcPr>
-          <w:p>
-            <w:r>
-              <w:rPr>
-                <w:b w:val="false"/>
-                <w:bCs w:val="false"/>
-                <w:sz w:val="16"/>
-                <w:szCs w:val="16"/>
-              </w:rPr>
-              <w:t xml:space="preserve">2026-11-11</w:t>
-            </w:r>
-          </w:p>
-        </w:tc>
-        <w:tc>
-          <w:tcPr>
-            <w:tcW w:type="dxa" w:w="1170"/>
-            <w:tcBorders>
-              <w:top w:val="single" w:color="BFBFBF" w:sz="4"/>
-              <w:left w:val="single" w:color="BFBFBF" w:sz="4"/>
-              <w:bottom w:val="single" w:color="BFBFBF" w:sz="4"/>
-              <w:right w:val="single" w:color="BFBFBF" w:sz="4"/>
-            </w:tcBorders>
-            <w:tcMar>
-              <w:top w:type="dxa" w:w="40"/>
-              <w:left w:type="dxa" w:w="80"/>
-              <w:bottom w:type="dxa" w:w="40"/>
-              <w:right w:type="dxa" w:w="80"/>
-            </w:tcMar>
-          </w:tcPr>
-          <w:p>
-            <w:r>
-              <w:rPr>
-                <w:b w:val="false"/>
-                <w:bCs w:val="false"/>
-                <w:sz w:val="16"/>
-                <w:szCs w:val="16"/>
-              </w:rPr>
-              <w:t xml:space="preserve">— (not reordered)</w:t>
-            </w:r>
-          </w:p>
-        </w:tc>
-      </w:tr>
-      <w:tr>
-        <w:trPr>
-          <w:tblHeader w:val="off"/>
-        </w:trPr>
-        <w:tc>
-          <w:tcPr>
-            <w:tcW w:type="dxa" w:w="1170"/>
-            <w:tcBorders>
-              <w:top w:val="single" w:color="BFBFBF" w:sz="4"/>
-              <w:left w:val="single" w:color="BFBFBF" w:sz="4"/>
-              <w:bottom w:val="single" w:color="BFBFBF" w:sz="4"/>
-              <w:right w:val="single" w:color="BFBFBF" w:sz="4"/>
-            </w:tcBorders>
-            <w:tcMar>
-              <w:top w:type="dxa" w:w="40"/>
-              <w:left w:type="dxa" w:w="80"/>
-              <w:bottom w:type="dxa" w:w="40"/>
-              <w:right w:type="dxa" w:w="80"/>
-            </w:tcMar>
-          </w:tcPr>
-          <w:p>
-            <w:r>
-              <w:rPr>
-                <w:b w:val="false"/>
-                <w:bCs w:val="false"/>
-                <w:sz w:val="16"/>
-                <w:szCs w:val="16"/>
-              </w:rPr>
               <w:t xml:space="preserve">Twin Black</w:t>
             </w:r>
           </w:p>
@@ -23872,7 +22120,7 @@
                 <w:sz w:val="16"/>
                 <w:szCs w:val="16"/>
               </w:rPr>
-              <w:t xml:space="preserve">2027-01-28</w:t>
+              <w:t xml:space="preserve">2027-01-27</w:t>
             </w:r>
           </w:p>
         </w:tc>
@@ -24173,7 +22421,7 @@
         <w:spacing w:after="120"/>
       </w:pPr>
       <w:r>
-        <w:t xml:space="preserve">Stock counted = sellable + FC transfer + inbound already shipped (Sellerboard, 29 Sep), projected with last year's monthly lift. Queen Black has 300 units in a shipment plan that was never shipped: ship it now. An LTSF SKU running out under the plan is the goal (its aged stock is sold), not a reorder signal.</w:t>
+        <w:t xml:space="preserve">Stock counted = sellable + FC transfer + inbound already shipped (Sellerboard, 29 Sep), projected with last year's monthly lift. Queen Black has 300 units in a shipment plan that was never shipped: ship it now; the reorder after that plan is about 895 units. Deal days (30 Sep, 7, 12 and 24 Oct) are counted at ×1.33 of a normal day, the lift the July deal gave. Any recovery from the listing changes would bring the stock-out earlier; re-check weekly. An LTSF SKU running out under the plan is the goal (its aged stock is sold), not a reorder signal.</w:t>
       </w:r>
     </w:p>
     <w:p>
@@ -24619,7 +22867,7 @@
                 <w:sz w:val="16"/>
                 <w:szCs w:val="16"/>
               </w:rPr>
-              <w:t xml:space="preserve">$24,358</w:t>
+              <w:t xml:space="preserve">$24,664</w:t>
             </w:r>
           </w:p>
         </w:tc>
@@ -24647,7 +22895,7 @@
                 <w:sz w:val="16"/>
                 <w:szCs w:val="16"/>
               </w:rPr>
-              <w:t xml:space="preserve">$4,707</w:t>
+              <w:t xml:space="preserve">$4,820</w:t>
             </w:r>
           </w:p>
         </w:tc>
@@ -24675,7 +22923,7 @@
                 <w:sz w:val="16"/>
                 <w:szCs w:val="16"/>
               </w:rPr>
-              <w:t xml:space="preserve">19.3%</w:t>
+              <w:t xml:space="preserve">19.5%</w:t>
             </w:r>
           </w:p>
         </w:tc>
@@ -24703,7 +22951,7 @@
                 <w:sz w:val="16"/>
                 <w:szCs w:val="16"/>
               </w:rPr>
-              <w:t xml:space="preserve">−$2,461</w:t>
+              <w:t xml:space="preserve">−$2,225</w:t>
             </w:r>
           </w:p>
         </w:tc>
@@ -24731,7 +22979,7 @@
                 <w:sz w:val="16"/>
                 <w:szCs w:val="16"/>
               </w:rPr>
-              <w:t xml:space="preserve">-10.1%</w:t>
+              <w:t xml:space="preserve">-9.0%</w:t>
             </w:r>
           </w:p>
         </w:tc>
@@ -24764,7 +23012,7 @@
                 <w:sz w:val="16"/>
                 <w:szCs w:val="16"/>
               </w:rPr>
-              <w:t xml:space="preserve">of which Ranking – maintain</w:t>
+              <w:t xml:space="preserve">of which Other non-ranking</w:t>
             </w:r>
           </w:p>
         </w:tc>
@@ -24792,7 +23040,7 @@
                 <w:sz w:val="16"/>
                 <w:szCs w:val="16"/>
               </w:rPr>
-              <w:t xml:space="preserve">$587</w:t>
+              <w:t xml:space="preserve">−$519</w:t>
             </w:r>
           </w:p>
         </w:tc>
@@ -24820,7 +23068,7 @@
                 <w:sz w:val="16"/>
                 <w:szCs w:val="16"/>
               </w:rPr>
-              <w:t xml:space="preserve">$304</w:t>
+              <w:t xml:space="preserve">−$259</w:t>
             </w:r>
           </w:p>
         </w:tc>
@@ -24876,7 +23124,7 @@
                 <w:sz w:val="16"/>
                 <w:szCs w:val="16"/>
               </w:rPr>
-              <w:t xml:space="preserve">−$247</w:t>
+              <w:t xml:space="preserve">$171</w:t>
             </w:r>
           </w:p>
         </w:tc>
@@ -24937,7 +23185,7 @@
                 <w:sz w:val="16"/>
                 <w:szCs w:val="16"/>
               </w:rPr>
-              <w:t xml:space="preserve">of which Other non-ranking</w:t>
+              <w:t xml:space="preserve">of which LTSF clearance</w:t>
             </w:r>
           </w:p>
         </w:tc>
@@ -24965,7 +23213,7 @@
                 <w:sz w:val="16"/>
                 <w:szCs w:val="16"/>
               </w:rPr>
-              <w:t xml:space="preserve">−$921</w:t>
+              <w:t xml:space="preserve">−$732</w:t>
             </w:r>
           </w:p>
         </w:tc>
@@ -24993,7 +23241,7 @@
                 <w:sz w:val="16"/>
                 <w:szCs w:val="16"/>
               </w:rPr>
-              <w:t xml:space="preserve">−$314</w:t>
+              <w:t xml:space="preserve">−$163</w:t>
             </w:r>
           </w:p>
         </w:tc>
@@ -25049,7 +23297,7 @@
                 <w:sz w:val="16"/>
                 <w:szCs w:val="16"/>
               </w:rPr>
-              <w:t xml:space="preserve">$153</w:t>
+              <w:t xml:space="preserve">$395</w:t>
             </w:r>
           </w:p>
         </w:tc>
@@ -25110,7 +23358,7 @@
                 <w:sz w:val="16"/>
                 <w:szCs w:val="16"/>
               </w:rPr>
-              <w:t xml:space="preserve">of which Ranking – push</w:t>
+              <w:t xml:space="preserve">of which Ranking – maintain</w:t>
             </w:r>
           </w:p>
         </w:tc>
@@ -25138,7 +23386,7 @@
                 <w:sz w:val="16"/>
                 <w:szCs w:val="16"/>
               </w:rPr>
-              <w:t xml:space="preserve">$3,659</w:t>
+              <w:t xml:space="preserve">$289</w:t>
             </w:r>
           </w:p>
         </w:tc>
@@ -25166,7 +23414,7 @@
                 <w:sz w:val="16"/>
                 <w:szCs w:val="16"/>
               </w:rPr>
-              <w:t xml:space="preserve">$1,620</w:t>
+              <w:t xml:space="preserve">$79</w:t>
             </w:r>
           </w:p>
         </w:tc>
@@ -25222,7 +23470,7 @@
                 <w:sz w:val="16"/>
                 <w:szCs w:val="16"/>
               </w:rPr>
-              <w:t xml:space="preserve">−$1,188</w:t>
+              <w:t xml:space="preserve">−$49</w:t>
             </w:r>
           </w:p>
         </w:tc>
@@ -25283,7 +23531,7 @@
                 <w:sz w:val="16"/>
                 <w:szCs w:val="16"/>
               </w:rPr>
-              <w:t xml:space="preserve">of which LTSF clearance</w:t>
+              <w:t xml:space="preserve">of which Ranking – push</w:t>
             </w:r>
           </w:p>
         </w:tc>
@@ -25311,7 +23559,7 @@
                 <w:sz w:val="16"/>
                 <w:szCs w:val="16"/>
               </w:rPr>
-              <w:t xml:space="preserve">−$59</w:t>
+              <w:t xml:space="preserve">$4,534</w:t>
             </w:r>
           </w:p>
         </w:tc>
@@ -25339,7 +23587,7 @@
                 <w:sz w:val="16"/>
                 <w:szCs w:val="16"/>
               </w:rPr>
-              <w:t xml:space="preserve">−$17</w:t>
+              <w:t xml:space="preserve">$2,046</w:t>
             </w:r>
           </w:p>
         </w:tc>
@@ -25395,7 +23643,7 @@
                 <w:sz w:val="16"/>
                 <w:szCs w:val="16"/>
               </w:rPr>
-              <w:t xml:space="preserve">$23</w:t>
+              <w:t xml:space="preserve">−$1,539</w:t>
             </w:r>
           </w:p>
         </w:tc>
@@ -25512,7 +23760,7 @@
                 <w:sz w:val="16"/>
                 <w:szCs w:val="16"/>
               </w:rPr>
-              <w:t xml:space="preserve">−$2</w:t>
+              <w:t xml:space="preserve">$0</w:t>
             </w:r>
           </w:p>
         </w:tc>
@@ -25568,7 +23816,7 @@
                 <w:sz w:val="16"/>
                 <w:szCs w:val="16"/>
               </w:rPr>
-              <w:t xml:space="preserve">$2</w:t>
+              <w:t xml:space="preserve">$0</w:t>
             </w:r>
           </w:p>
         </w:tc>
@@ -25613,6 +23861,14 @@
       </w:pPr>
       <w:r>
         <w:t xml:space="preserve">Direct ad effects only (30-day equivalent). Organic sales gained from better rank are not counted — they are the return the push is buying. August for comparison: 1,653 units, ads $10,603, net −$5,420. Break-even ACoS is per child from Sellerboard (profit before ads ÷ sales, 30 days, with realised prices, refunds, storage and inbound fees); it is lower than the audit's 23.6% (see Conflicts).</w:t>
+      </w:r>
+    </w:p>
+    <w:p>
+      <w:pPr>
+        <w:spacing w:after="120"/>
+      </w:pPr>
+      <w:r>
+        <w:t xml:space="preserve">Payback: the push costs $1,539 a month in direct profit. At $2.90 profit before ads per unit (last 30 days) it needs about 530 more organic units a month to pay back (+94% on today's 566 organic units). The cost is a floor: 9 of the 15 pushed terms get a top-of-search price rise of 5% or less (satin sheets, black satin sheets, silk bed sheets queen, queen satin sheet set, black satin sheets queen, queen silk sheets, satin bed sheets queen, king size satin sheets, silk queen sheets), while their click targets rise several-fold. If clicks stay short, the weekly +10% price step raises the cost. Read the push as a bet on Q4 rank, and size it with that in mind.</w:t>
       </w:r>
     </w:p>
     <w:p>
@@ -25634,7 +23890,7 @@
         <w:spacing w:after="80"/>
       </w:pPr>
       <w:r>
-        <w:t xml:space="preserve">1. Listing: restore the search words in the titles (satin bed sheets, silky, 6 piece, bedding set, 15" deep pocket, colour) and correct the Twin titles from "4 Pc" to "6 Pc". Check the Seller Central change history for 20–30 Aug.</w:t>
+        <w:t xml:space="preserve">1. Listing: use the 75 characters for search words (for example "DECOLURE Satin Bed Sheets Queen Size, 6 Piece Silky Deep Pocket Set, Black") and put the dropped words in the 125-character Item Highlights (bedding set, wrinkle-free, 15" deep pocket, hair and skin; 4 pillowcases on Full, Queen and King). The Twin titles ('4 Pc') are correct. Check the Seller Central change history for 20–30 Aug.</w:t>
       </w:r>
     </w:p>
     <w:p>
@@ -25647,7 +23903,7 @@
         <w:spacing w:after="80"/>
       </w:pPr>
       <w:r>
-        <w:t xml:space="preserve">2. Stock: ship the 300-unit Queen Black plan now and reorder about 876 Queen Black units to reach 31 Jan at the plan's pace.</w:t>
+        <w:t xml:space="preserve">2. Stock: ship the 300-unit Queen Black plan now and reorder about 895 more Queen Black units to reach 31 Jan at the plan's pace (Stock &amp; reorder tab).</w:t>
       </w:r>
     </w:p>
     <w:p>
@@ -25660,7 +23916,7 @@
         <w:spacing w:after="80"/>
       </w:pPr>
       <w:r>
-        <w:t xml:space="preserve">3. Ranking owners (Campaigns tab, "Ranking – push/maintain"): move the product ad to the preferred Black child where needed; set TOS 900% / ROS 0% / PP 0%, the base bid and budget shown, bidding "down only"; load the back-up child's ad PAUSED.</w:t>
+        <w:t xml:space="preserve">3. Ranking campaigns (Action list, step 3): move the product ad to the preferred Black child where needed; TOS 900% / ROS 0% / PP 0%, the base bid and budget shown; load the back-up child's ad PAUSED. Bidding stays "Dynamic bids – down only" (LEGACY_FOR_SALES is the same setting).</w:t>
       </w:r>
     </w:p>
     <w:p>
@@ -25673,7 +23929,7 @@
         <w:spacing w:after="80"/>
       </w:pPr>
       <w:r>
-        <w:t xml:space="preserve">4. Pause the duplicate exact campaigns listed. Every other enabled exact campaign: TOS 900% / ROS 0% / PP 0% with the base bids shown.</w:t>
+        <w:t xml:space="preserve">4. Pause the duplicate exact campaigns and duplicate targets listed (step 4).</w:t>
       </w:r>
     </w:p>
     <w:p>
@@ -25686,7 +23942,7 @@
         <w:spacing w:after="80"/>
       </w:pPr>
       <w:r>
-        <w:t xml:space="preserve">5. LTSF: fix the LTSF campaigns' product ads, move non-ranking traffic to the LTSF SKUs listed, set colour exacts on their LTSF SKU, and run the promos the sheet calls for.</w:t>
+        <w:t xml:space="preserve">5. LTSF (step 5): add the missing LTSF SKUs to the LTSF campaigns, pause their ads on out-of-stock children, move the listed non-ranking traffic to the LTSF SKUs, set colour exacts, and run the promos the sheet calls for.</w:t>
       </w:r>
     </w:p>
     <w:p>
@@ -25699,7 +23955,7 @@
         <w:spacing w:after="80"/>
       </w:pPr>
       <w:r>
-        <w:t xml:space="preserve">6. Non-ranking: one −15% step where ACoS is above the child's break-even; re-read after 7 clean days; stop if the term's organic rank slips 3 places. Add the negative exacts from the Keywords tab.</w:t>
+        <w:t xml:space="preserve">6. Non-ranking (step 6): one −15% step where ACoS is above the child's break-even; re-read after 7 clean days; stop if the term's organic rank slips by more than its rank guard. Add the negative exacts and harvested exacts (Keyword changes tab).</w:t>
       </w:r>
     </w:p>
     <w:p>
@@ -25712,7 +23968,7 @@
         <w:spacing w:after="80"/>
       </w:pPr>
       <w:r>
-        <w:t xml:space="preserve">7. Daily for two weeks: ranking clicks against target, top-of-search share, rank on each push term, days of cover on every preferred child (under 14 → switch to the back-up). Re-test the held terms after the title fix.</w:t>
+        <w:t xml:space="preserve">7. After 7 Oct (step 7): top-of-search only on the non-ranking exact campaigns with at least 20 top-of-search clicks in 90 days.</w:t>
       </w:r>
     </w:p>
     <w:p>
@@ -25725,7 +23981,20 @@
         <w:spacing w:after="80"/>
       </w:pPr>
       <w:r>
-        <w:t xml:space="preserve">Everything in 3–6 is in the Bulk upload tab of the action plan, with campaign, ad group and keyword IDs where Sellerboard provides them.</w:t>
+        <w:t xml:space="preserve">Daily for two weeks: ranking clicks against target, top-of-search share, rank on each push term, days of cover on every preferred child (under 14 → switch to the back-up). Re-test the trial terms after 14 days.</w:t>
+      </w:r>
+    </w:p>
+    <w:p>
+      <w:pPr>
+        <w:pStyle w:val="ListParagraph"/>
+        <w:numPr>
+          <w:ilvl w:val="0"/>
+          <w:numId w:val="2"/>
+        </w:numPr>
+        <w:spacing w:after="80"/>
+      </w:pPr>
+      <w:r>
+        <w:t xml:space="preserve">This week (Lightning Deal 30 Sep, Prime Big Deal Days 7 Oct): steps 1–3 only. Everything in steps 3–7 is in the action plan (DSS6_Action_Plan): the Action list, the Keyword changes tab, and the Bulk upload tab (rows with every ID they need; the rest are in "Needs console IDs").</w:t>
       </w:r>
     </w:p>
     <w:p>
@@ -25747,7 +24016,7 @@
         <w:spacing w:after="80"/>
       </w:pPr>
       <w:r>
-        <w:t xml:space="preserve">The push size. The full push costs about $1,620 more a month for $3,659 of ad sales (direct profit −$1,188), on a product that already loses money. Starting after the title fix is the cheaper order. The Push-cost tab lets you drop terms.</w:t>
+        <w:t xml:space="preserve">The push size. The full push costs about $2,046 more a month for $4,534 of ad sales (direct profit −$1,539), on a product that already loses money. It pays back only if rank adds about 530 organic units a month. Starting after the listing changes is the cheaper order. The Push-cost tab lets you drop terms.</w:t>
       </w:r>
     </w:p>
     <w:p>
@@ -25773,7 +24042,7 @@
         <w:spacing w:after="80"/>
       </w:pPr>
       <w:r>
-        <w:t xml:space="preserve">If the Queen Black reorder cannot land before about 2026-12-01, stop the Queen push two weeks earlier; rank built on stock that runs out in peak season is lost.</w:t>
+        <w:t xml:space="preserve">If the Queen Black reorder cannot land before about 2026-11-21, stop the Queen push two weeks earlier; rank built on stock that runs out in peak season is lost.</w:t>
       </w:r>
     </w:p>
     <w:p>
@@ -25786,7 +24055,20 @@
         <w:spacing w:after="80"/>
       </w:pPr>
       <w:r>
-        <w:t xml:space="preserve">The step size on non-ranking campaigns (−15% a week here) and the conversion gate (half our usual conversion index) are settings, not numbers the data fixes.</w:t>
+        <w:t xml:space="preserve">The step size on non-ranking campaigns (−15% a week here), the conversion gate (half our usual conversion index, 95% test) and the 60-day LTSF routing cap are settings, not numbers the data fixes.</w:t>
+      </w:r>
+    </w:p>
+    <w:p>
+      <w:pPr>
+        <w:pStyle w:val="ListParagraph"/>
+        <w:numPr>
+          <w:ilvl w:val="0"/>
+          <w:numId w:val="2"/>
+        </w:numPr>
+        <w:spacing w:after="80"/>
+      </w:pPr>
+      <w:r>
+        <w:t xml:space="preserve">The ranking figures rest on one tracked ASIN outside the catalog. Re-point the Rank Radar to Queen Black before relying on share targets.</w:t>
       </w:r>
     </w:p>
     <w:p>
@@ -28543,7 +26825,7 @@
                 <w:sz w:val="16"/>
                 <w:szCs w:val="16"/>
               </w:rPr>
-              <w:t xml:space="preserve">Twin titles say "4 Pc"</w:t>
+              <w:t xml:space="preserve">Title change date</w:t>
             </w:r>
           </w:p>
         </w:tc>
@@ -28571,7 +26853,7 @@
                 <w:sz w:val="16"/>
                 <w:szCs w:val="16"/>
               </w:rPr>
-              <w:t xml:space="preserve">21 Twin children titled '… Luxury 4 Pc Bed Set' since the 26 Aug title rewrite vs Product is a 6-piece set (Command Center product 31, SKU names 6PCS)</w:t>
+              <w:t xml:space="preserve">Command Center event 'New Title &amp; Item Highlights' on 2026-08-25 vs Data Dive listing changes: title change detected 26 Aug</w:t>
             </w:r>
           </w:p>
         </w:tc>
@@ -28599,7 +26881,7 @@
                 <w:sz w:val="16"/>
                 <w:szCs w:val="16"/>
               </w:rPr>
-              <w:t xml:space="preserve">Listing fix: correct the Twin titles to 6 Pc (a shopper looking for 6 pieces may skip them)</w:t>
+              <w:t xml:space="preserve">Change dated 25–26 Aug; Amazon's 75-character title limit (in force since 27 Jul)</w:t>
             </w:r>
           </w:p>
         </w:tc>
@@ -28627,7 +26909,7 @@
                 <w:sz w:val="16"/>
                 <w:szCs w:val="16"/>
               </w:rPr>
-              <w:t xml:space="preserve">Open (listing)</w:t>
+              <w:t xml:space="preserve">Resolved</w:t>
             </w:r>
           </w:p>
         </w:tc>
@@ -28805,7 +27087,7 @@
                 <w:sz w:val="16"/>
                 <w:szCs w:val="16"/>
               </w:rPr>
-              <w:t xml:space="preserve">Audit: King: hero SATIN-RED-KING-6PCS (RED), serving SATIN-KING-BLACK-6-PCS; Queen: hero SATIN-WHITE-QUEEN-6PCS (GREEN), serving SATIN-QUEEN-BLACK-6-PCS; Full: hero SATIN-6PC-FULL-WHITE (GREEN), serving SATIN-FULL-BLACK-6PCS; Twin</w:t>
+              <w:t xml:space="preserve">Audit: King: hero SATIN-RED-KING-6PCS (RED), serving SATIN-KING-BLACK-6-PCS; Queen: hero SATIN-WHITE-QUEEN-6PCS (GREEN), serving SATIN-QUEEN-BLACK-6-PCS; Full: hero SATIN-6PC-FULL-WHITE (GREEN), serving SATIN-FULL-BLACK-6PCS; Twin: hero SATIN-WHITE-TWIN-6PCS (GREEN), serving SATIN-TWIN-BLACK-6PCS vs Preferred child per size: Queen: SATIN-QUEEN-BLACK-6-PCS, King: SATIN-KING-BLACK-6-PCS, Full: SATIN-FULL-BLACK-6PCS, Twin: SATIN-TWIN-BLACK-6PCS</w:t>
             </w:r>
           </w:p>
         </w:tc>

</xml_diff>

<commit_message>
DSS6: never lower base bids; validate against the 30 Sep audit re-export
A base bid cut to a tenth under a 900% modifier loses the rest-of-search and
product-page auctions (53% of ranking-campaign clicks). Base bids and ROS/PP
modifiers are now kept; pushed terms reach their top-of-search price by
raising the top-of-search modifier; held terms are untouched; non-ranking
placements are unchanged. Rebuilt on the re-exported audit (same run and
decisions; break-even 23.4%, fifth planned deal on 30 Oct).

Co-Authored-By: Claude Opus 5.5 <noreply@anthropic.com>
Claude-Session: https://claude.ai/code/session_01LY7A1KPDoE1cQtWdmceR2R
</commit_message>
<xml_diff>
--- a/docs/DSS6_Audit_Review_20260929.docx
+++ b/docs/DSS6_Audit_Review_20260929.docx
@@ -87,7 +87,7 @@
         <w:spacing w:after="80"/>
       </w:pPr>
       <w:r>
-        <w:t xml:space="preserve">The audit's cuts toward break-even are not followed on ranking terms. Of its 58 price, modifier and budget cuts, 19 are on ranking terms: 16 are rejected and 3 changed. Of the 39 on other terms, 12 become one −15% step with a rank guard, 1 are accepted as they are, and 26 are not made.</w:t>
+        <w:t xml:space="preserve">The audit's cuts toward break-even are not followed on ranking terms. Of its 58 price, modifier and budget cuts, 19 are on ranking terms: 16 are rejected and 3 changed. Of the 39 on other terms, 20 become one −15% step with a rank guard, 1 are accepted as they are, and 18 are not made.</w:t>
       </w:r>
     </w:p>
     <w:p>
@@ -126,7 +126,7 @@
         <w:spacing w:after="80"/>
       </w:pPr>
       <w:r>
-        <w:t xml:space="preserve">Top of search: the 35 ranking campaigns go top-of-search only (900% modifier, base bid = top-of-search price ÷ 10, rest of search and product pages 0%). No ranking term is bid below what it bids today (a CPC is what the winning bid paid, so bidding at the CPC would lose auctions we win now). Held and trial terms keep today's price. Other exact campaigns wait until after Prime Big Deal Days (7 Oct), and only the 14 with at least 20 top-of-search clicks in 90 days change.</w:t>
+        <w:t xml:space="preserve">Bids: no base bid is lowered anywhere. The base bid is what a campaign pays on rest of search and product pages, where the ranking campaigns won 53% of their clicks in the last 90 days; cutting it to reach the top of search would lose those auctions. Pushed terms reach their top-of-search price by raising the top-of-search modifier on today's base (6 push campaigns). Base bids are never lowered. No ranking term is bid below what it bids today (a CPC is what the winning bid paid, so bidding at the CPC would lose auctions we win now). Held and trial terms keep today's bids and modifiers exactly. Other exact campaigns keep their placement set-up.</w:t>
       </w:r>
     </w:p>
     <w:p>
@@ -165,7 +165,7 @@
         <w:spacing w:after="80"/>
       </w:pPr>
       <w:r>
-        <w:t xml:space="preserve">Stock: Queen Black (563 counted, 300 more in a plan never shipped) runs out around 2026-11-21 at the plan's pace (October deal days included). It needs about 1,195 units to reach 31 Jan: ship the 300-unit plan and reorder about 895. King Black covers past 31 Jan. Full Black runs out around 2026-12-30.</w:t>
+        <w:t xml:space="preserve">Stock: Queen Black (563 counted, 300 more in a plan never shipped) runs out around 2026-11-21 at the plan's pace (October deal days included). It needs about 1,198 units to reach 31 Jan: ship the 300-unit plan and reorder about 898. King Black covers past 31 Jan. Full Black runs out around 2026-12-30.</w:t>
       </w:r>
     </w:p>
     <w:p>
@@ -178,7 +178,7 @@
         <w:spacing w:after="80"/>
       </w:pPr>
       <w:r>
-        <w:t xml:space="preserve">Money, stated plainly: this product lost money in 12 of the last 13 months; last Q4 lost $30,942 on $144,543 of sales. The last 30 days: −$1,204. Break-even ACoS is only 9% (Queen Black) to 26% (King Black). The plan raises ad spend from $3,117 to about $4,820 a month (still well below August's $10,603); direct net goes to about −$2,225. The push alone costs $1,539 a month in direct profit; at $2.90 profit before ads per unit it pays back only if rank adds about 530 organic units a month (+94% on today's 566). The cost is a floor: 9 of the 15 pushed terms get a top-of-search price rise of 5% or less while their click targets rise several-fold.</w:t>
+        <w:t xml:space="preserve">Money, stated plainly: this product lost money in 12 of the last 13 months; last Q4 lost $30,942 on $144,543 of sales. The last 30 days: −$1,204. Break-even ACoS is only 9% (Queen Black) to 26% (King Black). The plan raises ad spend from $3,117 to about $4,968 a month (still well below August's $10,603); direct net goes to about −$2,333. The push alone costs $1,539 a month in direct profit; at $2.90 profit before ads per unit it pays back only if rank adds about 530 organic units a month (+94% on today's 566). The cost is a floor: 0 of the 15 pushed terms get a top-of-search price rise of 5% or less while their click targets rise several-fold.</w:t>
       </w:r>
     </w:p>
     <w:p>
@@ -191,7 +191,7 @@
         <w:spacing w:after="80"/>
       </w:pPr>
       <w:r>
-        <w:t xml:space="preserve">This week (Lightning Deal 30 Sep, Prime Big Deal Days 7 Oct): steps 1–3 only — listing, stock, and the ranking campaigns. Steps 4–6 after the deals, step 7 after 7 Oct. The push size is an owner decision; the Push-cost tab lists every term.</w:t>
+        <w:t xml:space="preserve">This week (Lightning Deal 30 Sep, Prime Big Deal Days 7 Oct): steps 1–3 only — listing, stock, and the ranking campaigns. Steps 4–6 after the deals. The push size is an owner decision; the Push-cost tab lists every term.</w:t>
       </w:r>
     </w:p>
     <w:p>
@@ -2204,7 +2204,7 @@
         <w:spacing w:after="80"/>
       </w:pPr>
       <w:r>
-        <w:t xml:space="preserve">Deals: April Best Deal 14 Apr–27 Apr, May Lightning 1 May, May Best Deal 20 May–2 Jun, June Lightning 7 Jun, June Best Deal 25 Jun–8 Jul, July Lightning 18 Jul, July Best Deal 31 Jul–13 Aug, August Lightning 16 Aug. Nothing ran from 17 Aug to 29 Sep, the first month without a deal since April. Coming up: 2026-09-30 Lightning Deal; 2026-10-07 Lightning Deal · Prime Big Deal Days; 2026-10-12 Lightning Deal; 2026-10-24 Lightning Deal.</w:t>
+        <w:t xml:space="preserve">Deals: April Best Deal 14 Apr–27 Apr, May Lightning 1 May, May Best Deal 20 May–2 Jun, June Lightning 7 Jun, June Best Deal 25 Jun–8 Jul, July Lightning 18 Jul, July Best Deal 31 Jul–13 Aug, August Lightning 16 Aug. Nothing ran from 17 Aug to 29 Sep, the first month without a deal since April. Coming up: 2026-09-30 Lightning Deal; 2026-10-07 Lightning Deal · Prime Big Deal Days; 2026-10-12 Lightning Deal; 2026-10-24 Lightning Deal; 2026-10-30 Lightning Deal.</w:t>
       </w:r>
     </w:p>
     <w:p>
@@ -10215,7 +10215,7 @@
         <w:spacing w:after="80"/>
       </w:pPr>
       <w:r>
-        <w:t xml:space="preserve">Decision: push to the top 20. Top-of-search only, base bid $0.17, top-of-search price $1.7 (the highest of today's bid, the term's top-of-search CPC and the campaign's own 90-day top-of-search CPC), budget $24/day for 11.7 clicks a day. Cost over today $18.96/day for +1.29 orders/day. Stock: Queen Black to about 2026-11-21 at the plan's pace.</w:t>
+        <w:t xml:space="preserve">Decision: push to the top 20. Base bid kept at $0.67, top-of-search modifier 75% → 151%, top-of-search price $1.68 (the highest of today's bid, the term's top-of-search CPC and the campaign's own 90-day top-of-search CPC), budget $24/day for 11.7 clicks a day. Cost over today $18.96/day for +1.29 orders/day. Stock: Queen Black to about 2026-11-21 at the plan's pace.</w:t>
       </w:r>
     </w:p>
     <w:p>
@@ -10232,7 +10232,7 @@
         <w:spacing w:after="120"/>
       </w:pPr>
       <w:r>
-        <w:t xml:space="preserve">Every non-cosmetic decision in the audit (237; renames and retags excluded) was re-judged on the campaign's objective and its second-order effects: the share of our paid traffic on the term it carries, the term's rank and trend, the change in clicks, orders, sales, spend and profit, TACoS, the child's stock and LTSF status, and the competitors around us. Verdicts: REJECT 160; ACCEPT 44; MODIFY 29; REVIEW 4. Each verdict is read from the final action on the campaign, so the review, the campaign tab and this document agree.</w:t>
+        <w:t xml:space="preserve">Every non-cosmetic decision in the audit (237; renames and retags excluded) was re-judged on the campaign's objective and its second-order effects: the share of our paid traffic on the term it carries, the term's rank and trend, the change in clicks, orders, sales, spend and profit, TACoS, the child's stock and LTSF status, and the competitors around us. Verdicts: REJECT 158; ACCEPT 41; MODIFY 34; REVIEW 4. Each verdict is read from the final action on the campaign, so the review, the campaign tab and this document agree.</w:t>
       </w:r>
     </w:p>
     <w:p>
@@ -10673,7 +10673,7 @@
                 <w:sz w:val="16"/>
                 <w:szCs w:val="16"/>
               </w:rPr>
-              <w:t xml:space="preserve">Back-up child: If SATIN-KING-BLACK-6-PCS drops under 14 days of stock (or goes out of stock): enable SATIN-CHAMPAGNE-KING-6PCS, pause SATIN-KING-BLACK-6-PCS and set this campaign to maintain level (the back-up cannot carry the push). Switch back when SATIN-KING-BLACK-6-PCS has ≥30 days of stock. | Top-of-search only: modifier 900%, base bid $0.17 (top-of-search price $1.7, = today's effective top-of-search bid (bid × top-of-search modifier) — kept, never lowered on a ranking term); rest of search and product pages 0% → those placements drop to the $0.17 base | Budget $20/day (needs $6/day = the daily click target 2.8 × top-of-search CPC, +20% headroom; never lowered on a ranking campaign) (today 4.1 paid clicks/day on king silk sheet set, king size silk sheets set) | Also buys 3 other term(s) (king size silk sheet set, king size silk sheet sets, king silk sheets set) — they follow the campaign's top-of-search setting</w:t>
+              <w:t xml:space="preserve">Back-up child: If SATIN-KING-BLACK-6-PCS drops under 14 days of stock (or goes out of stock): enable SATIN-CHAMPAGNE-KING-6PCS, pause SATIN-KING-BLACK-6-PCS and set this campaign to maintain level (the back-up cannot carry the push). Switch back when SATIN-KING-BLACK-6-PCS has ≥30 days of stock. | Bids kept: base $1.36 and top-of-search modifier 25% unchanged (top-of-search price $1.7 = today's effective top-of-search bid (bid × top-of-search modifier) — kept, never lowered on a ranking term); rest of search and product pages keep today's bids | Budget $20/day (needs $6/day = the daily click target 2.8 × top-of-search CPC, +20% headroom; never lowered on a ranking campaign) (today 4.1 paid clicks/day on king silk sheet set, king size silk sheets set) | Also buys 3 other term(s) (king size silk sheet set, king size silk sheet sets, king silk sheets set) — their base bids are kept; at the top of search they follow the campaign's modifier</w:t>
             </w:r>
           </w:p>
         </w:tc>
@@ -10818,7 +10818,7 @@
                 <w:sz w:val="16"/>
                 <w:szCs w:val="16"/>
               </w:rPr>
-              <w:t xml:space="preserve">TOS modifier → 900%</w:t>
+              <w:t xml:space="preserve">TOS modifier → 25%</w:t>
             </w:r>
           </w:p>
         </w:tc>
@@ -10846,7 +10846,7 @@
                 <w:sz w:val="16"/>
                 <w:szCs w:val="16"/>
               </w:rPr>
-              <w:t xml:space="preserve">Back-up child: If SATIN-KING-BLACK-6-PCS drops under 14 days of stock (or goes out of stock): enable SATIN-CHAMPAGNE-KING-6PCS, pause SATIN-KING-BLACK-6-PCS and set this campaign to maintain level (the back-up cannot carry the push). Switch back when SATIN-KING-BLACK-6-PCS has ≥30 days of stock. | Top-of-search only: modifier 900%, base bid $0.17 (top-of-search price $1.7, = today's effective top-of-search bid (bid × top-of-search modifier) — kept, never lowered on a ranking term); rest of search and product pages 0% → those placements drop to the $0.17 base | Budget $20/day (needs $6/day = the daily click target 2.8 × top-of-search CPC, +20% headroom; never lowered on a ranking campaign) (today 4.1 paid clicks/day on king silk sheet set, king size silk sheets set) | Also buys 3 other term(s) (king size silk sheet set, king size silk sheet sets, king silk sheets set) — they follow the campaign's top-of-search setting</w:t>
+              <w:t xml:space="preserve">Back-up child: If SATIN-KING-BLACK-6-PCS drops under 14 days of stock (or goes out of stock): enable SATIN-CHAMPAGNE-KING-6PCS, pause SATIN-KING-BLACK-6-PCS and set this campaign to maintain level (the back-up cannot carry the push). Switch back when SATIN-KING-BLACK-6-PCS has ≥30 days of stock. | Bids kept: base $1.36 and top-of-search modifier 25% unchanged (top-of-search price $1.7 = today's effective top-of-search bid (bid × top-of-search modifier) — kept, never lowered on a ranking term); rest of search and product pages keep today's bids | Budget $20/day (needs $6/day = the daily click target 2.8 × top-of-search CPC, +20% headroom; never lowered on a ranking campaign) (today 4.1 paid clicks/day on king silk sheet set, king size silk sheets set) | Also buys 3 other term(s) (king size silk sheet set, king size silk sheet sets, king silk sheets set) — their base bids are kept; at the top of search they follow the campaign's modifier</w:t>
             </w:r>
           </w:p>
         </w:tc>
@@ -10991,7 +10991,7 @@
                 <w:sz w:val="16"/>
                 <w:szCs w:val="16"/>
               </w:rPr>
-              <w:t xml:space="preserve">base $0.26 with TOS 900% → top-of-search price $2.6</w:t>
+              <w:t xml:space="preserve">bid unchanged</w:t>
             </w:r>
           </w:p>
         </w:tc>
@@ -11019,7 +11019,7 @@
                 <w:sz w:val="16"/>
                 <w:szCs w:val="16"/>
               </w:rPr>
-              <w:t xml:space="preserve">Back-up child: If SATIN-KING-BLACK-6-PCS drops under 14 days of stock (or goes out of stock): enable SATIN-CHAMPAGNE-KING-6PCS, pause SATIN-KING-BLACK-6-PCS and set this campaign to maintain level (the back-up cannot carry the push). Switch back when SATIN-KING-BLACK-6-PCS has ≥30 days of stock. | Top-of-search only: modifier 900%, base bid $0.17 (top-of-search price $1.7, = today's effective top-of-search bid (bid × top-of-search modifier) — kept, never lowered on a ranking term); rest of search and product pages 0% → those placements drop to the $0.17 base | Budget $20/day (needs $6/day = the daily click target 2.8 × top-of-search CPC, +20% headroom; never lowered on a ranking campaign) (today 4.1 paid clicks/day on king silk sheet set, king size silk sheets set) | Also buys 3 other term(s) (king size silk sheet set, king size silk sheet sets, king silk sheets set) — they follow the campaign's top-of-search setting</w:t>
+              <w:t xml:space="preserve">Back-up child: If SATIN-KING-BLACK-6-PCS drops under 14 days of stock (or goes out of stock): enable SATIN-CHAMPAGNE-KING-6PCS, pause SATIN-KING-BLACK-6-PCS and set this campaign to maintain level (the back-up cannot carry the push). Switch back when SATIN-KING-BLACK-6-PCS has ≥30 days of stock. | Bids kept: base $1.36 and top-of-search modifier 25% unchanged (top-of-search price $1.7 = today's effective top-of-search bid (bid × top-of-search modifier) — kept, never lowered on a ranking term); rest of search and product pages keep today's bids | Budget $20/day (needs $6/day = the daily click target 2.8 × top-of-search CPC, +20% headroom; never lowered on a ranking campaign) (today 4.1 paid clicks/day on king silk sheet set, king size silk sheets set) | Also buys 3 other term(s) (king size silk sheet set, king size silk sheet sets, king silk sheets set) — their base bids are kept; at the top of search they follow the campaign's modifier</w:t>
             </w:r>
           </w:p>
         </w:tc>
@@ -11192,7 +11192,7 @@
                 <w:sz w:val="16"/>
                 <w:szCs w:val="16"/>
               </w:rPr>
-              <w:t xml:space="preserve">Not a ranking term (outside 95% of market purchases or unranked). ACoS 66.6% vs break-even 19.5% on 8 orders (30 days): one −15% step, re-read after 7 days, stop stepping if the 7-day median organic rank worsens by more than 3 places (2 × the term's normal weekly move) | Top-of-search clicks only (all exact campaigns): modifier 900%, base = top-of-search price ÷ 10, rest of search and product pages 0%; top-of-search price = today's effective top-of-search bid −15% (the step above)</w:t>
+              <w:t xml:space="preserve">Not a ranking term (outside 95% of market purchases or unranked). ACoS 66.6% vs break-even 19.5% on 8 orders (30 days): one −15% step, re-read after 7 days, stop stepping if the 7-day median organic rank worsens by more than 3 places (2 × the term's normal weekly move)</w:t>
             </w:r>
           </w:p>
         </w:tc>
@@ -11365,7 +11365,7 @@
                 <w:sz w:val="16"/>
                 <w:szCs w:val="16"/>
               </w:rPr>
-              <w:t xml:space="preserve">Advertises SATIN-RED-KING-6PCS; the King ranking child is SATIN-KING-BLACK-6-PCS (highest profit per top-of-search click among proven sellers (≥10% of the size) with ≥60 days of stock at push pace). Add the SATIN-KING-BLACK-6-PCS product ad, pause SATIN-RED-KING-6PCS | Back-up child: If SATIN-KING-BLACK-6-PCS drops under 14 days of stock (or goes out of stock): enable SATIN-CHAMPAGNE-KING-6PCS, pause SATIN-KING-BLACK-6-PCS and set this campaign to maintain level (the back-up cannot carry the push). Switch back when SATIN-KING-BLACK-6-PCS has ≥30 days of stock. | Top-of-search only: modifier 900%, base bid $0.28 (top-of-search price $2.8, = the campaign's own 90-day top-of-search CPC (today's is lower and buys almost no top-of-search share)); rest of search and product pages 0% → those placements drop to the $0.28 base | Budget $40/day (needs $9/day = the daily click target 2.5 × top-of-search CPC, +20% headroom; never lowered on a ranking campaign) (today 2.2 paid clicks/day on satin sheets king)</w:t>
+              <w:t xml:space="preserve">Advertises SATIN-RED-KING-6PCS; the King ranking child is SATIN-KING-BLACK-6-PCS (highest profit per top-of-search click among proven sellers (≥10% of the size) with ≥60 days of stock at push pace). Add the SATIN-KING-BLACK-6-PCS product ad, pause SATIN-RED-KING-6PCS | Back-up child: If SATIN-KING-BLACK-6-PCS drops under 14 days of stock (or goes out of stock): enable SATIN-CHAMPAGNE-KING-6PCS, pause SATIN-KING-BLACK-6-PCS and set this campaign to maintain level (the back-up cannot carry the push). Switch back when SATIN-KING-BLACK-6-PCS has ≥30 days of stock. | Top of search raised, nothing lowered: base bid kept at $1.25; top-of-search modifier 54% → 124% → top-of-search price $2.79 (= the campaign's own 90-day top-of-search CPC (today's is lower and buys almost no top-of-search share)). Rest of search and product pages keep today's base bid and modifiers, so the auctions the campaign wins there today are not lost | Budget $40/day (needs $9/day = the daily click target 2.5 × top-of-search CPC, +20% headroom; never lowered on a ranking campaign) (today 2.2 paid clicks/day on satin sheets king)</w:t>
             </w:r>
           </w:p>
         </w:tc>
@@ -11510,7 +11510,7 @@
                 <w:sz w:val="16"/>
                 <w:szCs w:val="16"/>
               </w:rPr>
-              <w:t xml:space="preserve">TOS modifier → 900%</w:t>
+              <w:t xml:space="preserve">TOS modifier → 124%</w:t>
             </w:r>
           </w:p>
         </w:tc>
@@ -11538,7 +11538,7 @@
                 <w:sz w:val="16"/>
                 <w:szCs w:val="16"/>
               </w:rPr>
-              <w:t xml:space="preserve">Advertises SATIN-RED-KING-6PCS; the King ranking child is SATIN-KING-BLACK-6-PCS (highest profit per top-of-search click among proven sellers (≥10% of the size) with ≥60 days of stock at push pace). Add the SATIN-KING-BLACK-6-PCS product ad, pause SATIN-RED-KING-6PCS | Back-up child: If SATIN-KING-BLACK-6-PCS drops under 14 days of stock (or goes out of stock): enable SATIN-CHAMPAGNE-KING-6PCS, pause SATIN-KING-BLACK-6-PCS and set this campaign to maintain level (the back-up cannot carry the push). Switch back when SATIN-KING-BLACK-6-PCS has ≥30 days of stock. | Top-of-search only: modifier 900%, base bid $0.28 (top-of-search price $2.8, = the campaign's own 90-day top-of-search CPC (today's is lower and buys almost no top-of-search share)); rest of search and product pages 0% → those placements drop to the $0.28 base | Budget $40/day (needs $9/day = the daily click target 2.5 × top-of-search CPC, +20% headroom; never lowered on a ranking campaign) (today 2.2 paid clicks/day on satin sheets king)</w:t>
+              <w:t xml:space="preserve">Advertises SATIN-RED-KING-6PCS; the King ranking child is SATIN-KING-BLACK-6-PCS (highest profit per top-of-search click among proven sellers (≥10% of the size) with ≥60 days of stock at push pace). Add the SATIN-KING-BLACK-6-PCS product ad, pause SATIN-RED-KING-6PCS | Back-up child: If SATIN-KING-BLACK-6-PCS drops under 14 days of stock (or goes out of stock): enable SATIN-CHAMPAGNE-KING-6PCS, pause SATIN-KING-BLACK-6-PCS and set this campaign to maintain level (the back-up cannot carry the push). Switch back when SATIN-KING-BLACK-6-PCS has ≥30 days of stock. | Top of search raised, nothing lowered: base bid kept at $1.25; top-of-search modifier 54% → 124% → top-of-search price $2.79 (= the campaign's own 90-day top-of-search CPC (today's is lower and buys almost no top-of-search share)). Rest of search and product pages keep today's base bid and modifiers, so the auctions the campaign wins there today are not lost | Budget $40/day (needs $9/day = the daily click target 2.5 × top-of-search CPC, +20% headroom; never lowered on a ranking campaign) (today 2.2 paid clicks/day on satin sheets king)</w:t>
             </w:r>
           </w:p>
         </w:tc>
@@ -11683,7 +11683,7 @@
                 <w:sz w:val="16"/>
                 <w:szCs w:val="16"/>
               </w:rPr>
-              <w:t xml:space="preserve">base $0.28 with TOS 900% → top-of-search price $2.8</w:t>
+              <w:t xml:space="preserve">bid unchanged</w:t>
             </w:r>
           </w:p>
         </w:tc>
@@ -11711,7 +11711,7 @@
                 <w:sz w:val="16"/>
                 <w:szCs w:val="16"/>
               </w:rPr>
-              <w:t xml:space="preserve">Advertises SATIN-RED-KING-6PCS; the King ranking child is SATIN-KING-BLACK-6-PCS (highest profit per top-of-search click among proven sellers (≥10% of the size) with ≥60 days of stock at push pace). Add the SATIN-KING-BLACK-6-PCS product ad, pause SATIN-RED-KING-6PCS | Back-up child: If SATIN-KING-BLACK-6-PCS drops under 14 days of stock (or goes out of stock): enable SATIN-CHAMPAGNE-KING-6PCS, pause SATIN-KING-BLACK-6-PCS and set this campaign to maintain level (the back-up cannot carry the push). Switch back when SATIN-KING-BLACK-6-PCS has ≥30 days of stock. | Top-of-search only: modifier 900%, base bid $0.28 (top-of-search price $2.8, = the campaign's own 90-day top-of-search CPC (today's is lower and buys almost no top-of-search share)); rest of search and product pages 0% → those placements drop to the $0.28 base | Budget $40/day (needs $9/day = the daily click target 2.5 × top-of-search CPC, +20% headroom; never lowered on a ranking campaign) (today 2.2 paid clicks/day on satin sheets king)</w:t>
+              <w:t xml:space="preserve">Advertises SATIN-RED-KING-6PCS; the King ranking child is SATIN-KING-BLACK-6-PCS (highest profit per top-of-search click among proven sellers (≥10% of the size) with ≥60 days of stock at push pace). Add the SATIN-KING-BLACK-6-PCS product ad, pause SATIN-RED-KING-6PCS | Back-up child: If SATIN-KING-BLACK-6-PCS drops under 14 days of stock (or goes out of stock): enable SATIN-CHAMPAGNE-KING-6PCS, pause SATIN-KING-BLACK-6-PCS and set this campaign to maintain level (the back-up cannot carry the push). Switch back when SATIN-KING-BLACK-6-PCS has ≥30 days of stock. | Top of search raised, nothing lowered: base bid kept at $1.25; top-of-search modifier 54% → 124% → top-of-search price $2.79 (= the campaign's own 90-day top-of-search CPC (today's is lower and buys almost no top-of-search share)). Rest of search and product pages keep today's base bid and modifiers, so the auctions the campaign wins there today are not lost | Budget $40/day (needs $9/day = the daily click target 2.5 × top-of-search CPC, +20% headroom; never lowered on a ranking campaign) (today 2.2 paid clicks/day on satin sheets king)</w:t>
             </w:r>
           </w:p>
         </w:tc>
@@ -11884,7 +11884,7 @@
                 <w:sz w:val="16"/>
                 <w:szCs w:val="16"/>
               </w:rPr>
-              <w:t xml:space="preserve">Back-up child: If SATIN-QUEEN-BLACK-6-PCS drops under 14 days of stock (or goes out of stock): enable SATIN-RED-QUEEN-6PCS, pause SATIN-QUEEN-BLACK-6-PCS. Switch back when SATIN-QUEEN-BLACK-6-PCS has ≥30 days of stock. | Top-of-search only: modifier 900%, base bid $0.37 (top-of-search price $3.7, = today's effective top-of-search bid (bid × top-of-search modifier) — kept, never lowered on a ranking term); rest of search and product pages 0% → those placements drop to the $0.37 base | Budget $20/day (needs $5.0/day = the daily click target 0.8 × top-of-search CPC, +20% headroom; never lowered on a ranking campaign) (today 0.8 paid clicks/day on queen silk sheets set, queen size silk sheets set) | Also buys 2 other term(s) (queen silk sheet set, queen size silk sheet set) — they follow the campaign's top-of-search setting</w:t>
+              <w:t xml:space="preserve">Back-up child: If SATIN-QUEEN-BLACK-6-PCS drops under 14 days of stock (or goes out of stock): enable SATIN-RED-QUEEN-6PCS, pause SATIN-QUEEN-BLACK-6-PCS. Switch back when SATIN-QUEEN-BLACK-6-PCS has ≥30 days of stock. | Bids kept: base $2.8 and top-of-search modifier 32% unchanged (top-of-search price $3.7 = today's effective top-of-search bid (bid × top-of-search modifier) — kept, never lowered on a ranking term); rest of search and product pages keep today's bids | Budget $20/day (needs $5.0/day = the daily click target 0.8 × top-of-search CPC, +20% headroom; never lowered on a ranking campaign) (today 0.8 paid clicks/day on queen silk sheets set, queen size silk sheets set) | Also buys 2 other term(s) (queen silk sheet set, queen size silk sheet set) — their base bids are kept; at the top of search they follow the campaign's modifier</w:t>
             </w:r>
           </w:p>
         </w:tc>
@@ -12001,7 +12001,7 @@
                 <w:sz w:val="16"/>
                 <w:szCs w:val="16"/>
               </w:rPr>
-              <w:t xml:space="preserve">MODIFY</w:t>
+              <w:t xml:space="preserve">REJECT</w:t>
             </w:r>
           </w:p>
         </w:tc>
@@ -12029,7 +12029,7 @@
                 <w:sz w:val="16"/>
                 <w:szCs w:val="16"/>
               </w:rPr>
-              <w:t xml:space="preserve">TOS modifier → 900%</w:t>
+              <w:t xml:space="preserve">TOS modifier → 32%</w:t>
             </w:r>
           </w:p>
         </w:tc>
@@ -12057,7 +12057,7 @@
                 <w:sz w:val="16"/>
                 <w:szCs w:val="16"/>
               </w:rPr>
-              <w:t xml:space="preserve">Back-up child: If SATIN-QUEEN-BLACK-6-PCS drops under 14 days of stock (or goes out of stock): enable SATIN-RED-QUEEN-6PCS, pause SATIN-QUEEN-BLACK-6-PCS. Switch back when SATIN-QUEEN-BLACK-6-PCS has ≥30 days of stock. | Top-of-search only: modifier 900%, base bid $0.37 (top-of-search price $3.7, = today's effective top-of-search bid (bid × top-of-search modifier) — kept, never lowered on a ranking term); rest of search and product pages 0% → those placements drop to the $0.37 base | Budget $20/day (needs $5.0/day = the daily click target 0.8 × top-of-search CPC, +20% headroom; never lowered on a ranking campaign) (today 0.8 paid clicks/day on queen silk sheets set, queen size silk sheets set) | Also buys 2 other term(s) (queen silk sheet set, queen size silk sheet set) — they follow the campaign's top-of-search setting</w:t>
+              <w:t xml:space="preserve">Back-up child: If SATIN-QUEEN-BLACK-6-PCS drops under 14 days of stock (or goes out of stock): enable SATIN-RED-QUEEN-6PCS, pause SATIN-QUEEN-BLACK-6-PCS. Switch back when SATIN-QUEEN-BLACK-6-PCS has ≥30 days of stock. | Bids kept: base $2.8 and top-of-search modifier 32% unchanged (top-of-search price $3.7 = today's effective top-of-search bid (bid × top-of-search modifier) — kept, never lowered on a ranking term); rest of search and product pages keep today's bids | Budget $20/day (needs $5.0/day = the daily click target 0.8 × top-of-search CPC, +20% headroom; never lowered on a ranking campaign) (today 0.8 paid clicks/day on queen silk sheets set, queen size silk sheets set) | Also buys 2 other term(s) (queen silk sheet set, queen size silk sheet set) — their base bids are kept; at the top of search they follow the campaign's modifier</w:t>
             </w:r>
           </w:p>
         </w:tc>
@@ -12202,7 +12202,7 @@
                 <w:sz w:val="16"/>
                 <w:szCs w:val="16"/>
               </w:rPr>
-              <w:t xml:space="preserve">base $0.26 with TOS 900% → top-of-search price $2.6</w:t>
+              <w:t xml:space="preserve">bid unchanged</w:t>
             </w:r>
           </w:p>
         </w:tc>
@@ -12230,7 +12230,7 @@
                 <w:sz w:val="16"/>
                 <w:szCs w:val="16"/>
               </w:rPr>
-              <w:t xml:space="preserve">Back-up child: If SATIN-QUEEN-BLACK-6-PCS drops under 14 days of stock (or goes out of stock): enable SATIN-RED-QUEEN-6PCS, pause SATIN-QUEEN-BLACK-6-PCS. Switch back when SATIN-QUEEN-BLACK-6-PCS has ≥30 days of stock. | Top-of-search only: modifier 900%, base bid $0.37 (top-of-search price $3.7, = today's effective top-of-search bid (bid × top-of-search modifier) — kept, never lowered on a ranking term); rest of search and product pages 0% → those placements drop to the $0.37 base | Budget $20/day (needs $5.0/day = the daily click target 0.8 × top-of-search CPC, +20% headroom; never lowered on a ranking campaign) (today 0.8 paid clicks/day on queen silk sheets set, queen size silk sheets set) | Also buys 2 other term(s) (queen silk sheet set, queen size silk sheet set) — they follow the campaign's top-of-search setting</w:t>
+              <w:t xml:space="preserve">Back-up child: If SATIN-QUEEN-BLACK-6-PCS drops under 14 days of stock (or goes out of stock): enable SATIN-RED-QUEEN-6PCS, pause SATIN-QUEEN-BLACK-6-PCS. Switch back when SATIN-QUEEN-BLACK-6-PCS has ≥30 days of stock. | Bids kept: base $2.8 and top-of-search modifier 32% unchanged (top-of-search price $3.7 = today's effective top-of-search bid (bid × top-of-search modifier) — kept, never lowered on a ranking term); rest of search and product pages keep today's bids | Budget $20/day (needs $5.0/day = the daily click target 0.8 × top-of-search CPC, +20% headroom; never lowered on a ranking campaign) (today 0.8 paid clicks/day on queen silk sheets set, queen size silk sheets set) | Also buys 2 other term(s) (queen silk sheet set, queen size silk sheet set) — their base bids are kept; at the top of search they follow the campaign's modifier</w:t>
             </w:r>
           </w:p>
         </w:tc>
@@ -12375,7 +12375,7 @@
                 <w:sz w:val="16"/>
                 <w:szCs w:val="16"/>
               </w:rPr>
-              <w:t xml:space="preserve">budget → $19.0</w:t>
+              <w:t xml:space="preserve">budget/modifier unchanged; all targets −15% (one step, re-read after 7 days, rank guard)</w:t>
             </w:r>
           </w:p>
         </w:tc>
@@ -12403,7 +12403,7 @@
                 <w:sz w:val="16"/>
                 <w:szCs w:val="16"/>
               </w:rPr>
-              <w:t xml:space="preserve">Not a ranking term (outside 95% of market purchases or unranked). ACoS 50.9% vs break-even 25.9% on 3 orders (30 days): one −15% step, re-read after 7 days, stop stepping if the 7-day median organic rank worsens by more than 3 places (2 × the term's normal weekly move) | Top-of-search clicks only (all exact campaigns): modifier 900%, base = top-of-search price ÷ 10, rest of search and product pages 0%; top-of-search price = today's effective top-of-search bid −15% (the step above)</w:t>
+              <w:t xml:space="preserve">Not a ranking term (outside 95% of market purchases or unranked). ACoS 50.9% vs break-even 25.9% on 3 orders (30 days): one −15% step, re-read after 7 days, stop stepping if the 7-day median organic rank worsens by more than 3 places (2 × the term's normal weekly move)</w:t>
             </w:r>
           </w:p>
         </w:tc>
@@ -12520,7 +12520,7 @@
                 <w:sz w:val="16"/>
                 <w:szCs w:val="16"/>
               </w:rPr>
-              <w:t xml:space="preserve">MODIFY</w:t>
+              <w:t xml:space="preserve">REJECT</w:t>
             </w:r>
           </w:p>
         </w:tc>
@@ -12548,7 +12548,7 @@
                 <w:sz w:val="16"/>
                 <w:szCs w:val="16"/>
               </w:rPr>
-              <w:t xml:space="preserve">TOS modifier → 900%</w:t>
+              <w:t xml:space="preserve">TOS modifier → 100%</w:t>
             </w:r>
           </w:p>
         </w:tc>
@@ -12576,7 +12576,7 @@
                 <w:sz w:val="16"/>
                 <w:szCs w:val="16"/>
               </w:rPr>
-              <w:t xml:space="preserve">Not a ranking term (outside 95% of market purchases or unranked). ACoS 50.9% vs break-even 25.9% on 3 orders (30 days): one −15% step, re-read after 7 days, stop stepping if the 7-day median organic rank worsens by more than 3 places (2 × the term's normal weekly move) | Top-of-search clicks only (all exact campaigns): modifier 900%, base = top-of-search price ÷ 10, rest of search and product pages 0%; top-of-search price = today's effective top-of-search bid −15% (the step above)</w:t>
+              <w:t xml:space="preserve">Not a ranking term (outside 95% of market purchases or unranked). ACoS 50.9% vs break-even 25.9% on 3 orders (30 days): one −15% step, re-read after 7 days, stop stepping if the 7-day median organic rank worsens by more than 3 places (2 × the term's normal weekly move)</w:t>
             </w:r>
           </w:p>
         </w:tc>
@@ -12693,7 +12693,7 @@
                 <w:sz w:val="16"/>
                 <w:szCs w:val="16"/>
               </w:rPr>
-              <w:t xml:space="preserve">REJECT</w:t>
+              <w:t xml:space="preserve">MODIFY</w:t>
             </w:r>
           </w:p>
         </w:tc>
@@ -12721,7 +12721,7 @@
                 <w:sz w:val="16"/>
                 <w:szCs w:val="16"/>
               </w:rPr>
-              <w:t xml:space="preserve">base $0.3 with TOS 900% → top-of-search price $3.0</w:t>
+              <w:t xml:space="preserve">all targets −15% (one step)</w:t>
             </w:r>
           </w:p>
         </w:tc>
@@ -12749,7 +12749,7 @@
                 <w:sz w:val="16"/>
                 <w:szCs w:val="16"/>
               </w:rPr>
-              <w:t xml:space="preserve">Not a ranking term (outside 95% of market purchases or unranked). ACoS 50.9% vs break-even 25.9% on 3 orders (30 days): one −15% step, re-read after 7 days, stop stepping if the 7-day median organic rank worsens by more than 3 places (2 × the term's normal weekly move) | Top-of-search clicks only (all exact campaigns): modifier 900%, base = top-of-search price ÷ 10, rest of search and product pages 0%; top-of-search price = today's effective top-of-search bid −15% (the step above)</w:t>
+              <w:t xml:space="preserve">Not a ranking term (outside 95% of market purchases or unranked). ACoS 50.9% vs break-even 25.9% on 3 orders (30 days): one −15% step, re-read after 7 days, stop stepping if the 7-day median organic rank worsens by more than 3 places (2 × the term's normal weekly move)</w:t>
             </w:r>
           </w:p>
         </w:tc>
@@ -12866,7 +12866,7 @@
                 <w:sz w:val="16"/>
                 <w:szCs w:val="16"/>
               </w:rPr>
-              <w:t xml:space="preserve">REJECT</w:t>
+              <w:t xml:space="preserve">MODIFY</w:t>
             </w:r>
           </w:p>
         </w:tc>
@@ -12894,7 +12894,7 @@
                 <w:sz w:val="16"/>
                 <w:szCs w:val="16"/>
               </w:rPr>
-              <w:t xml:space="preserve">budget → $10.0</w:t>
+              <w:t xml:space="preserve">budget/modifier unchanged; all targets −15% (one step, re-read after 7 days, rank guard)</w:t>
             </w:r>
           </w:p>
         </w:tc>
@@ -12922,7 +12922,7 @@
                 <w:sz w:val="16"/>
                 <w:szCs w:val="16"/>
               </w:rPr>
-              <w:t xml:space="preserve">Not a ranking term (outside 95% of market purchases or unranked). ACoS 58.3% vs break-even 9.0% on 5 orders (90 days): one −15% step, re-read after 7 days, stop stepping if the 7-day median organic rank worsens by more than 8 places (2 × the term's normal weekly move) | Top-of-search clicks only (all exact campaigns): modifier 900%, base = top-of-search price ÷ 10, rest of search and product pages 0%; top-of-search price = today's effective top-of-search bid −15% (the step above)</w:t>
+              <w:t xml:space="preserve">Not a ranking term (outside 95% of market purchases or unranked). ACoS 58.3% vs break-even 9.0% on 5 orders (90 days): one −15% step, re-read after 7 days, stop stepping if the 7-day median organic rank worsens by more than 8 places (2 × the term's normal weekly move)</w:t>
             </w:r>
           </w:p>
         </w:tc>
@@ -12955,7 +12955,7 @@
         <w:spacing w:after="120"/>
       </w:pPr>
       <w:r>
-        <w:t xml:space="preserve">Spend and click share. Today: ranking 19% of spend, 9% of clicks. Plan: 51% of spend ($95 of $186/day) and 29% of clicks; with LTSF clearance and brand defence ring-fenced, ranking is 78% of the remaining keyword spend. Reaching 80% of ALL spend needs non-ranking at $24/day, which would stop the LTSF clearance — left as an owner decision. Discovery clicks are cheap, so click share trails spend share.</w:t>
+        <w:t xml:space="preserve">Spend and click share. Today: ranking 19% of spend, 9% of clicks. Plan: 50% of spend ($95 of $191/day) and 29% of clicks; with LTSF clearance and brand defence ring-fenced, ranking is 75% of the remaining keyword spend. Reaching 80% of ALL spend needs non-ranking at $24/day, which would stop the LTSF clearance — left as an owner decision. Discovery clicks are cheap, so click share trails spend share.</w:t>
       </w:r>
     </w:p>
     <w:tbl>
@@ -13331,7 +13331,7 @@
                 <w:sz w:val="16"/>
                 <w:szCs w:val="16"/>
               </w:rPr>
-              <w:t xml:space="preserve">0.9</w:t>
+              <w:t xml:space="preserve">1.0</w:t>
             </w:r>
           </w:p>
         </w:tc>
@@ -13621,7 +13621,7 @@
                 <w:sz w:val="16"/>
                 <w:szCs w:val="16"/>
               </w:rPr>
-              <w:t xml:space="preserve">$5</w:t>
+              <w:t xml:space="preserve">$10</w:t>
             </w:r>
           </w:p>
         </w:tc>
@@ -13677,7 +13677,7 @@
                 <w:sz w:val="16"/>
                 <w:szCs w:val="16"/>
               </w:rPr>
-              <w:t xml:space="preserve">0.5</w:t>
+              <w:t xml:space="preserve">0.6</w:t>
             </w:r>
           </w:p>
         </w:tc>
@@ -15078,7 +15078,7 @@
         <w:spacing w:after="120" w:before="280"/>
       </w:pPr>
       <w:r>
-        <w:t xml:space="preserve">11. Placements — ranking close to 100% top of search</w:t>
+        <w:t xml:space="preserve">11. Placements and bids — nothing is lowered</w:t>
       </w:r>
     </w:p>
     <w:p>
@@ -15086,16 +15086,1136 @@
         <w:spacing w:after="120"/>
       </w:pPr>
       <w:r>
-        <w:t xml:space="preserve">How it is set: modifier 900% (the maximum), base bid = top-of-search price ÷ 10, rest of search and product pages 0%, bidding "Dynamic bids - down only". Rest of search and product pages then see only the small base bid, so nearly all clicks come from the top row. Ranking terms: the top-of-search bid is never set below today's effective top-of-search bid (bid × current modifier) — a CPC is the price a winning bid paid, so bidding at the CPC would lose auctions we win today. Pushed terms: the highest of today's bid, the term's top-of-search CPC and the campaign's own 90-day top-of-search CPC; base bids round up to the cent. Held and trial terms keep each term's own effective top-of-search bid — no raise. Budgets on ranking campaigns are never lowered. Where a pushed campaign still buys fewer clicks than its target with budget left, raise the top-of-search price 10% a week.</w:t>
+        <w:t xml:space="preserve">Where the ranking campaigns' clicks come from (90 days): 53% from rest of search and product pages, 47% from top of search. A 900% modifier on a base bid cut to a tenth would keep the top-of-search price but drop the rest-of-search and product-page bid to a few cents, and those auctions — more than half of the campaigns' clicks — would be lost. So the rule is:</w:t>
       </w:r>
     </w:p>
     <w:p>
       <w:pPr>
+        <w:pStyle w:val="ListParagraph"/>
+        <w:numPr>
+          <w:ilvl w:val="0"/>
+          <w:numId w:val="2"/>
+        </w:numPr>
+        <w:spacing w:after="80"/>
+      </w:pPr>
+      <w:r>
+        <w:t xml:space="preserve">Base bids are never lowered (the only exception is the one −15% step on non-ranking terms above break-even).</w:t>
+      </w:r>
+    </w:p>
+    <w:p>
+      <w:pPr>
+        <w:pStyle w:val="ListParagraph"/>
+        <w:numPr>
+          <w:ilvl w:val="0"/>
+          <w:numId w:val="2"/>
+        </w:numPr>
+        <w:spacing w:after="80"/>
+      </w:pPr>
+      <w:r>
+        <w:t xml:space="preserve">Pushed terms: the top-of-search price is the highest of today's effective top-of-search bid, the term's top-of-search CPC and the campaign's own 90-day top-of-search CPC. It is reached by raising the top-of-search modifier on today's base bid (up to 900%); only if 900% is not enough is the base bid raised.</w:t>
+      </w:r>
+    </w:p>
+    <w:p>
+      <w:pPr>
+        <w:pStyle w:val="ListParagraph"/>
+        <w:numPr>
+          <w:ilvl w:val="0"/>
+          <w:numId w:val="2"/>
+        </w:numPr>
+        <w:spacing w:after="80"/>
+      </w:pPr>
+      <w:r>
+        <w:t xml:space="preserve">Held and trial terms: bids and modifiers stay exactly as they are.</w:t>
+      </w:r>
+    </w:p>
+    <w:p>
+      <w:pPr>
+        <w:pStyle w:val="ListParagraph"/>
+        <w:numPr>
+          <w:ilvl w:val="0"/>
+          <w:numId w:val="2"/>
+        </w:numPr>
+        <w:spacing w:after="80"/>
+      </w:pPr>
+      <w:r>
+        <w:t xml:space="preserve">Rest of search and product pages: modifiers unchanged, so they keep today's base bid.</w:t>
+      </w:r>
+    </w:p>
+    <w:p>
+      <w:pPr>
+        <w:pStyle w:val="ListParagraph"/>
+        <w:numPr>
+          <w:ilvl w:val="0"/>
+          <w:numId w:val="2"/>
+        </w:numPr>
+        <w:spacing w:after="80"/>
+      </w:pPr>
+      <w:r>
+        <w:t xml:space="preserve">Non-ranking exact campaigns: placement set-up unchanged.</w:t>
+      </w:r>
+    </w:p>
+    <w:p>
+      <w:pPr>
+        <w:pStyle w:val="ListParagraph"/>
+        <w:numPr>
+          <w:ilvl w:val="0"/>
+          <w:numId w:val="2"/>
+        </w:numPr>
+        <w:spacing w:after="80"/>
+      </w:pPr>
+      <w:r>
+        <w:t xml:space="preserve">Where a pushed campaign still buys fewer top-of-search clicks than its target with budget left, raise the top-of-search modifier (or the base, once at 900%) 10% a week. Budgets on ranking campaigns are never lowered.</w:t>
+      </w:r>
+    </w:p>
+    <w:tbl>
+      <w:tblPr>
+        <w:tblW w:type="dxa" w:w="9360"/>
+        <w:tblBorders>
+          <w:top w:val="single" w:color="auto" w:sz="4"/>
+          <w:left w:val="single" w:color="auto" w:sz="4"/>
+          <w:bottom w:val="single" w:color="auto" w:sz="4"/>
+          <w:right w:val="single" w:color="auto" w:sz="4"/>
+          <w:insideH w:val="single" w:color="auto" w:sz="4"/>
+          <w:insideV w:val="single" w:color="auto" w:sz="4"/>
+        </w:tblBorders>
+      </w:tblPr>
+      <w:tblGrid>
+        <w:gridCol w:w="3629"/>
+        <w:gridCol w:w="1814"/>
+        <w:gridCol w:w="1146"/>
+        <w:gridCol w:w="1432"/>
+        <w:gridCol w:w="1339"/>
+      </w:tblGrid>
+      <w:tr>
+        <w:trPr>
+          <w:tblHeader/>
+        </w:trPr>
+        <w:tc>
+          <w:tcPr>
+            <w:tcW w:type="dxa" w:w="3629"/>
+            <w:tcBorders>
+              <w:top w:val="single" w:color="BFBFBF" w:sz="4"/>
+              <w:left w:val="single" w:color="BFBFBF" w:sz="4"/>
+              <w:bottom w:val="single" w:color="BFBFBF" w:sz="4"/>
+              <w:right w:val="single" w:color="BFBFBF" w:sz="4"/>
+            </w:tcBorders>
+            <w:shd w:fill="1F3864" w:color="auto" w:val="clear"/>
+            <w:tcMar>
+              <w:top w:type="dxa" w:w="40"/>
+              <w:left w:type="dxa" w:w="80"/>
+              <w:bottom w:type="dxa" w:w="40"/>
+              <w:right w:type="dxa" w:w="80"/>
+            </w:tcMar>
+          </w:tcPr>
+          <w:p>
+            <w:r>
+              <w:rPr>
+                <w:b/>
+                <w:bCs/>
+                <w:color w:val="FFFFFF"/>
+                <w:sz w:val="16"/>
+                <w:szCs w:val="16"/>
+              </w:rPr>
+              <w:t xml:space="preserve">Campaign</w:t>
+            </w:r>
+          </w:p>
+        </w:tc>
+        <w:tc>
+          <w:tcPr>
+            <w:tcW w:type="dxa" w:w="1814"/>
+            <w:tcBorders>
+              <w:top w:val="single" w:color="BFBFBF" w:sz="4"/>
+              <w:left w:val="single" w:color="BFBFBF" w:sz="4"/>
+              <w:bottom w:val="single" w:color="BFBFBF" w:sz="4"/>
+              <w:right w:val="single" w:color="BFBFBF" w:sz="4"/>
+            </w:tcBorders>
+            <w:shd w:fill="1F3864" w:color="auto" w:val="clear"/>
+            <w:tcMar>
+              <w:top w:type="dxa" w:w="40"/>
+              <w:left w:type="dxa" w:w="80"/>
+              <w:bottom w:type="dxa" w:w="40"/>
+              <w:right w:type="dxa" w:w="80"/>
+            </w:tcMar>
+          </w:tcPr>
+          <w:p>
+            <w:r>
+              <w:rPr>
+                <w:b/>
+                <w:bCs/>
+                <w:color w:val="FFFFFF"/>
+                <w:sz w:val="16"/>
+                <w:szCs w:val="16"/>
+              </w:rPr>
+              <w:t xml:space="preserve">Term</w:t>
+            </w:r>
+          </w:p>
+        </w:tc>
+        <w:tc>
+          <w:tcPr>
+            <w:tcW w:type="dxa" w:w="1146"/>
+            <w:tcBorders>
+              <w:top w:val="single" w:color="BFBFBF" w:sz="4"/>
+              <w:left w:val="single" w:color="BFBFBF" w:sz="4"/>
+              <w:bottom w:val="single" w:color="BFBFBF" w:sz="4"/>
+              <w:right w:val="single" w:color="BFBFBF" w:sz="4"/>
+            </w:tcBorders>
+            <w:shd w:fill="1F3864" w:color="auto" w:val="clear"/>
+            <w:tcMar>
+              <w:top w:type="dxa" w:w="40"/>
+              <w:left w:type="dxa" w:w="80"/>
+              <w:bottom w:type="dxa" w:w="40"/>
+              <w:right w:type="dxa" w:w="80"/>
+            </w:tcMar>
+          </w:tcPr>
+          <w:p>
+            <w:r>
+              <w:rPr>
+                <w:b/>
+                <w:bCs/>
+                <w:color w:val="FFFFFF"/>
+                <w:sz w:val="16"/>
+                <w:szCs w:val="16"/>
+              </w:rPr>
+              <w:t xml:space="preserve">Base bid (kept)</w:t>
+            </w:r>
+          </w:p>
+        </w:tc>
+        <w:tc>
+          <w:tcPr>
+            <w:tcW w:type="dxa" w:w="1432"/>
+            <w:tcBorders>
+              <w:top w:val="single" w:color="BFBFBF" w:sz="4"/>
+              <w:left w:val="single" w:color="BFBFBF" w:sz="4"/>
+              <w:bottom w:val="single" w:color="BFBFBF" w:sz="4"/>
+              <w:right w:val="single" w:color="BFBFBF" w:sz="4"/>
+            </w:tcBorders>
+            <w:shd w:fill="1F3864" w:color="auto" w:val="clear"/>
+            <w:tcMar>
+              <w:top w:type="dxa" w:w="40"/>
+              <w:left w:type="dxa" w:w="80"/>
+              <w:bottom w:type="dxa" w:w="40"/>
+              <w:right w:type="dxa" w:w="80"/>
+            </w:tcMar>
+          </w:tcPr>
+          <w:p>
+            <w:r>
+              <w:rPr>
+                <w:b/>
+                <w:bCs/>
+                <w:color w:val="FFFFFF"/>
+                <w:sz w:val="16"/>
+                <w:szCs w:val="16"/>
+              </w:rPr>
+              <w:t xml:space="preserve">Top-of-search modifier</w:t>
+            </w:r>
+          </w:p>
+        </w:tc>
+        <w:tc>
+          <w:tcPr>
+            <w:tcW w:type="dxa" w:w="1339"/>
+            <w:tcBorders>
+              <w:top w:val="single" w:color="BFBFBF" w:sz="4"/>
+              <w:left w:val="single" w:color="BFBFBF" w:sz="4"/>
+              <w:bottom w:val="single" w:color="BFBFBF" w:sz="4"/>
+              <w:right w:val="single" w:color="BFBFBF" w:sz="4"/>
+            </w:tcBorders>
+            <w:shd w:fill="1F3864" w:color="auto" w:val="clear"/>
+            <w:tcMar>
+              <w:top w:type="dxa" w:w="40"/>
+              <w:left w:type="dxa" w:w="80"/>
+              <w:bottom w:type="dxa" w:w="40"/>
+              <w:right w:type="dxa" w:w="80"/>
+            </w:tcMar>
+          </w:tcPr>
+          <w:p>
+            <w:r>
+              <w:rPr>
+                <w:b/>
+                <w:bCs/>
+                <w:color w:val="FFFFFF"/>
+                <w:sz w:val="16"/>
+                <w:szCs w:val="16"/>
+              </w:rPr>
+              <w:t xml:space="preserve">Top-of-search price</w:t>
+            </w:r>
+          </w:p>
+        </w:tc>
+      </w:tr>
+      <w:tr>
+        <w:trPr>
+          <w:tblHeader w:val="off"/>
+        </w:trPr>
+        <w:tc>
+          <w:tcPr>
+            <w:tcW w:type="dxa" w:w="3629"/>
+            <w:tcBorders>
+              <w:top w:val="single" w:color="BFBFBF" w:sz="4"/>
+              <w:left w:val="single" w:color="BFBFBF" w:sz="4"/>
+              <w:bottom w:val="single" w:color="BFBFBF" w:sz="4"/>
+              <w:right w:val="single" w:color="BFBFBF" w:sz="4"/>
+            </w:tcBorders>
+            <w:tcMar>
+              <w:top w:type="dxa" w:w="40"/>
+              <w:left w:type="dxa" w:w="80"/>
+              <w:bottom w:type="dxa" w:w="40"/>
+              <w:right w:type="dxa" w:w="80"/>
+            </w:tcMar>
+          </w:tcPr>
+          <w:p>
+            <w:r>
+              <w:rPr>
+                <w:b w:val="false"/>
+                <w:bCs w:val="false"/>
+                <w:sz w:val="16"/>
+                <w:szCs w:val="16"/>
+              </w:rPr>
+              <w:t xml:space="preserve">D-S6-king silk sheets - [Silk|King] - Exact - Ran - DO - SAT</w:t>
+            </w:r>
+          </w:p>
+        </w:tc>
+        <w:tc>
+          <w:tcPr>
+            <w:tcW w:type="dxa" w:w="1814"/>
+            <w:tcBorders>
+              <w:top w:val="single" w:color="BFBFBF" w:sz="4"/>
+              <w:left w:val="single" w:color="BFBFBF" w:sz="4"/>
+              <w:bottom w:val="single" w:color="BFBFBF" w:sz="4"/>
+              <w:right w:val="single" w:color="BFBFBF" w:sz="4"/>
+            </w:tcBorders>
+            <w:tcMar>
+              <w:top w:type="dxa" w:w="40"/>
+              <w:left w:type="dxa" w:w="80"/>
+              <w:bottom w:type="dxa" w:w="40"/>
+              <w:right w:type="dxa" w:w="80"/>
+            </w:tcMar>
+          </w:tcPr>
+          <w:p>
+            <w:r>
+              <w:rPr>
+                <w:b w:val="false"/>
+                <w:bCs w:val="false"/>
+                <w:sz w:val="16"/>
+                <w:szCs w:val="16"/>
+              </w:rPr>
+              <w:t xml:space="preserve">king silk sheets</w:t>
+            </w:r>
+          </w:p>
+        </w:tc>
+        <w:tc>
+          <w:tcPr>
+            <w:tcW w:type="dxa" w:w="1146"/>
+            <w:tcBorders>
+              <w:top w:val="single" w:color="BFBFBF" w:sz="4"/>
+              <w:left w:val="single" w:color="BFBFBF" w:sz="4"/>
+              <w:bottom w:val="single" w:color="BFBFBF" w:sz="4"/>
+              <w:right w:val="single" w:color="BFBFBF" w:sz="4"/>
+            </w:tcBorders>
+            <w:tcMar>
+              <w:top w:type="dxa" w:w="40"/>
+              <w:left w:type="dxa" w:w="80"/>
+              <w:bottom w:type="dxa" w:w="40"/>
+              <w:right w:type="dxa" w:w="80"/>
+            </w:tcMar>
+          </w:tcPr>
+          <w:p>
+            <w:r>
+              <w:rPr>
+                <w:b w:val="false"/>
+                <w:bCs w:val="false"/>
+                <w:sz w:val="16"/>
+                <w:szCs w:val="16"/>
+              </w:rPr>
+              <w:t xml:space="preserve">$1.09</w:t>
+            </w:r>
+          </w:p>
+        </w:tc>
+        <w:tc>
+          <w:tcPr>
+            <w:tcW w:type="dxa" w:w="1432"/>
+            <w:tcBorders>
+              <w:top w:val="single" w:color="BFBFBF" w:sz="4"/>
+              <w:left w:val="single" w:color="BFBFBF" w:sz="4"/>
+              <w:bottom w:val="single" w:color="BFBFBF" w:sz="4"/>
+              <w:right w:val="single" w:color="BFBFBF" w:sz="4"/>
+            </w:tcBorders>
+            <w:tcMar>
+              <w:top w:type="dxa" w:w="40"/>
+              <w:left w:type="dxa" w:w="80"/>
+              <w:bottom w:type="dxa" w:w="40"/>
+              <w:right w:type="dxa" w:w="80"/>
+            </w:tcMar>
+          </w:tcPr>
+          <w:p>
+            <w:r>
+              <w:rPr>
+                <w:b w:val="false"/>
+                <w:bCs w:val="false"/>
+                <w:sz w:val="16"/>
+                <w:szCs w:val="16"/>
+              </w:rPr>
+              <w:t xml:space="preserve">100% → 135%</w:t>
+            </w:r>
+          </w:p>
+        </w:tc>
+        <w:tc>
+          <w:tcPr>
+            <w:tcW w:type="dxa" w:w="1339"/>
+            <w:tcBorders>
+              <w:top w:val="single" w:color="BFBFBF" w:sz="4"/>
+              <w:left w:val="single" w:color="BFBFBF" w:sz="4"/>
+              <w:bottom w:val="single" w:color="BFBFBF" w:sz="4"/>
+              <w:right w:val="single" w:color="BFBFBF" w:sz="4"/>
+            </w:tcBorders>
+            <w:tcMar>
+              <w:top w:type="dxa" w:w="40"/>
+              <w:left w:type="dxa" w:w="80"/>
+              <w:bottom w:type="dxa" w:w="40"/>
+              <w:right w:type="dxa" w:w="80"/>
+            </w:tcMar>
+          </w:tcPr>
+          <w:p>
+            <w:r>
+              <w:rPr>
+                <w:b w:val="false"/>
+                <w:bCs w:val="false"/>
+                <w:sz w:val="16"/>
+                <w:szCs w:val="16"/>
+              </w:rPr>
+              <w:t xml:space="preserve">$2.18 → $2.56</w:t>
+            </w:r>
+          </w:p>
+        </w:tc>
+      </w:tr>
+      <w:tr>
+        <w:trPr>
+          <w:tblHeader w:val="off"/>
+        </w:trPr>
+        <w:tc>
+          <w:tcPr>
+            <w:tcW w:type="dxa" w:w="3629"/>
+            <w:tcBorders>
+              <w:top w:val="single" w:color="BFBFBF" w:sz="4"/>
+              <w:left w:val="single" w:color="BFBFBF" w:sz="4"/>
+              <w:bottom w:val="single" w:color="BFBFBF" w:sz="4"/>
+              <w:right w:val="single" w:color="BFBFBF" w:sz="4"/>
+            </w:tcBorders>
+            <w:tcMar>
+              <w:top w:type="dxa" w:w="40"/>
+              <w:left w:type="dxa" w:w="80"/>
+              <w:bottom w:type="dxa" w:w="40"/>
+              <w:right w:type="dxa" w:w="80"/>
+            </w:tcMar>
+          </w:tcPr>
+          <w:p>
+            <w:r>
+              <w:rPr>
+                <w:b w:val="false"/>
+                <w:bCs w:val="false"/>
+                <w:sz w:val="16"/>
+                <w:szCs w:val="16"/>
+              </w:rPr>
+              <w:t xml:space="preserve">D-S6-silk bed sheets - [Silk] - Exact - Ran - DO - SATIN-KIN</w:t>
+            </w:r>
+          </w:p>
+        </w:tc>
+        <w:tc>
+          <w:tcPr>
+            <w:tcW w:type="dxa" w:w="1814"/>
+            <w:tcBorders>
+              <w:top w:val="single" w:color="BFBFBF" w:sz="4"/>
+              <w:left w:val="single" w:color="BFBFBF" w:sz="4"/>
+              <w:bottom w:val="single" w:color="BFBFBF" w:sz="4"/>
+              <w:right w:val="single" w:color="BFBFBF" w:sz="4"/>
+            </w:tcBorders>
+            <w:tcMar>
+              <w:top w:type="dxa" w:w="40"/>
+              <w:left w:type="dxa" w:w="80"/>
+              <w:bottom w:type="dxa" w:w="40"/>
+              <w:right w:type="dxa" w:w="80"/>
+            </w:tcMar>
+          </w:tcPr>
+          <w:p>
+            <w:r>
+              <w:rPr>
+                <w:b w:val="false"/>
+                <w:bCs w:val="false"/>
+                <w:sz w:val="16"/>
+                <w:szCs w:val="16"/>
+              </w:rPr>
+              <w:t xml:space="preserve">silk bed sheets</w:t>
+            </w:r>
+          </w:p>
+        </w:tc>
+        <w:tc>
+          <w:tcPr>
+            <w:tcW w:type="dxa" w:w="1146"/>
+            <w:tcBorders>
+              <w:top w:val="single" w:color="BFBFBF" w:sz="4"/>
+              <w:left w:val="single" w:color="BFBFBF" w:sz="4"/>
+              <w:bottom w:val="single" w:color="BFBFBF" w:sz="4"/>
+              <w:right w:val="single" w:color="BFBFBF" w:sz="4"/>
+            </w:tcBorders>
+            <w:tcMar>
+              <w:top w:type="dxa" w:w="40"/>
+              <w:left w:type="dxa" w:w="80"/>
+              <w:bottom w:type="dxa" w:w="40"/>
+              <w:right w:type="dxa" w:w="80"/>
+            </w:tcMar>
+          </w:tcPr>
+          <w:p>
+            <w:r>
+              <w:rPr>
+                <w:b w:val="false"/>
+                <w:bCs w:val="false"/>
+                <w:sz w:val="16"/>
+                <w:szCs w:val="16"/>
+              </w:rPr>
+              <w:t xml:space="preserve">$0.5</w:t>
+            </w:r>
+          </w:p>
+        </w:tc>
+        <w:tc>
+          <w:tcPr>
+            <w:tcW w:type="dxa" w:w="1432"/>
+            <w:tcBorders>
+              <w:top w:val="single" w:color="BFBFBF" w:sz="4"/>
+              <w:left w:val="single" w:color="BFBFBF" w:sz="4"/>
+              <w:bottom w:val="single" w:color="BFBFBF" w:sz="4"/>
+              <w:right w:val="single" w:color="BFBFBF" w:sz="4"/>
+            </w:tcBorders>
+            <w:tcMar>
+              <w:top w:type="dxa" w:w="40"/>
+              <w:left w:type="dxa" w:w="80"/>
+              <w:bottom w:type="dxa" w:w="40"/>
+              <w:right w:type="dxa" w:w="80"/>
+            </w:tcMar>
+          </w:tcPr>
+          <w:p>
+            <w:r>
+              <w:rPr>
+                <w:b w:val="false"/>
+                <w:bCs w:val="false"/>
+                <w:sz w:val="16"/>
+                <w:szCs w:val="16"/>
+              </w:rPr>
+              <w:t xml:space="preserve">75% → 226%</w:t>
+            </w:r>
+          </w:p>
+        </w:tc>
+        <w:tc>
+          <w:tcPr>
+            <w:tcW w:type="dxa" w:w="1339"/>
+            <w:tcBorders>
+              <w:top w:val="single" w:color="BFBFBF" w:sz="4"/>
+              <w:left w:val="single" w:color="BFBFBF" w:sz="4"/>
+              <w:bottom w:val="single" w:color="BFBFBF" w:sz="4"/>
+              <w:right w:val="single" w:color="BFBFBF" w:sz="4"/>
+            </w:tcBorders>
+            <w:tcMar>
+              <w:top w:type="dxa" w:w="40"/>
+              <w:left w:type="dxa" w:w="80"/>
+              <w:bottom w:type="dxa" w:w="40"/>
+              <w:right w:type="dxa" w:w="80"/>
+            </w:tcMar>
+          </w:tcPr>
+          <w:p>
+            <w:r>
+              <w:rPr>
+                <w:b w:val="false"/>
+                <w:bCs w:val="false"/>
+                <w:sz w:val="16"/>
+                <w:szCs w:val="16"/>
+              </w:rPr>
+              <w:t xml:space="preserve">$0.88 → $1.63</w:t>
+            </w:r>
+          </w:p>
+        </w:tc>
+      </w:tr>
+      <w:tr>
+        <w:trPr>
+          <w:tblHeader w:val="off"/>
+        </w:trPr>
+        <w:tc>
+          <w:tcPr>
+            <w:tcW w:type="dxa" w:w="3629"/>
+            <w:tcBorders>
+              <w:top w:val="single" w:color="BFBFBF" w:sz="4"/>
+              <w:left w:val="single" w:color="BFBFBF" w:sz="4"/>
+              <w:bottom w:val="single" w:color="BFBFBF" w:sz="4"/>
+              <w:right w:val="single" w:color="BFBFBF" w:sz="4"/>
+            </w:tcBorders>
+            <w:tcMar>
+              <w:top w:type="dxa" w:w="40"/>
+              <w:left w:type="dxa" w:w="80"/>
+              <w:bottom w:type="dxa" w:w="40"/>
+              <w:right w:type="dxa" w:w="80"/>
+            </w:tcMar>
+          </w:tcPr>
+          <w:p>
+            <w:r>
+              <w:rPr>
+                <w:b w:val="false"/>
+                <w:bCs w:val="false"/>
+                <w:sz w:val="16"/>
+                <w:szCs w:val="16"/>
+              </w:rPr>
+              <w:t xml:space="preserve">D-S6-silk sheets king - [Silk|King] - Exact - Ran - DO - SAT</w:t>
+            </w:r>
+          </w:p>
+        </w:tc>
+        <w:tc>
+          <w:tcPr>
+            <w:tcW w:type="dxa" w:w="1814"/>
+            <w:tcBorders>
+              <w:top w:val="single" w:color="BFBFBF" w:sz="4"/>
+              <w:left w:val="single" w:color="BFBFBF" w:sz="4"/>
+              <w:bottom w:val="single" w:color="BFBFBF" w:sz="4"/>
+              <w:right w:val="single" w:color="BFBFBF" w:sz="4"/>
+            </w:tcBorders>
+            <w:tcMar>
+              <w:top w:type="dxa" w:w="40"/>
+              <w:left w:type="dxa" w:w="80"/>
+              <w:bottom w:type="dxa" w:w="40"/>
+              <w:right w:type="dxa" w:w="80"/>
+            </w:tcMar>
+          </w:tcPr>
+          <w:p>
+            <w:r>
+              <w:rPr>
+                <w:b w:val="false"/>
+                <w:bCs w:val="false"/>
+                <w:sz w:val="16"/>
+                <w:szCs w:val="16"/>
+              </w:rPr>
+              <w:t xml:space="preserve">silk sheets king</w:t>
+            </w:r>
+          </w:p>
+        </w:tc>
+        <w:tc>
+          <w:tcPr>
+            <w:tcW w:type="dxa" w:w="1146"/>
+            <w:tcBorders>
+              <w:top w:val="single" w:color="BFBFBF" w:sz="4"/>
+              <w:left w:val="single" w:color="BFBFBF" w:sz="4"/>
+              <w:bottom w:val="single" w:color="BFBFBF" w:sz="4"/>
+              <w:right w:val="single" w:color="BFBFBF" w:sz="4"/>
+            </w:tcBorders>
+            <w:tcMar>
+              <w:top w:type="dxa" w:w="40"/>
+              <w:left w:type="dxa" w:w="80"/>
+              <w:bottom w:type="dxa" w:w="40"/>
+              <w:right w:type="dxa" w:w="80"/>
+            </w:tcMar>
+          </w:tcPr>
+          <w:p>
+            <w:r>
+              <w:rPr>
+                <w:b w:val="false"/>
+                <w:bCs w:val="false"/>
+                <w:sz w:val="16"/>
+                <w:szCs w:val="16"/>
+              </w:rPr>
+              <w:t xml:space="preserve">$0.89</w:t>
+            </w:r>
+          </w:p>
+        </w:tc>
+        <w:tc>
+          <w:tcPr>
+            <w:tcW w:type="dxa" w:w="1432"/>
+            <w:tcBorders>
+              <w:top w:val="single" w:color="BFBFBF" w:sz="4"/>
+              <w:left w:val="single" w:color="BFBFBF" w:sz="4"/>
+              <w:bottom w:val="single" w:color="BFBFBF" w:sz="4"/>
+              <w:right w:val="single" w:color="BFBFBF" w:sz="4"/>
+            </w:tcBorders>
+            <w:tcMar>
+              <w:top w:type="dxa" w:w="40"/>
+              <w:left w:type="dxa" w:w="80"/>
+              <w:bottom w:type="dxa" w:w="40"/>
+              <w:right w:type="dxa" w:w="80"/>
+            </w:tcMar>
+          </w:tcPr>
+          <w:p>
+            <w:r>
+              <w:rPr>
+                <w:b w:val="false"/>
+                <w:bCs w:val="false"/>
+                <w:sz w:val="16"/>
+                <w:szCs w:val="16"/>
+              </w:rPr>
+              <w:t xml:space="preserve">75% → 156%</w:t>
+            </w:r>
+          </w:p>
+        </w:tc>
+        <w:tc>
+          <w:tcPr>
+            <w:tcW w:type="dxa" w:w="1339"/>
+            <w:tcBorders>
+              <w:top w:val="single" w:color="BFBFBF" w:sz="4"/>
+              <w:left w:val="single" w:color="BFBFBF" w:sz="4"/>
+              <w:bottom w:val="single" w:color="BFBFBF" w:sz="4"/>
+              <w:right w:val="single" w:color="BFBFBF" w:sz="4"/>
+            </w:tcBorders>
+            <w:tcMar>
+              <w:top w:type="dxa" w:w="40"/>
+              <w:left w:type="dxa" w:w="80"/>
+              <w:bottom w:type="dxa" w:w="40"/>
+              <w:right w:type="dxa" w:w="80"/>
+            </w:tcMar>
+          </w:tcPr>
+          <w:p>
+            <w:r>
+              <w:rPr>
+                <w:b w:val="false"/>
+                <w:bCs w:val="false"/>
+                <w:sz w:val="16"/>
+                <w:szCs w:val="16"/>
+              </w:rPr>
+              <w:t xml:space="preserve">$1.56 → $2.28</w:t>
+            </w:r>
+          </w:p>
+        </w:tc>
+      </w:tr>
+      <w:tr>
+        <w:trPr>
+          <w:tblHeader w:val="off"/>
+        </w:trPr>
+        <w:tc>
+          <w:tcPr>
+            <w:tcW w:type="dxa" w:w="3629"/>
+            <w:tcBorders>
+              <w:top w:val="single" w:color="BFBFBF" w:sz="4"/>
+              <w:left w:val="single" w:color="BFBFBF" w:sz="4"/>
+              <w:bottom w:val="single" w:color="BFBFBF" w:sz="4"/>
+              <w:right w:val="single" w:color="BFBFBF" w:sz="4"/>
+            </w:tcBorders>
+            <w:tcMar>
+              <w:top w:type="dxa" w:w="40"/>
+              <w:left w:type="dxa" w:w="80"/>
+              <w:bottom w:type="dxa" w:w="40"/>
+              <w:right w:type="dxa" w:w="80"/>
+            </w:tcMar>
+          </w:tcPr>
+          <w:p>
+            <w:r>
+              <w:rPr>
+                <w:b w:val="false"/>
+                <w:bCs w:val="false"/>
+                <w:sz w:val="16"/>
+                <w:szCs w:val="16"/>
+              </w:rPr>
+              <w:t xml:space="preserve">D-S6-silk sheets - [Silk] - Exact - Ran - DO - SATIN-KING-BL</w:t>
+            </w:r>
+          </w:p>
+        </w:tc>
+        <w:tc>
+          <w:tcPr>
+            <w:tcW w:type="dxa" w:w="1814"/>
+            <w:tcBorders>
+              <w:top w:val="single" w:color="BFBFBF" w:sz="4"/>
+              <w:left w:val="single" w:color="BFBFBF" w:sz="4"/>
+              <w:bottom w:val="single" w:color="BFBFBF" w:sz="4"/>
+              <w:right w:val="single" w:color="BFBFBF" w:sz="4"/>
+            </w:tcBorders>
+            <w:tcMar>
+              <w:top w:type="dxa" w:w="40"/>
+              <w:left w:type="dxa" w:w="80"/>
+              <w:bottom w:type="dxa" w:w="40"/>
+              <w:right w:type="dxa" w:w="80"/>
+            </w:tcMar>
+          </w:tcPr>
+          <w:p>
+            <w:r>
+              <w:rPr>
+                <w:b w:val="false"/>
+                <w:bCs w:val="false"/>
+                <w:sz w:val="16"/>
+                <w:szCs w:val="16"/>
+              </w:rPr>
+              <w:t xml:space="preserve">silk sheets</w:t>
+            </w:r>
+          </w:p>
+        </w:tc>
+        <w:tc>
+          <w:tcPr>
+            <w:tcW w:type="dxa" w:w="1146"/>
+            <w:tcBorders>
+              <w:top w:val="single" w:color="BFBFBF" w:sz="4"/>
+              <w:left w:val="single" w:color="BFBFBF" w:sz="4"/>
+              <w:bottom w:val="single" w:color="BFBFBF" w:sz="4"/>
+              <w:right w:val="single" w:color="BFBFBF" w:sz="4"/>
+            </w:tcBorders>
+            <w:tcMar>
+              <w:top w:type="dxa" w:w="40"/>
+              <w:left w:type="dxa" w:w="80"/>
+              <w:bottom w:type="dxa" w:w="40"/>
+              <w:right w:type="dxa" w:w="80"/>
+            </w:tcMar>
+          </w:tcPr>
+          <w:p>
+            <w:r>
+              <w:rPr>
+                <w:b w:val="false"/>
+                <w:bCs w:val="false"/>
+                <w:sz w:val="16"/>
+                <w:szCs w:val="16"/>
+              </w:rPr>
+              <w:t xml:space="preserve">$0.67</w:t>
+            </w:r>
+          </w:p>
+        </w:tc>
+        <w:tc>
+          <w:tcPr>
+            <w:tcW w:type="dxa" w:w="1432"/>
+            <w:tcBorders>
+              <w:top w:val="single" w:color="BFBFBF" w:sz="4"/>
+              <w:left w:val="single" w:color="BFBFBF" w:sz="4"/>
+              <w:bottom w:val="single" w:color="BFBFBF" w:sz="4"/>
+              <w:right w:val="single" w:color="BFBFBF" w:sz="4"/>
+            </w:tcBorders>
+            <w:tcMar>
+              <w:top w:type="dxa" w:w="40"/>
+              <w:left w:type="dxa" w:w="80"/>
+              <w:bottom w:type="dxa" w:w="40"/>
+              <w:right w:type="dxa" w:w="80"/>
+            </w:tcMar>
+          </w:tcPr>
+          <w:p>
+            <w:r>
+              <w:rPr>
+                <w:b w:val="false"/>
+                <w:bCs w:val="false"/>
+                <w:sz w:val="16"/>
+                <w:szCs w:val="16"/>
+              </w:rPr>
+              <w:t xml:space="preserve">75% → 151%</w:t>
+            </w:r>
+          </w:p>
+        </w:tc>
+        <w:tc>
+          <w:tcPr>
+            <w:tcW w:type="dxa" w:w="1339"/>
+            <w:tcBorders>
+              <w:top w:val="single" w:color="BFBFBF" w:sz="4"/>
+              <w:left w:val="single" w:color="BFBFBF" w:sz="4"/>
+              <w:bottom w:val="single" w:color="BFBFBF" w:sz="4"/>
+              <w:right w:val="single" w:color="BFBFBF" w:sz="4"/>
+            </w:tcBorders>
+            <w:tcMar>
+              <w:top w:type="dxa" w:w="40"/>
+              <w:left w:type="dxa" w:w="80"/>
+              <w:bottom w:type="dxa" w:w="40"/>
+              <w:right w:type="dxa" w:w="80"/>
+            </w:tcMar>
+          </w:tcPr>
+          <w:p>
+            <w:r>
+              <w:rPr>
+                <w:b w:val="false"/>
+                <w:bCs w:val="false"/>
+                <w:sz w:val="16"/>
+                <w:szCs w:val="16"/>
+              </w:rPr>
+              <w:t xml:space="preserve">$1.17 → $1.68</w:t>
+            </w:r>
+          </w:p>
+        </w:tc>
+      </w:tr>
+      <w:tr>
+        <w:trPr>
+          <w:tblHeader w:val="off"/>
+        </w:trPr>
+        <w:tc>
+          <w:tcPr>
+            <w:tcW w:type="dxa" w:w="3629"/>
+            <w:tcBorders>
+              <w:top w:val="single" w:color="BFBFBF" w:sz="4"/>
+              <w:left w:val="single" w:color="BFBFBF" w:sz="4"/>
+              <w:bottom w:val="single" w:color="BFBFBF" w:sz="4"/>
+              <w:right w:val="single" w:color="BFBFBF" w:sz="4"/>
+            </w:tcBorders>
+            <w:tcMar>
+              <w:top w:type="dxa" w:w="40"/>
+              <w:left w:type="dxa" w:w="80"/>
+              <w:bottom w:type="dxa" w:w="40"/>
+              <w:right w:type="dxa" w:w="80"/>
+            </w:tcMar>
+          </w:tcPr>
+          <w:p>
+            <w:r>
+              <w:rPr>
+                <w:b w:val="false"/>
+                <w:bCs w:val="false"/>
+                <w:sz w:val="16"/>
+                <w:szCs w:val="16"/>
+              </w:rPr>
+              <w:t xml:space="preserve">D-S6-SP-satin sheets queen-(Satin)-HSV-Exact-Rank-DO-SATIN-Q</w:t>
+            </w:r>
+          </w:p>
+        </w:tc>
+        <w:tc>
+          <w:tcPr>
+            <w:tcW w:type="dxa" w:w="1814"/>
+            <w:tcBorders>
+              <w:top w:val="single" w:color="BFBFBF" w:sz="4"/>
+              <w:left w:val="single" w:color="BFBFBF" w:sz="4"/>
+              <w:bottom w:val="single" w:color="BFBFBF" w:sz="4"/>
+              <w:right w:val="single" w:color="BFBFBF" w:sz="4"/>
+            </w:tcBorders>
+            <w:tcMar>
+              <w:top w:type="dxa" w:w="40"/>
+              <w:left w:type="dxa" w:w="80"/>
+              <w:bottom w:type="dxa" w:w="40"/>
+              <w:right w:type="dxa" w:w="80"/>
+            </w:tcMar>
+          </w:tcPr>
+          <w:p>
+            <w:r>
+              <w:rPr>
+                <w:b w:val="false"/>
+                <w:bCs w:val="false"/>
+                <w:sz w:val="16"/>
+                <w:szCs w:val="16"/>
+              </w:rPr>
+              <w:t xml:space="preserve">satin sheets queen</w:t>
+            </w:r>
+          </w:p>
+        </w:tc>
+        <w:tc>
+          <w:tcPr>
+            <w:tcW w:type="dxa" w:w="1146"/>
+            <w:tcBorders>
+              <w:top w:val="single" w:color="BFBFBF" w:sz="4"/>
+              <w:left w:val="single" w:color="BFBFBF" w:sz="4"/>
+              <w:bottom w:val="single" w:color="BFBFBF" w:sz="4"/>
+              <w:right w:val="single" w:color="BFBFBF" w:sz="4"/>
+            </w:tcBorders>
+            <w:tcMar>
+              <w:top w:type="dxa" w:w="40"/>
+              <w:left w:type="dxa" w:w="80"/>
+              <w:bottom w:type="dxa" w:w="40"/>
+              <w:right w:type="dxa" w:w="80"/>
+            </w:tcMar>
+          </w:tcPr>
+          <w:p>
+            <w:r>
+              <w:rPr>
+                <w:b w:val="false"/>
+                <w:bCs w:val="false"/>
+                <w:sz w:val="16"/>
+                <w:szCs w:val="16"/>
+              </w:rPr>
+              <w:t xml:space="preserve">$1.03</w:t>
+            </w:r>
+          </w:p>
+        </w:tc>
+        <w:tc>
+          <w:tcPr>
+            <w:tcW w:type="dxa" w:w="1432"/>
+            <w:tcBorders>
+              <w:top w:val="single" w:color="BFBFBF" w:sz="4"/>
+              <w:left w:val="single" w:color="BFBFBF" w:sz="4"/>
+              <w:bottom w:val="single" w:color="BFBFBF" w:sz="4"/>
+              <w:right w:val="single" w:color="BFBFBF" w:sz="4"/>
+            </w:tcBorders>
+            <w:tcMar>
+              <w:top w:type="dxa" w:w="40"/>
+              <w:left w:type="dxa" w:w="80"/>
+              <w:bottom w:type="dxa" w:w="40"/>
+              <w:right w:type="dxa" w:w="80"/>
+            </w:tcMar>
+          </w:tcPr>
+          <w:p>
+            <w:r>
+              <w:rPr>
+                <w:b w:val="false"/>
+                <w:bCs w:val="false"/>
+                <w:sz w:val="16"/>
+                <w:szCs w:val="16"/>
+              </w:rPr>
+              <w:t xml:space="preserve">44% → 92%</w:t>
+            </w:r>
+          </w:p>
+        </w:tc>
+        <w:tc>
+          <w:tcPr>
+            <w:tcW w:type="dxa" w:w="1339"/>
+            <w:tcBorders>
+              <w:top w:val="single" w:color="BFBFBF" w:sz="4"/>
+              <w:left w:val="single" w:color="BFBFBF" w:sz="4"/>
+              <w:bottom w:val="single" w:color="BFBFBF" w:sz="4"/>
+              <w:right w:val="single" w:color="BFBFBF" w:sz="4"/>
+            </w:tcBorders>
+            <w:tcMar>
+              <w:top w:type="dxa" w:w="40"/>
+              <w:left w:type="dxa" w:w="80"/>
+              <w:bottom w:type="dxa" w:w="40"/>
+              <w:right w:type="dxa" w:w="80"/>
+            </w:tcMar>
+          </w:tcPr>
+          <w:p>
+            <w:r>
+              <w:rPr>
+                <w:b w:val="false"/>
+                <w:bCs w:val="false"/>
+                <w:sz w:val="16"/>
+                <w:szCs w:val="16"/>
+              </w:rPr>
+              <w:t xml:space="preserve">$1.48 → $1.98</w:t>
+            </w:r>
+          </w:p>
+        </w:tc>
+      </w:tr>
+      <w:tr>
+        <w:trPr>
+          <w:tblHeader w:val="off"/>
+        </w:trPr>
+        <w:tc>
+          <w:tcPr>
+            <w:tcW w:type="dxa" w:w="3629"/>
+            <w:tcBorders>
+              <w:top w:val="single" w:color="BFBFBF" w:sz="4"/>
+              <w:left w:val="single" w:color="BFBFBF" w:sz="4"/>
+              <w:bottom w:val="single" w:color="BFBFBF" w:sz="4"/>
+              <w:right w:val="single" w:color="BFBFBF" w:sz="4"/>
+            </w:tcBorders>
+            <w:tcMar>
+              <w:top w:type="dxa" w:w="40"/>
+              <w:left w:type="dxa" w:w="80"/>
+              <w:bottom w:type="dxa" w:w="40"/>
+              <w:right w:type="dxa" w:w="80"/>
+            </w:tcMar>
+          </w:tcPr>
+          <w:p>
+            <w:r>
+              <w:rPr>
+                <w:b w:val="false"/>
+                <w:bCs w:val="false"/>
+                <w:sz w:val="16"/>
+                <w:szCs w:val="16"/>
+              </w:rPr>
+              <w:t xml:space="preserve">D-S6-SP-satin sheets king-(Satin)-HSV-Exact-Rank-DO-SATIN-KI</w:t>
+            </w:r>
+          </w:p>
+        </w:tc>
+        <w:tc>
+          <w:tcPr>
+            <w:tcW w:type="dxa" w:w="1814"/>
+            <w:tcBorders>
+              <w:top w:val="single" w:color="BFBFBF" w:sz="4"/>
+              <w:left w:val="single" w:color="BFBFBF" w:sz="4"/>
+              <w:bottom w:val="single" w:color="BFBFBF" w:sz="4"/>
+              <w:right w:val="single" w:color="BFBFBF" w:sz="4"/>
+            </w:tcBorders>
+            <w:tcMar>
+              <w:top w:type="dxa" w:w="40"/>
+              <w:left w:type="dxa" w:w="80"/>
+              <w:bottom w:type="dxa" w:w="40"/>
+              <w:right w:type="dxa" w:w="80"/>
+            </w:tcMar>
+          </w:tcPr>
+          <w:p>
+            <w:r>
+              <w:rPr>
+                <w:b w:val="false"/>
+                <w:bCs w:val="false"/>
+                <w:sz w:val="16"/>
+                <w:szCs w:val="16"/>
+              </w:rPr>
+              <w:t xml:space="preserve">satin sheets king</w:t>
+            </w:r>
+          </w:p>
+        </w:tc>
+        <w:tc>
+          <w:tcPr>
+            <w:tcW w:type="dxa" w:w="1146"/>
+            <w:tcBorders>
+              <w:top w:val="single" w:color="BFBFBF" w:sz="4"/>
+              <w:left w:val="single" w:color="BFBFBF" w:sz="4"/>
+              <w:bottom w:val="single" w:color="BFBFBF" w:sz="4"/>
+              <w:right w:val="single" w:color="BFBFBF" w:sz="4"/>
+            </w:tcBorders>
+            <w:tcMar>
+              <w:top w:type="dxa" w:w="40"/>
+              <w:left w:type="dxa" w:w="80"/>
+              <w:bottom w:type="dxa" w:w="40"/>
+              <w:right w:type="dxa" w:w="80"/>
+            </w:tcMar>
+          </w:tcPr>
+          <w:p>
+            <w:r>
+              <w:rPr>
+                <w:b w:val="false"/>
+                <w:bCs w:val="false"/>
+                <w:sz w:val="16"/>
+                <w:szCs w:val="16"/>
+              </w:rPr>
+              <w:t xml:space="preserve">$1.25</w:t>
+            </w:r>
+          </w:p>
+        </w:tc>
+        <w:tc>
+          <w:tcPr>
+            <w:tcW w:type="dxa" w:w="1432"/>
+            <w:tcBorders>
+              <w:top w:val="single" w:color="BFBFBF" w:sz="4"/>
+              <w:left w:val="single" w:color="BFBFBF" w:sz="4"/>
+              <w:bottom w:val="single" w:color="BFBFBF" w:sz="4"/>
+              <w:right w:val="single" w:color="BFBFBF" w:sz="4"/>
+            </w:tcBorders>
+            <w:tcMar>
+              <w:top w:type="dxa" w:w="40"/>
+              <w:left w:type="dxa" w:w="80"/>
+              <w:bottom w:type="dxa" w:w="40"/>
+              <w:right w:type="dxa" w:w="80"/>
+            </w:tcMar>
+          </w:tcPr>
+          <w:p>
+            <w:r>
+              <w:rPr>
+                <w:b w:val="false"/>
+                <w:bCs w:val="false"/>
+                <w:sz w:val="16"/>
+                <w:szCs w:val="16"/>
+              </w:rPr>
+              <w:t xml:space="preserve">54% → 124%</w:t>
+            </w:r>
+          </w:p>
+        </w:tc>
+        <w:tc>
+          <w:tcPr>
+            <w:tcW w:type="dxa" w:w="1339"/>
+            <w:tcBorders>
+              <w:top w:val="single" w:color="BFBFBF" w:sz="4"/>
+              <w:left w:val="single" w:color="BFBFBF" w:sz="4"/>
+              <w:bottom w:val="single" w:color="BFBFBF" w:sz="4"/>
+              <w:right w:val="single" w:color="BFBFBF" w:sz="4"/>
+            </w:tcBorders>
+            <w:tcMar>
+              <w:top w:type="dxa" w:w="40"/>
+              <w:left w:type="dxa" w:w="80"/>
+              <w:bottom w:type="dxa" w:w="40"/>
+              <w:right w:type="dxa" w:w="80"/>
+            </w:tcMar>
+          </w:tcPr>
+          <w:p>
+            <w:r>
+              <w:rPr>
+                <w:b w:val="false"/>
+                <w:bCs w:val="false"/>
+                <w:sz w:val="16"/>
+                <w:szCs w:val="16"/>
+              </w:rPr>
+              <w:t xml:space="preserve">$1.93 → $2.8</w:t>
+            </w:r>
+          </w:p>
+        </w:tc>
+      </w:tr>
+    </w:tbl>
+    <w:p>
+      <w:pPr>
         <w:spacing w:after="120"/>
       </w:pPr>
-      <w:r>
-        <w:t xml:space="preserve">35 ranking exact campaigns go top-of-search only now (step 3). Other exact campaigns change only where their own data supports it: 14 have at least 20 top-of-search clicks in 90 days and go top-of-search only after 7 Oct (step 7). The other 173 enabled exact campaigns have too little placement data (many had no clicks in 30 days) and are left as they are; revisit after 7 Oct. Second-order effect: those non-ranking exact campaigns lose their rest-of-search and product-page clicks; the plan counts only their top-of-search clicks at top-of-search conversion.</w:t>
-      </w:r>
     </w:p>
     <w:p>
       <w:pPr>
@@ -21718,7 +22838,7 @@
                 <w:sz w:val="16"/>
                 <w:szCs w:val="16"/>
               </w:rPr>
-              <w:t xml:space="preserve">1,195</w:t>
+              <w:t xml:space="preserve">1,198</w:t>
             </w:r>
           </w:p>
         </w:tc>
@@ -22421,7 +23541,7 @@
         <w:spacing w:after="120"/>
       </w:pPr>
       <w:r>
-        <w:t xml:space="preserve">Stock counted = sellable + FC transfer + inbound already shipped (Sellerboard, 29 Sep), projected with last year's monthly lift. Queen Black has 300 units in a shipment plan that was never shipped: ship it now; the reorder after that plan is about 895 units. Deal days (30 Sep, 7, 12 and 24 Oct) are counted at ×1.33 of a normal day, the lift the July deal gave. Any recovery from the listing changes would bring the stock-out earlier; re-check weekly. An LTSF SKU running out under the plan is the goal (its aged stock is sold), not a reorder signal.</w:t>
+        <w:t xml:space="preserve">Stock counted = sellable + FC transfer + inbound already shipped (Sellerboard, 29 Sep), projected with last year's monthly lift. Queen Black has 300 units in a shipment plan that was never shipped: ship it now; the reorder after that plan is about 898 units. Deal days (30 Sep, 7 Oct, 12 Oct, 24 Oct, 30 Oct) are counted at ×1.33 of a normal day, the lift the July deal gave. Any recovery from the listing changes would bring the stock-out earlier; re-check weekly. An LTSF SKU running out under the plan is the goal (its aged stock is sold), not a reorder signal.</w:t>
       </w:r>
     </w:p>
     <w:p>
@@ -22867,7 +23987,7 @@
                 <w:sz w:val="16"/>
                 <w:szCs w:val="16"/>
               </w:rPr>
-              <w:t xml:space="preserve">$24,664</w:t>
+              <w:t xml:space="preserve">$24,875</w:t>
             </w:r>
           </w:p>
         </w:tc>
@@ -22895,7 +24015,7 @@
                 <w:sz w:val="16"/>
                 <w:szCs w:val="16"/>
               </w:rPr>
-              <w:t xml:space="preserve">$4,820</w:t>
+              <w:t xml:space="preserve">$4,968</w:t>
             </w:r>
           </w:p>
         </w:tc>
@@ -22923,7 +24043,7 @@
                 <w:sz w:val="16"/>
                 <w:szCs w:val="16"/>
               </w:rPr>
-              <w:t xml:space="preserve">19.5%</w:t>
+              <w:t xml:space="preserve">20.0%</w:t>
             </w:r>
           </w:p>
         </w:tc>
@@ -22951,7 +24071,7 @@
                 <w:sz w:val="16"/>
                 <w:szCs w:val="16"/>
               </w:rPr>
-              <w:t xml:space="preserve">−$2,225</w:t>
+              <w:t xml:space="preserve">−$2,333</w:t>
             </w:r>
           </w:p>
         </w:tc>
@@ -22979,7 +24099,7 @@
                 <w:sz w:val="16"/>
                 <w:szCs w:val="16"/>
               </w:rPr>
-              <w:t xml:space="preserve">-9.0%</w:t>
+              <w:t xml:space="preserve">-9.4%</w:t>
             </w:r>
           </w:p>
         </w:tc>
@@ -23040,7 +24160,7 @@
                 <w:sz w:val="16"/>
                 <w:szCs w:val="16"/>
               </w:rPr>
-              <w:t xml:space="preserve">−$519</w:t>
+              <w:t xml:space="preserve">−$308</w:t>
             </w:r>
           </w:p>
         </w:tc>
@@ -23068,7 +24188,7 @@
                 <w:sz w:val="16"/>
                 <w:szCs w:val="16"/>
               </w:rPr>
-              <w:t xml:space="preserve">−$259</w:t>
+              <w:t xml:space="preserve">−$111</w:t>
             </w:r>
           </w:p>
         </w:tc>
@@ -23124,7 +24244,7 @@
                 <w:sz w:val="16"/>
                 <w:szCs w:val="16"/>
               </w:rPr>
-              <w:t xml:space="preserve">$171</w:t>
+              <w:t xml:space="preserve">$63</w:t>
             </w:r>
           </w:p>
         </w:tc>
@@ -23860,7 +24980,7 @@
         <w:spacing w:after="120"/>
       </w:pPr>
       <w:r>
-        <w:t xml:space="preserve">Direct ad effects only (30-day equivalent). Organic sales gained from better rank are not counted — they are the return the push is buying. August for comparison: 1,653 units, ads $10,603, net −$5,420. Break-even ACoS is per child from Sellerboard (profit before ads ÷ sales, 30 days, with realised prices, refunds, storage and inbound fees); it is lower than the audit's 23.6% (see Conflicts).</w:t>
+        <w:t xml:space="preserve">Direct ad effects only (30-day equivalent). Organic sales gained from better rank are not counted — they are the return the push is buying. August for comparison: 1,653 units, ads $10,603, net −$5,420. Break-even ACoS is per child from Sellerboard (profit before ads ÷ sales, 30 days, with realised prices, refunds, storage and inbound fees); it is lower than the audit's 23.4% (see Conflicts).</w:t>
       </w:r>
     </w:p>
     <w:p>
@@ -23868,7 +24988,7 @@
         <w:spacing w:after="120"/>
       </w:pPr>
       <w:r>
-        <w:t xml:space="preserve">Payback: the push costs $1,539 a month in direct profit. At $2.90 profit before ads per unit (last 30 days) it needs about 530 more organic units a month to pay back (+94% on today's 566 organic units). The cost is a floor: 9 of the 15 pushed terms get a top-of-search price rise of 5% or less (satin sheets, black satin sheets, silk bed sheets queen, queen satin sheet set, black satin sheets queen, queen silk sheets, satin bed sheets queen, king size satin sheets, silk queen sheets), while their click targets rise several-fold. If clicks stay short, the weekly +10% price step raises the cost. Read the push as a bet on Q4 rank, and size it with that in mind.</w:t>
+        <w:t xml:space="preserve">Payback: the push costs $1,539 a month in direct profit. At $2.90 profit before ads per unit (last 30 days) it needs about 530 more organic units a month to pay back (+94% on today's 566 organic units). The cost is a floor: 0 of the 15 pushed terms get a top-of-search price rise of 5% or less (), while their click targets rise several-fold. If clicks stay short, the weekly +10% price step raises the cost. Read the push as a bet on Q4 rank, and size it with that in mind.</w:t>
       </w:r>
     </w:p>
     <w:p>
@@ -23903,7 +25023,7 @@
         <w:spacing w:after="80"/>
       </w:pPr>
       <w:r>
-        <w:t xml:space="preserve">2. Stock: ship the 300-unit Queen Black plan now and reorder about 895 more Queen Black units to reach 31 Jan at the plan's pace (Stock &amp; reorder tab).</w:t>
+        <w:t xml:space="preserve">2. Stock: ship the 300-unit Queen Black plan now and reorder about 898 more Queen Black units to reach 31 Jan at the plan's pace (Stock &amp; reorder tab).</w:t>
       </w:r>
     </w:p>
     <w:p>
@@ -23916,7 +25036,7 @@
         <w:spacing w:after="80"/>
       </w:pPr>
       <w:r>
-        <w:t xml:space="preserve">3. Ranking campaigns (Action list, step 3): move the product ad to the preferred Black child where needed; TOS 900% / ROS 0% / PP 0%, the base bid and budget shown; load the back-up child's ad PAUSED. Bidding stays "Dynamic bids – down only" (LEGACY_FOR_SALES is the same setting).</w:t>
+        <w:t xml:space="preserve">3. Ranking campaigns (Action list, step 3): move the product ad to the preferred Black child where needed; on pushed campaigns raise the top-of-search modifier as shown (base bids stay as they are); set the budgets shown; load the back-up child's ad PAUSED. Held campaigns: no bid change. Bidding stays "Dynamic bids – down only" (LEGACY_FOR_SALES is the same setting).</w:t>
       </w:r>
     </w:p>
     <w:p>
@@ -23968,19 +25088,6 @@
         <w:spacing w:after="80"/>
       </w:pPr>
       <w:r>
-        <w:t xml:space="preserve">7. After 7 Oct (step 7): top-of-search only on the non-ranking exact campaigns with at least 20 top-of-search clicks in 90 days.</w:t>
-      </w:r>
-    </w:p>
-    <w:p>
-      <w:pPr>
-        <w:pStyle w:val="ListParagraph"/>
-        <w:numPr>
-          <w:ilvl w:val="0"/>
-          <w:numId w:val="2"/>
-        </w:numPr>
-        <w:spacing w:after="80"/>
-      </w:pPr>
-      <w:r>
         <w:t xml:space="preserve">Daily for two weeks: ranking clicks against target, top-of-search share, rank on each push term, days of cover on every preferred child (under 14 → switch to the back-up). Re-test the trial terms after 14 days.</w:t>
       </w:r>
     </w:p>
@@ -23994,7 +25101,7 @@
         <w:spacing w:after="80"/>
       </w:pPr>
       <w:r>
-        <w:t xml:space="preserve">This week (Lightning Deal 30 Sep, Prime Big Deal Days 7 Oct): steps 1–3 only. Everything in steps 3–7 is in the action plan (DSS6_Action_Plan): the Action list, the Keyword changes tab, and the Bulk upload tab (rows with every ID they need; the rest are in "Needs console IDs").</w:t>
+        <w:t xml:space="preserve">This week (Lightning Deal 30 Sep, Prime Big Deal Days 7 Oct): steps 1–3 only. Everything in steps 3–6 is in the action plan (DSS6_Action_Plan): the Action list, the Keyword changes tab, and the Bulk upload tab (rows with every ID they need; the rest are in "Needs console IDs").</w:t>
       </w:r>
     </w:p>
     <w:p>
@@ -24864,7 +25971,7 @@
                 <w:sz w:val="16"/>
                 <w:szCs w:val="16"/>
               </w:rPr>
-              <w:t xml:space="preserve">Audit engine 23.6% (contribution $7.53/unit, 'profitability' source) vs Sellerboard 30 d: profit before ads $1,913 on $21,091 sales = 9.1% (refunds 9.7% of sales)</w:t>
+              <w:t xml:space="preserve">Audit engine 23.4% (contribution $7.49/unit, 'profitability' source) vs Sellerboard 30 d: profit before ads $1,913 on $21,091 sales = 9.1% (refunds 9.7% of sales)</w:t>
             </w:r>
           </w:p>
         </w:tc>

</xml_diff>